<commit_message>
Correct manuscript: real Table 1 demographics, accurate country attributions, SHAP overlap 55%, complete adenoma LODO numbers
</commit_message>
<xml_diff>
--- a/manuscript/CRC_Manuscript_Complete.docx
+++ b/manuscript/CRC_Manuscript_Complete.docx
@@ -411,7 +411,7 @@
           <w:sz w:val="22"/>
           <w:szCs w:val="22"/>
         </w:rPr>
-        <w:t xml:space="preserve">All metagenomic data were obtained from curatedMetagenomicData (Bioconductor package; version recorded in the repository's session_info.txt and provenance directory). We retained the seven publicly available stool CRC case-control cohorts used by Thomas et al. (2019): FengQ_2015 (China), ThomasAM_2018a (Italy), ThomasAM_2018b (Italy), ThomasAM_2019_c (Italy), VogtmannE_2016 (USA), YuJ_2015 (China), and ZellerG_2014 (France/Germany), spanning six countries (the two ThomasAM_2018 cohorts are from the same country) across three continents. Subjects in study_condition categories of CRC, adenoma, or control were retained. After deduplication on subject ID, the cohort comprised 762 unique subjects. Cross-cohort overlap was audited (audit_subject_ids.R): no subject appears in more than one cohort and no subject has multiple samples.</w:t>
+        <w:t xml:space="preserve">All metagenomic data were obtained from curatedMetagenomicData (Bioconductor package; version recorded in the repository's session_info.txt and provenance directory). We retained the seven publicly available stool CRC case-control cohorts used by Thomas et al. (2019): FengQ_2015 (Austria), ThomasAM_2018a (Italy), ThomasAM_2018b (Italy), ThomasAM_2019_c (Japan), VogtmannE_2016 (USA), YuJ_2015 (China), and ZellerG_2014 (France), spanning six countries across three continents. Subjects in study_condition categories of CRC, adenoma, or control were retained. After deduplication on subject ID, the cohort comprised 762 unique subjects. Cross-cohort overlap was audited (audit_subject_ids.R): no subject appears in more than one cohort and no subject has multiple samples.</w:t>
       </w:r>
     </w:p>
     <w:p>
@@ -722,7 +722,7 @@
           <w:sz w:val="22"/>
           <w:szCs w:val="22"/>
         </w:rPr>
-        <w:t xml:space="preserve">We assessed pathway filter threshold sensitivity by running the joint Random Forest LODO pipeline at all 20 cells of a 4-by-5 grid of prevalence thresholds (0.05, 0.10, 0.15, 0.20) crossed with mean-abundance thresholds (1e-7, 1e-6, 1e-5, 1e-4, 1e-3). Mean per-cohort AUC ranged from 0.777 to 0.811 across the grid (spread 0.034). The high-AUC corner cells correspond to the most aggressive filtering (mean &gt;= 1e-3 retains only 2 pathways, so the joint model collapses to species-only) and confirm that the species-only configuration is the upper envelope of the joint model under any reasonable filter choice. Full grid is reported in Supplementary Table S1.</w:t>
+        <w:t xml:space="preserve">We assessed pathway filter threshold sensitivity by running the joint Random Forest LODO pipeline at all 20 cells of a 4-by-5 grid of prevalence thresholds (0.05, 0.10, 0.15, 0.20) crossed with mean-abundance thresholds (1e-7, 1e-6, 1e-5, 1e-4, 1e-3). Mean per-cohort AUC ranged from 0.777 to 0.811 across the grid (spread 0.034). Excluding the degenerate mean &gt;= 1e-3 column, which retains only two pathways and effectively reduces the joint model to species-only, the spread tightens to 0.013 across the 16 substantively non-degenerate cells. The species-only configuration is therefore the upper envelope of the joint model under any reasonable pathway filter choice. Full grid is reported in Supplementary Table S1.</w:t>
       </w:r>
     </w:p>
     <w:p>
@@ -763,7 +763,7 @@
           <w:sz w:val="22"/>
           <w:szCs w:val="22"/>
         </w:rPr>
-        <w:t xml:space="preserve">TreeSHAP analysis on the species RF model identified the top contributing taxa (by mean absolute SHAP value across the 646 samples) as Parvimonas micra, Peptostreptococcus stomatis, Gemella morbillorum, and Fusobacterium nucleatum (Figure 3). All four species are well-established oral-cavity-associated organisms repeatedly implicated in colorectal carcinogenesis in independent literature. The top-20 species ranked by SHAP show 70% concordance between the species RF and joint XGB models, indicating that the joint model is not learning fundamentally different biology, only adding pathway noise on top of essentially the same taxonomic signal.</w:t>
+        <w:t xml:space="preserve">TreeSHAP analysis on the species RF model identified the top contributing taxa (by mean absolute SHAP value across the 646 samples) as Parvimonas micra, Peptostreptococcus stomatis, Gemella morbillorum, and Fusobacterium nucleatum (Figure 3). All four species are well-established oral-cavity-associated organisms repeatedly implicated in colorectal carcinogenesis in independent literature. The same four species occupy the top four positions in the joint XGBoost model SHAP ranking (in different order), and the top-20 species rankings show 55% concordance (11 of 20) between the two models. The joint model is not learning fundamentally different biology, only re-ranking essentially the same taxonomic signal with pathway features adding noise rather than complementary information.</w:t>
       </w:r>
     </w:p>
     <w:p>
@@ -791,7 +791,7 @@
           <w:sz w:val="22"/>
           <w:szCs w:val="22"/>
         </w:rPr>
-        <w:t xml:space="preserve">Within-cohort 5-fold cross-validation on the 116 adenoma samples yielded modest performance: healthy versus adenoma RF AUC = 0.681, XGB = 0.709; adenoma versus CRC RF = 0.787, XGB = 0.809 (results/adenoma_results.csv). Under leave-one-dataset-out cross-validation the within-cohort signal collapses entirely: mean LODO AUC = 0.515 across the cohorts with sufficient adenoma samples, with per-cohort AUCs near or below chance (ThomasAM_2018a 0.562, ZellerG_2014 0.456). We treat adenoma classification as exploratory and statistically underpowered given the n = 116 sample budget across heterogeneous cohorts; the LODO collapse provides direct quantitative evidence that the within-cohort adenoma signal does not generalize across studies in this dataset.</w:t>
+        <w:t xml:space="preserve">Within-cohort 5-fold cross-validation on the 116 adenoma samples yielded modest performance: healthy versus adenoma RF AUC = 0.681, XGB = 0.709; adenoma versus CRC RF = 0.787, XGB = 0.809 (results/adenoma_results.csv). Under leave-one-dataset-out cross-validation the within-cohort signal collapses. The healthy-versus-adenoma LODO comparison is not directly computable in our dataset because adenoma and matched control samples are concentrated in different cohort splits, leaving single-class test sets; this itself is informative about cross-cohort heterogeneity. The adenoma-versus-CRC LODO comparison runs across three cohorts (FengQ_2015, ThomasAM_2018a, ZellerG_2014; n = 244) and yields mean AUC 0.583 for Random Forest (per-cohort 0.602, 0.631, 0.517) and 0.515 for XGBoost (0.527, 0.562, 0.456), with ZellerG_2014 below chance under XGBoost. We treat adenoma classification as exploratory and statistically underpowered given the n = 116 adenoma sample budget across heterogeneous cohorts; the LODO collapse provides direct quantitative evidence that the within-cohort adenoma signal does not generalize across studies in this dataset.</w:t>
       </w:r>
     </w:p>
     <w:p>
@@ -1183,14 +1183,15 @@
         </w:tblBorders>
       </w:tblPr>
       <w:tblGrid>
-        <w:gridCol w:w="1700"/>
+        <w:gridCol w:w="1500"/>
+        <w:gridCol w:w="760"/>
+        <w:gridCol w:w="760"/>
         <w:gridCol w:w="900"/>
         <w:gridCol w:w="900"/>
-        <w:gridCol w:w="1100"/>
-        <w:gridCol w:w="1100"/>
-        <w:gridCol w:w="1100"/>
-        <w:gridCol w:w="1100"/>
-        <w:gridCol w:w="1460"/>
+        <w:gridCol w:w="1000"/>
+        <w:gridCol w:w="980"/>
+        <w:gridCol w:w="1180"/>
+        <w:gridCol w:w="1380"/>
       </w:tblGrid>
       <w:tr>
         <w:trPr>
@@ -1198,7 +1199,7 @@
         </w:trPr>
         <w:tc>
           <w:tcPr>
-            <w:tcW w:type="dxa" w:w="1700"/>
+            <w:tcW w:type="dxa" w:w="1500"/>
             <w:tcBorders>
               <w:top w:val="single" w:color="888888" w:sz="4"/>
               <w:left w:val="single" w:color="888888" w:sz="4"/>
@@ -1230,7 +1231,7 @@
         </w:tc>
         <w:tc>
           <w:tcPr>
-            <w:tcW w:type="dxa" w:w="900"/>
+            <w:tcW w:type="dxa" w:w="760"/>
             <w:tcBorders>
               <w:top w:val="single" w:color="888888" w:sz="4"/>
               <w:left w:val="single" w:color="888888" w:sz="4"/>
@@ -1262,7 +1263,7 @@
         </w:tc>
         <w:tc>
           <w:tcPr>
-            <w:tcW w:type="dxa" w:w="900"/>
+            <w:tcW w:type="dxa" w:w="760"/>
             <w:tcBorders>
               <w:top w:val="single" w:color="888888" w:sz="4"/>
               <w:left w:val="single" w:color="888888" w:sz="4"/>
@@ -1294,7 +1295,7 @@
         </w:tc>
         <w:tc>
           <w:tcPr>
-            <w:tcW w:type="dxa" w:w="1100"/>
+            <w:tcW w:type="dxa" w:w="900"/>
             <w:tcBorders>
               <w:top w:val="single" w:color="888888" w:sz="4"/>
               <w:left w:val="single" w:color="888888" w:sz="4"/>
@@ -1326,7 +1327,7 @@
         </w:tc>
         <w:tc>
           <w:tcPr>
-            <w:tcW w:type="dxa" w:w="1100"/>
+            <w:tcW w:type="dxa" w:w="900"/>
             <w:tcBorders>
               <w:top w:val="single" w:color="888888" w:sz="4"/>
               <w:left w:val="single" w:color="888888" w:sz="4"/>
@@ -1358,7 +1359,7 @@
         </w:tc>
         <w:tc>
           <w:tcPr>
-            <w:tcW w:type="dxa" w:w="1100"/>
+            <w:tcW w:type="dxa" w:w="1000"/>
             <w:tcBorders>
               <w:top w:val="single" w:color="888888" w:sz="4"/>
               <w:left w:val="single" w:color="888888" w:sz="4"/>
@@ -1390,7 +1391,7 @@
         </w:tc>
         <w:tc>
           <w:tcPr>
-            <w:tcW w:type="dxa" w:w="1100"/>
+            <w:tcW w:type="dxa" w:w="980"/>
             <w:tcBorders>
               <w:top w:val="single" w:color="888888" w:sz="4"/>
               <w:left w:val="single" w:color="888888" w:sz="4"/>
@@ -1422,7 +1423,7 @@
         </w:tc>
         <w:tc>
           <w:tcPr>
-            <w:tcW w:type="dxa" w:w="1460"/>
+            <w:tcW w:type="dxa" w:w="1180"/>
             <w:tcBorders>
               <w:top w:val="single" w:color="888888" w:sz="4"/>
               <w:left w:val="single" w:color="888888" w:sz="4"/>
@@ -1448,7 +1449,39 @@
                 <w:sz w:val="20"/>
                 <w:szCs w:val="20"/>
               </w:rPr>
-              <w:t xml:space="preserve">Age, mean (SD)</w:t>
+              <w:t xml:space="preserve">Age (mean ± SD)</w:t>
+            </w:r>
+          </w:p>
+        </w:tc>
+        <w:tc>
+          <w:tcPr>
+            <w:tcW w:type="dxa" w:w="1380"/>
+            <w:tcBorders>
+              <w:top w:val="single" w:color="888888" w:sz="4"/>
+              <w:left w:val="single" w:color="888888" w:sz="4"/>
+              <w:bottom w:val="single" w:color="888888" w:sz="4"/>
+              <w:right w:val="single" w:color="888888" w:sz="4"/>
+            </w:tcBorders>
+            <w:shd w:fill="D5E8F0" w:val="clear"/>
+            <w:tcMar>
+              <w:top w:type="dxa" w:w="80"/>
+              <w:left w:type="dxa" w:w="120"/>
+              <w:bottom w:type="dxa" w:w="80"/>
+              <w:right w:type="dxa" w:w="120"/>
+            </w:tcMar>
+          </w:tcPr>
+          <w:p>
+            <w:pPr>
+              <w:jc w:val="center"/>
+            </w:pPr>
+            <w:r>
+              <w:rPr>
+                <w:b/>
+                <w:bCs/>
+                <w:sz w:val="20"/>
+                <w:szCs w:val="20"/>
+              </w:rPr>
+              <w:t xml:space="preserve">BMI (mean ± SD)</w:t>
             </w:r>
           </w:p>
         </w:tc>
@@ -1456,7 +1489,7 @@
       <w:tr>
         <w:tc>
           <w:tcPr>
-            <w:tcW w:type="dxa" w:w="1700"/>
+            <w:tcW w:type="dxa" w:w="1500"/>
             <w:tcBorders>
               <w:top w:val="single" w:color="888888" w:sz="4"/>
               <w:left w:val="single" w:color="888888" w:sz="4"/>
@@ -1487,6 +1520,68 @@
         </w:tc>
         <w:tc>
           <w:tcPr>
+            <w:tcW w:type="dxa" w:w="760"/>
+            <w:tcBorders>
+              <w:top w:val="single" w:color="888888" w:sz="4"/>
+              <w:left w:val="single" w:color="888888" w:sz="4"/>
+              <w:bottom w:val="single" w:color="888888" w:sz="4"/>
+              <w:right w:val="single" w:color="888888" w:sz="4"/>
+            </w:tcBorders>
+            <w:tcMar>
+              <w:top w:type="dxa" w:w="80"/>
+              <w:left w:type="dxa" w:w="120"/>
+              <w:bottom w:type="dxa" w:w="80"/>
+              <w:right w:type="dxa" w:w="120"/>
+            </w:tcMar>
+          </w:tcPr>
+          <w:p>
+            <w:pPr>
+              <w:jc w:val="center"/>
+            </w:pPr>
+            <w:r>
+              <w:rPr>
+                <w:b w:val="false"/>
+                <w:bCs w:val="false"/>
+                <w:sz w:val="20"/>
+                <w:szCs w:val="20"/>
+              </w:rPr>
+              <w:t xml:space="preserve">AUT</w:t>
+            </w:r>
+          </w:p>
+        </w:tc>
+        <w:tc>
+          <w:tcPr>
+            <w:tcW w:type="dxa" w:w="760"/>
+            <w:tcBorders>
+              <w:top w:val="single" w:color="888888" w:sz="4"/>
+              <w:left w:val="single" w:color="888888" w:sz="4"/>
+              <w:bottom w:val="single" w:color="888888" w:sz="4"/>
+              <w:right w:val="single" w:color="888888" w:sz="4"/>
+            </w:tcBorders>
+            <w:tcMar>
+              <w:top w:type="dxa" w:w="80"/>
+              <w:left w:type="dxa" w:w="120"/>
+              <w:bottom w:type="dxa" w:w="80"/>
+              <w:right w:type="dxa" w:w="120"/>
+            </w:tcMar>
+          </w:tcPr>
+          <w:p>
+            <w:pPr>
+              <w:jc w:val="center"/>
+            </w:pPr>
+            <w:r>
+              <w:rPr>
+                <w:b w:val="false"/>
+                <w:bCs w:val="false"/>
+                <w:sz w:val="20"/>
+                <w:szCs w:val="20"/>
+              </w:rPr>
+              <w:t xml:space="preserve">154</w:t>
+            </w:r>
+          </w:p>
+        </w:tc>
+        <w:tc>
+          <w:tcPr>
             <w:tcW w:type="dxa" w:w="900"/>
             <w:tcBorders>
               <w:top w:val="single" w:color="888888" w:sz="4"/>
@@ -1512,7 +1607,7 @@
                 <w:sz w:val="20"/>
                 <w:szCs w:val="20"/>
               </w:rPr>
-              <w:t xml:space="preserve">China</w:t>
+              <w:t xml:space="preserve">46</w:t>
             </w:r>
           </w:p>
         </w:tc>
@@ -1543,44 +1638,13 @@
                 <w:sz w:val="20"/>
                 <w:szCs w:val="20"/>
               </w:rPr>
-              <w:t xml:space="preserve">107</w:t>
-            </w:r>
-          </w:p>
-        </w:tc>
-        <w:tc>
-          <w:tcPr>
-            <w:tcW w:type="dxa" w:w="1100"/>
-            <w:tcBorders>
-              <w:top w:val="single" w:color="888888" w:sz="4"/>
-              <w:left w:val="single" w:color="888888" w:sz="4"/>
-              <w:bottom w:val="single" w:color="888888" w:sz="4"/>
-              <w:right w:val="single" w:color="888888" w:sz="4"/>
-            </w:tcBorders>
-            <w:tcMar>
-              <w:top w:type="dxa" w:w="80"/>
-              <w:left w:type="dxa" w:w="120"/>
-              <w:bottom w:type="dxa" w:w="80"/>
-              <w:right w:type="dxa" w:w="120"/>
-            </w:tcMar>
-          </w:tcPr>
-          <w:p>
-            <w:pPr>
-              <w:jc w:val="center"/>
-            </w:pPr>
-            <w:r>
-              <w:rPr>
-                <w:b w:val="false"/>
-                <w:bCs w:val="false"/>
-                <w:sz w:val="20"/>
-                <w:szCs w:val="20"/>
-              </w:rPr>
-              <w:t xml:space="preserve">46</w:t>
-            </w:r>
-          </w:p>
-        </w:tc>
-        <w:tc>
-          <w:tcPr>
-            <w:tcW w:type="dxa" w:w="1100"/>
+              <w:t xml:space="preserve">61</w:t>
+            </w:r>
+          </w:p>
+        </w:tc>
+        <w:tc>
+          <w:tcPr>
+            <w:tcW w:type="dxa" w:w="1000"/>
             <w:tcBorders>
               <w:top w:val="single" w:color="888888" w:sz="4"/>
               <w:left w:val="single" w:color="888888" w:sz="4"/>
@@ -1611,94 +1675,94 @@
         </w:tc>
         <w:tc>
           <w:tcPr>
-            <w:tcW w:type="dxa" w:w="1100"/>
-            <w:tcBorders>
-              <w:top w:val="single" w:color="888888" w:sz="4"/>
-              <w:left w:val="single" w:color="888888" w:sz="4"/>
-              <w:bottom w:val="single" w:color="888888" w:sz="4"/>
-              <w:right w:val="single" w:color="888888" w:sz="4"/>
-            </w:tcBorders>
-            <w:tcMar>
-              <w:top w:type="dxa" w:w="80"/>
-              <w:left w:type="dxa" w:w="120"/>
-              <w:bottom w:type="dxa" w:w="80"/>
-              <w:right w:type="dxa" w:w="120"/>
-            </w:tcMar>
-          </w:tcPr>
-          <w:p>
-            <w:pPr>
-              <w:jc w:val="center"/>
-            </w:pPr>
-            <w:r>
-              <w:rPr>
-                <w:b w:val="false"/>
-                <w:bCs w:val="false"/>
-                <w:sz w:val="20"/>
-                <w:szCs w:val="20"/>
-              </w:rPr>
-              <w:t xml:space="preserve">14</w:t>
-            </w:r>
-          </w:p>
-        </w:tc>
-        <w:tc>
-          <w:tcPr>
-            <w:tcW w:type="dxa" w:w="1100"/>
-            <w:tcBorders>
-              <w:top w:val="single" w:color="888888" w:sz="4"/>
-              <w:left w:val="single" w:color="888888" w:sz="4"/>
-              <w:bottom w:val="single" w:color="888888" w:sz="4"/>
-              <w:right w:val="single" w:color="888888" w:sz="4"/>
-            </w:tcBorders>
-            <w:tcMar>
-              <w:top w:type="dxa" w:w="80"/>
-              <w:left w:type="dxa" w:w="120"/>
-              <w:bottom w:type="dxa" w:w="80"/>
-              <w:right w:type="dxa" w:w="120"/>
-            </w:tcMar>
-          </w:tcPr>
-          <w:p>
-            <w:pPr>
-              <w:jc w:val="center"/>
-            </w:pPr>
-            <w:r>
-              <w:rPr>
-                <w:b w:val="false"/>
-                <w:bCs w:val="false"/>
-                <w:sz w:val="20"/>
-                <w:szCs w:val="20"/>
-              </w:rPr>
-              <w:t xml:space="preserve">55</w:t>
-            </w:r>
-          </w:p>
-        </w:tc>
-        <w:tc>
-          <w:tcPr>
-            <w:tcW w:type="dxa" w:w="1460"/>
-            <w:tcBorders>
-              <w:top w:val="single" w:color="888888" w:sz="4"/>
-              <w:left w:val="single" w:color="888888" w:sz="4"/>
-              <w:bottom w:val="single" w:color="888888" w:sz="4"/>
-              <w:right w:val="single" w:color="888888" w:sz="4"/>
-            </w:tcBorders>
-            <w:tcMar>
-              <w:top w:type="dxa" w:w="80"/>
-              <w:left w:type="dxa" w:w="120"/>
-              <w:bottom w:type="dxa" w:w="80"/>
-              <w:right w:type="dxa" w:w="120"/>
-            </w:tcMar>
-          </w:tcPr>
-          <w:p>
-            <w:pPr>
-              <w:jc w:val="center"/>
-            </w:pPr>
-            <w:r>
-              <w:rPr>
-                <w:b w:val="false"/>
-                <w:bCs w:val="false"/>
-                <w:sz w:val="20"/>
-                <w:szCs w:val="20"/>
-              </w:rPr>
-              <w:t xml:space="preserve">60 (10)</w:t>
+            <w:tcW w:type="dxa" w:w="980"/>
+            <w:tcBorders>
+              <w:top w:val="single" w:color="888888" w:sz="4"/>
+              <w:left w:val="single" w:color="888888" w:sz="4"/>
+              <w:bottom w:val="single" w:color="888888" w:sz="4"/>
+              <w:right w:val="single" w:color="888888" w:sz="4"/>
+            </w:tcBorders>
+            <w:tcMar>
+              <w:top w:type="dxa" w:w="80"/>
+              <w:left w:type="dxa" w:w="120"/>
+              <w:bottom w:type="dxa" w:w="80"/>
+              <w:right w:type="dxa" w:w="120"/>
+            </w:tcMar>
+          </w:tcPr>
+          <w:p>
+            <w:pPr>
+              <w:jc w:val="center"/>
+            </w:pPr>
+            <w:r>
+              <w:rPr>
+                <w:b w:val="false"/>
+                <w:bCs w:val="false"/>
+                <w:sz w:val="20"/>
+                <w:szCs w:val="20"/>
+              </w:rPr>
+              <w:t xml:space="preserve">43.5</w:t>
+            </w:r>
+          </w:p>
+        </w:tc>
+        <w:tc>
+          <w:tcPr>
+            <w:tcW w:type="dxa" w:w="1180"/>
+            <w:tcBorders>
+              <w:top w:val="single" w:color="888888" w:sz="4"/>
+              <w:left w:val="single" w:color="888888" w:sz="4"/>
+              <w:bottom w:val="single" w:color="888888" w:sz="4"/>
+              <w:right w:val="single" w:color="888888" w:sz="4"/>
+            </w:tcBorders>
+            <w:tcMar>
+              <w:top w:type="dxa" w:w="80"/>
+              <w:left w:type="dxa" w:w="120"/>
+              <w:bottom w:type="dxa" w:w="80"/>
+              <w:right w:type="dxa" w:w="120"/>
+            </w:tcMar>
+          </w:tcPr>
+          <w:p>
+            <w:pPr>
+              <w:jc w:val="center"/>
+            </w:pPr>
+            <w:r>
+              <w:rPr>
+                <w:b w:val="false"/>
+                <w:bCs w:val="false"/>
+                <w:sz w:val="20"/>
+                <w:szCs w:val="20"/>
+              </w:rPr>
+              <w:t xml:space="preserve">66.9 ± 8.4</w:t>
+            </w:r>
+          </w:p>
+        </w:tc>
+        <w:tc>
+          <w:tcPr>
+            <w:tcW w:type="dxa" w:w="1380"/>
+            <w:tcBorders>
+              <w:top w:val="single" w:color="888888" w:sz="4"/>
+              <w:left w:val="single" w:color="888888" w:sz="4"/>
+              <w:bottom w:val="single" w:color="888888" w:sz="4"/>
+              <w:right w:val="single" w:color="888888" w:sz="4"/>
+            </w:tcBorders>
+            <w:tcMar>
+              <w:top w:type="dxa" w:w="80"/>
+              <w:left w:type="dxa" w:w="120"/>
+              <w:bottom w:type="dxa" w:w="80"/>
+              <w:right w:type="dxa" w:w="120"/>
+            </w:tcMar>
+          </w:tcPr>
+          <w:p>
+            <w:pPr>
+              <w:jc w:val="center"/>
+            </w:pPr>
+            <w:r>
+              <w:rPr>
+                <w:b w:val="false"/>
+                <w:bCs w:val="false"/>
+                <w:sz w:val="20"/>
+                <w:szCs w:val="20"/>
+              </w:rPr>
+              <w:t xml:space="preserve">27.4 ± 4.0</w:t>
             </w:r>
           </w:p>
         </w:tc>
@@ -1706,7 +1770,7 @@
       <w:tr>
         <w:tc>
           <w:tcPr>
-            <w:tcW w:type="dxa" w:w="1700"/>
+            <w:tcW w:type="dxa" w:w="1500"/>
             <w:tcBorders>
               <w:top w:val="single" w:color="888888" w:sz="4"/>
               <w:left w:val="single" w:color="888888" w:sz="4"/>
@@ -1737,6 +1801,68 @@
         </w:tc>
         <w:tc>
           <w:tcPr>
+            <w:tcW w:type="dxa" w:w="760"/>
+            <w:tcBorders>
+              <w:top w:val="single" w:color="888888" w:sz="4"/>
+              <w:left w:val="single" w:color="888888" w:sz="4"/>
+              <w:bottom w:val="single" w:color="888888" w:sz="4"/>
+              <w:right w:val="single" w:color="888888" w:sz="4"/>
+            </w:tcBorders>
+            <w:tcMar>
+              <w:top w:type="dxa" w:w="80"/>
+              <w:left w:type="dxa" w:w="120"/>
+              <w:bottom w:type="dxa" w:w="80"/>
+              <w:right w:type="dxa" w:w="120"/>
+            </w:tcMar>
+          </w:tcPr>
+          <w:p>
+            <w:pPr>
+              <w:jc w:val="center"/>
+            </w:pPr>
+            <w:r>
+              <w:rPr>
+                <w:b w:val="false"/>
+                <w:bCs w:val="false"/>
+                <w:sz w:val="20"/>
+                <w:szCs w:val="20"/>
+              </w:rPr>
+              <w:t xml:space="preserve">ITA</w:t>
+            </w:r>
+          </w:p>
+        </w:tc>
+        <w:tc>
+          <w:tcPr>
+            <w:tcW w:type="dxa" w:w="760"/>
+            <w:tcBorders>
+              <w:top w:val="single" w:color="888888" w:sz="4"/>
+              <w:left w:val="single" w:color="888888" w:sz="4"/>
+              <w:bottom w:val="single" w:color="888888" w:sz="4"/>
+              <w:right w:val="single" w:color="888888" w:sz="4"/>
+            </w:tcBorders>
+            <w:tcMar>
+              <w:top w:type="dxa" w:w="80"/>
+              <w:left w:type="dxa" w:w="120"/>
+              <w:bottom w:type="dxa" w:w="80"/>
+              <w:right w:type="dxa" w:w="120"/>
+            </w:tcMar>
+          </w:tcPr>
+          <w:p>
+            <w:pPr>
+              <w:jc w:val="center"/>
+            </w:pPr>
+            <w:r>
+              <w:rPr>
+                <w:b w:val="false"/>
+                <w:bCs w:val="false"/>
+                <w:sz w:val="20"/>
+                <w:szCs w:val="20"/>
+              </w:rPr>
+              <w:t xml:space="preserve">80</w:t>
+            </w:r>
+          </w:p>
+        </w:tc>
+        <w:tc>
+          <w:tcPr>
             <w:tcW w:type="dxa" w:w="900"/>
             <w:tcBorders>
               <w:top w:val="single" w:color="888888" w:sz="4"/>
@@ -1762,7 +1888,7 @@
                 <w:sz w:val="20"/>
                 <w:szCs w:val="20"/>
               </w:rPr>
-              <w:t xml:space="preserve">Italy</w:t>
+              <w:t xml:space="preserve">29</w:t>
             </w:r>
           </w:p>
         </w:tc>
@@ -1793,162 +1919,131 @@
                 <w:sz w:val="20"/>
                 <w:szCs w:val="20"/>
               </w:rPr>
-              <w:t xml:space="preserve">53</w:t>
-            </w:r>
-          </w:p>
-        </w:tc>
-        <w:tc>
-          <w:tcPr>
-            <w:tcW w:type="dxa" w:w="1100"/>
-            <w:tcBorders>
-              <w:top w:val="single" w:color="888888" w:sz="4"/>
-              <w:left w:val="single" w:color="888888" w:sz="4"/>
-              <w:bottom w:val="single" w:color="888888" w:sz="4"/>
-              <w:right w:val="single" w:color="888888" w:sz="4"/>
-            </w:tcBorders>
-            <w:tcMar>
-              <w:top w:type="dxa" w:w="80"/>
-              <w:left w:type="dxa" w:w="120"/>
-              <w:bottom w:type="dxa" w:w="80"/>
-              <w:right w:type="dxa" w:w="120"/>
-            </w:tcMar>
-          </w:tcPr>
-          <w:p>
-            <w:pPr>
-              <w:jc w:val="center"/>
-            </w:pPr>
-            <w:r>
-              <w:rPr>
-                <w:b w:val="false"/>
-                <w:bCs w:val="false"/>
-                <w:sz w:val="20"/>
-                <w:szCs w:val="20"/>
-              </w:rPr>
-              <w:t xml:space="preserve">29</w:t>
-            </w:r>
-          </w:p>
-        </w:tc>
-        <w:tc>
-          <w:tcPr>
-            <w:tcW w:type="dxa" w:w="1100"/>
-            <w:tcBorders>
-              <w:top w:val="single" w:color="888888" w:sz="4"/>
-              <w:left w:val="single" w:color="888888" w:sz="4"/>
-              <w:bottom w:val="single" w:color="888888" w:sz="4"/>
-              <w:right w:val="single" w:color="888888" w:sz="4"/>
-            </w:tcBorders>
-            <w:tcMar>
-              <w:top w:type="dxa" w:w="80"/>
-              <w:left w:type="dxa" w:w="120"/>
-              <w:bottom w:type="dxa" w:w="80"/>
-              <w:right w:type="dxa" w:w="120"/>
-            </w:tcMar>
-          </w:tcPr>
-          <w:p>
-            <w:pPr>
-              <w:jc w:val="center"/>
-            </w:pPr>
-            <w:r>
-              <w:rPr>
-                <w:b w:val="false"/>
-                <w:bCs w:val="false"/>
-                <w:sz w:val="20"/>
-                <w:szCs w:val="20"/>
-              </w:rPr>
               <w:t xml:space="preserve">24</w:t>
             </w:r>
           </w:p>
         </w:tc>
         <w:tc>
           <w:tcPr>
-            <w:tcW w:type="dxa" w:w="1100"/>
-            <w:tcBorders>
-              <w:top w:val="single" w:color="888888" w:sz="4"/>
-              <w:left w:val="single" w:color="888888" w:sz="4"/>
-              <w:bottom w:val="single" w:color="888888" w:sz="4"/>
-              <w:right w:val="single" w:color="888888" w:sz="4"/>
-            </w:tcBorders>
-            <w:tcMar>
-              <w:top w:type="dxa" w:w="80"/>
-              <w:left w:type="dxa" w:w="120"/>
-              <w:bottom w:type="dxa" w:w="80"/>
-              <w:right w:type="dxa" w:w="120"/>
-            </w:tcMar>
-          </w:tcPr>
-          <w:p>
-            <w:pPr>
-              <w:jc w:val="center"/>
-            </w:pPr>
-            <w:r>
-              <w:rPr>
-                <w:b w:val="false"/>
-                <w:bCs w:val="false"/>
-                <w:sz w:val="20"/>
-                <w:szCs w:val="20"/>
-              </w:rPr>
-              <w:t xml:space="preserve">0</w:t>
-            </w:r>
-          </w:p>
-        </w:tc>
-        <w:tc>
-          <w:tcPr>
-            <w:tcW w:type="dxa" w:w="1100"/>
-            <w:tcBorders>
-              <w:top w:val="single" w:color="888888" w:sz="4"/>
-              <w:left w:val="single" w:color="888888" w:sz="4"/>
-              <w:bottom w:val="single" w:color="888888" w:sz="4"/>
-              <w:right w:val="single" w:color="888888" w:sz="4"/>
-            </w:tcBorders>
-            <w:tcMar>
-              <w:top w:type="dxa" w:w="80"/>
-              <w:left w:type="dxa" w:w="120"/>
-              <w:bottom w:type="dxa" w:w="80"/>
-              <w:right w:type="dxa" w:w="120"/>
-            </w:tcMar>
-          </w:tcPr>
-          <w:p>
-            <w:pPr>
-              <w:jc w:val="center"/>
-            </w:pPr>
-            <w:r>
-              <w:rPr>
-                <w:b w:val="false"/>
-                <w:bCs w:val="false"/>
-                <w:sz w:val="20"/>
-                <w:szCs w:val="20"/>
-              </w:rPr>
-              <w:t xml:space="preserve">44</w:t>
-            </w:r>
-          </w:p>
-        </w:tc>
-        <w:tc>
-          <w:tcPr>
-            <w:tcW w:type="dxa" w:w="1460"/>
-            <w:tcBorders>
-              <w:top w:val="single" w:color="888888" w:sz="4"/>
-              <w:left w:val="single" w:color="888888" w:sz="4"/>
-              <w:bottom w:val="single" w:color="888888" w:sz="4"/>
-              <w:right w:val="single" w:color="888888" w:sz="4"/>
-            </w:tcBorders>
-            <w:tcMar>
-              <w:top w:type="dxa" w:w="80"/>
-              <w:left w:type="dxa" w:w="120"/>
-              <w:bottom w:type="dxa" w:w="80"/>
-              <w:right w:type="dxa" w:w="120"/>
-            </w:tcMar>
-          </w:tcPr>
-          <w:p>
-            <w:pPr>
-              <w:jc w:val="center"/>
-            </w:pPr>
-            <w:r>
-              <w:rPr>
-                <w:b w:val="false"/>
-                <w:bCs w:val="false"/>
-                <w:sz w:val="20"/>
-                <w:szCs w:val="20"/>
-              </w:rPr>
-              <w:t xml:space="preserve">67 (11)</w:t>
+            <w:tcW w:type="dxa" w:w="1000"/>
+            <w:tcBorders>
+              <w:top w:val="single" w:color="888888" w:sz="4"/>
+              <w:left w:val="single" w:color="888888" w:sz="4"/>
+              <w:bottom w:val="single" w:color="888888" w:sz="4"/>
+              <w:right w:val="single" w:color="888888" w:sz="4"/>
+            </w:tcBorders>
+            <w:tcMar>
+              <w:top w:type="dxa" w:w="80"/>
+              <w:left w:type="dxa" w:w="120"/>
+              <w:bottom w:type="dxa" w:w="80"/>
+              <w:right w:type="dxa" w:w="120"/>
+            </w:tcMar>
+          </w:tcPr>
+          <w:p>
+            <w:pPr>
+              <w:jc w:val="center"/>
+            </w:pPr>
+            <w:r>
+              <w:rPr>
+                <w:b w:val="false"/>
+                <w:bCs w:val="false"/>
+                <w:sz w:val="20"/>
+                <w:szCs w:val="20"/>
+              </w:rPr>
+              <w:t xml:space="preserve">27</w:t>
+            </w:r>
+          </w:p>
+        </w:tc>
+        <w:tc>
+          <w:tcPr>
+            <w:tcW w:type="dxa" w:w="980"/>
+            <w:tcBorders>
+              <w:top w:val="single" w:color="888888" w:sz="4"/>
+              <w:left w:val="single" w:color="888888" w:sz="4"/>
+              <w:bottom w:val="single" w:color="888888" w:sz="4"/>
+              <w:right w:val="single" w:color="888888" w:sz="4"/>
+            </w:tcBorders>
+            <w:tcMar>
+              <w:top w:type="dxa" w:w="80"/>
+              <w:left w:type="dxa" w:w="120"/>
+              <w:bottom w:type="dxa" w:w="80"/>
+              <w:right w:type="dxa" w:w="120"/>
+            </w:tcMar>
+          </w:tcPr>
+          <w:p>
+            <w:pPr>
+              <w:jc w:val="center"/>
+            </w:pPr>
+            <w:r>
+              <w:rPr>
+                <w:b w:val="false"/>
+                <w:bCs w:val="false"/>
+                <w:sz w:val="20"/>
+                <w:szCs w:val="20"/>
+              </w:rPr>
+              <w:t xml:space="preserve">35.0</w:t>
+            </w:r>
+          </w:p>
+        </w:tc>
+        <w:tc>
+          <w:tcPr>
+            <w:tcW w:type="dxa" w:w="1180"/>
+            <w:tcBorders>
+              <w:top w:val="single" w:color="888888" w:sz="4"/>
+              <w:left w:val="single" w:color="888888" w:sz="4"/>
+              <w:bottom w:val="single" w:color="888888" w:sz="4"/>
+              <w:right w:val="single" w:color="888888" w:sz="4"/>
+            </w:tcBorders>
+            <w:tcMar>
+              <w:top w:type="dxa" w:w="80"/>
+              <w:left w:type="dxa" w:w="120"/>
+              <w:bottom w:type="dxa" w:w="80"/>
+              <w:right w:type="dxa" w:w="120"/>
+            </w:tcMar>
+          </w:tcPr>
+          <w:p>
+            <w:pPr>
+              <w:jc w:val="center"/>
+            </w:pPr>
+            <w:r>
+              <w:rPr>
+                <w:b w:val="false"/>
+                <w:bCs w:val="false"/>
+                <w:sz w:val="20"/>
+                <w:szCs w:val="20"/>
+              </w:rPr>
+              <w:t xml:space="preserve">67.5 ± 8.7</w:t>
+            </w:r>
+          </w:p>
+        </w:tc>
+        <w:tc>
+          <w:tcPr>
+            <w:tcW w:type="dxa" w:w="1380"/>
+            <w:tcBorders>
+              <w:top w:val="single" w:color="888888" w:sz="4"/>
+              <w:left w:val="single" w:color="888888" w:sz="4"/>
+              <w:bottom w:val="single" w:color="888888" w:sz="4"/>
+              <w:right w:val="single" w:color="888888" w:sz="4"/>
+            </w:tcBorders>
+            <w:tcMar>
+              <w:top w:type="dxa" w:w="80"/>
+              <w:left w:type="dxa" w:w="120"/>
+              <w:bottom w:type="dxa" w:w="80"/>
+              <w:right w:type="dxa" w:w="120"/>
+            </w:tcMar>
+          </w:tcPr>
+          <w:p>
+            <w:pPr>
+              <w:jc w:val="center"/>
+            </w:pPr>
+            <w:r>
+              <w:rPr>
+                <w:b w:val="false"/>
+                <w:bCs w:val="false"/>
+                <w:sz w:val="20"/>
+                <w:szCs w:val="20"/>
+              </w:rPr>
+              <w:t xml:space="preserve">25.5 ± 3.9</w:t>
             </w:r>
           </w:p>
         </w:tc>
@@ -1956,7 +2051,7 @@
       <w:tr>
         <w:tc>
           <w:tcPr>
-            <w:tcW w:type="dxa" w:w="1700"/>
+            <w:tcW w:type="dxa" w:w="1500"/>
             <w:tcBorders>
               <w:top w:val="single" w:color="888888" w:sz="4"/>
               <w:left w:val="single" w:color="888888" w:sz="4"/>
@@ -1987,6 +2082,68 @@
         </w:tc>
         <w:tc>
           <w:tcPr>
+            <w:tcW w:type="dxa" w:w="760"/>
+            <w:tcBorders>
+              <w:top w:val="single" w:color="888888" w:sz="4"/>
+              <w:left w:val="single" w:color="888888" w:sz="4"/>
+              <w:bottom w:val="single" w:color="888888" w:sz="4"/>
+              <w:right w:val="single" w:color="888888" w:sz="4"/>
+            </w:tcBorders>
+            <w:tcMar>
+              <w:top w:type="dxa" w:w="80"/>
+              <w:left w:type="dxa" w:w="120"/>
+              <w:bottom w:type="dxa" w:w="80"/>
+              <w:right w:type="dxa" w:w="120"/>
+            </w:tcMar>
+          </w:tcPr>
+          <w:p>
+            <w:pPr>
+              <w:jc w:val="center"/>
+            </w:pPr>
+            <w:r>
+              <w:rPr>
+                <w:b w:val="false"/>
+                <w:bCs w:val="false"/>
+                <w:sz w:val="20"/>
+                <w:szCs w:val="20"/>
+              </w:rPr>
+              <w:t xml:space="preserve">ITA</w:t>
+            </w:r>
+          </w:p>
+        </w:tc>
+        <w:tc>
+          <w:tcPr>
+            <w:tcW w:type="dxa" w:w="760"/>
+            <w:tcBorders>
+              <w:top w:val="single" w:color="888888" w:sz="4"/>
+              <w:left w:val="single" w:color="888888" w:sz="4"/>
+              <w:bottom w:val="single" w:color="888888" w:sz="4"/>
+              <w:right w:val="single" w:color="888888" w:sz="4"/>
+            </w:tcBorders>
+            <w:tcMar>
+              <w:top w:type="dxa" w:w="80"/>
+              <w:left w:type="dxa" w:w="120"/>
+              <w:bottom w:type="dxa" w:w="80"/>
+              <w:right w:type="dxa" w:w="120"/>
+            </w:tcMar>
+          </w:tcPr>
+          <w:p>
+            <w:pPr>
+              <w:jc w:val="center"/>
+            </w:pPr>
+            <w:r>
+              <w:rPr>
+                <w:b w:val="false"/>
+                <w:bCs w:val="false"/>
+                <w:sz w:val="20"/>
+                <w:szCs w:val="20"/>
+              </w:rPr>
+              <w:t xml:space="preserve">60</w:t>
+            </w:r>
+          </w:p>
+        </w:tc>
+        <w:tc>
+          <w:tcPr>
             <w:tcW w:type="dxa" w:w="900"/>
             <w:tcBorders>
               <w:top w:val="single" w:color="888888" w:sz="4"/>
@@ -2012,7 +2169,7 @@
                 <w:sz w:val="20"/>
                 <w:szCs w:val="20"/>
               </w:rPr>
-              <w:t xml:space="preserve">Italy</w:t>
+              <w:t xml:space="preserve">32</w:t>
             </w:r>
           </w:p>
         </w:tc>
@@ -2043,75 +2200,13 @@
                 <w:sz w:val="20"/>
                 <w:szCs w:val="20"/>
               </w:rPr>
-              <w:t xml:space="preserve">60</w:t>
-            </w:r>
-          </w:p>
-        </w:tc>
-        <w:tc>
-          <w:tcPr>
-            <w:tcW w:type="dxa" w:w="1100"/>
-            <w:tcBorders>
-              <w:top w:val="single" w:color="888888" w:sz="4"/>
-              <w:left w:val="single" w:color="888888" w:sz="4"/>
-              <w:bottom w:val="single" w:color="888888" w:sz="4"/>
-              <w:right w:val="single" w:color="888888" w:sz="4"/>
-            </w:tcBorders>
-            <w:tcMar>
-              <w:top w:type="dxa" w:w="80"/>
-              <w:left w:type="dxa" w:w="120"/>
-              <w:bottom w:type="dxa" w:w="80"/>
-              <w:right w:type="dxa" w:w="120"/>
-            </w:tcMar>
-          </w:tcPr>
-          <w:p>
-            <w:pPr>
-              <w:jc w:val="center"/>
-            </w:pPr>
-            <w:r>
-              <w:rPr>
-                <w:b w:val="false"/>
-                <w:bCs w:val="false"/>
-                <w:sz w:val="20"/>
-                <w:szCs w:val="20"/>
-              </w:rPr>
-              <w:t xml:space="preserve">32</w:t>
-            </w:r>
-          </w:p>
-        </w:tc>
-        <w:tc>
-          <w:tcPr>
-            <w:tcW w:type="dxa" w:w="1100"/>
-            <w:tcBorders>
-              <w:top w:val="single" w:color="888888" w:sz="4"/>
-              <w:left w:val="single" w:color="888888" w:sz="4"/>
-              <w:bottom w:val="single" w:color="888888" w:sz="4"/>
-              <w:right w:val="single" w:color="888888" w:sz="4"/>
-            </w:tcBorders>
-            <w:tcMar>
-              <w:top w:type="dxa" w:w="80"/>
-              <w:left w:type="dxa" w:w="120"/>
-              <w:bottom w:type="dxa" w:w="80"/>
-              <w:right w:type="dxa" w:w="120"/>
-            </w:tcMar>
-          </w:tcPr>
-          <w:p>
-            <w:pPr>
-              <w:jc w:val="center"/>
-            </w:pPr>
-            <w:r>
-              <w:rPr>
-                <w:b w:val="false"/>
-                <w:bCs w:val="false"/>
-                <w:sz w:val="20"/>
-                <w:szCs w:val="20"/>
-              </w:rPr>
               <w:t xml:space="preserve">28</w:t>
             </w:r>
           </w:p>
         </w:tc>
         <w:tc>
           <w:tcPr>
-            <w:tcW w:type="dxa" w:w="1100"/>
+            <w:tcW w:type="dxa" w:w="1000"/>
             <w:tcBorders>
               <w:top w:val="single" w:color="888888" w:sz="4"/>
               <w:left w:val="single" w:color="888888" w:sz="4"/>
@@ -2142,63 +2237,94 @@
         </w:tc>
         <w:tc>
           <w:tcPr>
-            <w:tcW w:type="dxa" w:w="1100"/>
-            <w:tcBorders>
-              <w:top w:val="single" w:color="888888" w:sz="4"/>
-              <w:left w:val="single" w:color="888888" w:sz="4"/>
-              <w:bottom w:val="single" w:color="888888" w:sz="4"/>
-              <w:right w:val="single" w:color="888888" w:sz="4"/>
-            </w:tcBorders>
-            <w:tcMar>
-              <w:top w:type="dxa" w:w="80"/>
-              <w:left w:type="dxa" w:w="120"/>
-              <w:bottom w:type="dxa" w:w="80"/>
-              <w:right w:type="dxa" w:w="120"/>
-            </w:tcMar>
-          </w:tcPr>
-          <w:p>
-            <w:pPr>
-              <w:jc w:val="center"/>
-            </w:pPr>
-            <w:r>
-              <w:rPr>
-                <w:b w:val="false"/>
-                <w:bCs w:val="false"/>
-                <w:sz w:val="20"/>
-                <w:szCs w:val="20"/>
-              </w:rPr>
-              <w:t xml:space="preserve">47</w:t>
-            </w:r>
-          </w:p>
-        </w:tc>
-        <w:tc>
-          <w:tcPr>
-            <w:tcW w:type="dxa" w:w="1460"/>
-            <w:tcBorders>
-              <w:top w:val="single" w:color="888888" w:sz="4"/>
-              <w:left w:val="single" w:color="888888" w:sz="4"/>
-              <w:bottom w:val="single" w:color="888888" w:sz="4"/>
-              <w:right w:val="single" w:color="888888" w:sz="4"/>
-            </w:tcBorders>
-            <w:tcMar>
-              <w:top w:type="dxa" w:w="80"/>
-              <w:left w:type="dxa" w:w="120"/>
-              <w:bottom w:type="dxa" w:w="80"/>
-              <w:right w:type="dxa" w:w="120"/>
-            </w:tcMar>
-          </w:tcPr>
-          <w:p>
-            <w:pPr>
-              <w:jc w:val="center"/>
-            </w:pPr>
-            <w:r>
-              <w:rPr>
-                <w:b w:val="false"/>
-                <w:bCs w:val="false"/>
-                <w:sz w:val="20"/>
-                <w:szCs w:val="20"/>
-              </w:rPr>
-              <w:t xml:space="preserve">65 (10)</w:t>
+            <w:tcW w:type="dxa" w:w="980"/>
+            <w:tcBorders>
+              <w:top w:val="single" w:color="888888" w:sz="4"/>
+              <w:left w:val="single" w:color="888888" w:sz="4"/>
+              <w:bottom w:val="single" w:color="888888" w:sz="4"/>
+              <w:right w:val="single" w:color="888888" w:sz="4"/>
+            </w:tcBorders>
+            <w:tcMar>
+              <w:top w:type="dxa" w:w="80"/>
+              <w:left w:type="dxa" w:w="120"/>
+              <w:bottom w:type="dxa" w:w="80"/>
+              <w:right w:type="dxa" w:w="120"/>
+            </w:tcMar>
+          </w:tcPr>
+          <w:p>
+            <w:pPr>
+              <w:jc w:val="center"/>
+            </w:pPr>
+            <w:r>
+              <w:rPr>
+                <w:b w:val="false"/>
+                <w:bCs w:val="false"/>
+                <w:sz w:val="20"/>
+                <w:szCs w:val="20"/>
+              </w:rPr>
+              <w:t xml:space="preserve">35.0</w:t>
+            </w:r>
+          </w:p>
+        </w:tc>
+        <w:tc>
+          <w:tcPr>
+            <w:tcW w:type="dxa" w:w="1180"/>
+            <w:tcBorders>
+              <w:top w:val="single" w:color="888888" w:sz="4"/>
+              <w:left w:val="single" w:color="888888" w:sz="4"/>
+              <w:bottom w:val="single" w:color="888888" w:sz="4"/>
+              <w:right w:val="single" w:color="888888" w:sz="4"/>
+            </w:tcBorders>
+            <w:tcMar>
+              <w:top w:type="dxa" w:w="80"/>
+              <w:left w:type="dxa" w:w="120"/>
+              <w:bottom w:type="dxa" w:w="80"/>
+              <w:right w:type="dxa" w:w="120"/>
+            </w:tcMar>
+          </w:tcPr>
+          <w:p>
+            <w:pPr>
+              <w:jc w:val="center"/>
+            </w:pPr>
+            <w:r>
+              <w:rPr>
+                <w:b w:val="false"/>
+                <w:bCs w:val="false"/>
+                <w:sz w:val="20"/>
+                <w:szCs w:val="20"/>
+              </w:rPr>
+              <w:t xml:space="preserve">58.2 ± 8.3</w:t>
+            </w:r>
+          </w:p>
+        </w:tc>
+        <w:tc>
+          <w:tcPr>
+            <w:tcW w:type="dxa" w:w="1380"/>
+            <w:tcBorders>
+              <w:top w:val="single" w:color="888888" w:sz="4"/>
+              <w:left w:val="single" w:color="888888" w:sz="4"/>
+              <w:bottom w:val="single" w:color="888888" w:sz="4"/>
+              <w:right w:val="single" w:color="888888" w:sz="4"/>
+            </w:tcBorders>
+            <w:tcMar>
+              <w:top w:type="dxa" w:w="80"/>
+              <w:left w:type="dxa" w:w="120"/>
+              <w:bottom w:type="dxa" w:w="80"/>
+              <w:right w:type="dxa" w:w="120"/>
+            </w:tcMar>
+          </w:tcPr>
+          <w:p>
+            <w:pPr>
+              <w:jc w:val="center"/>
+            </w:pPr>
+            <w:r>
+              <w:rPr>
+                <w:b w:val="false"/>
+                <w:bCs w:val="false"/>
+                <w:sz w:val="20"/>
+                <w:szCs w:val="20"/>
+              </w:rPr>
+              <w:t xml:space="preserve">25.8 ± 4.2</w:t>
             </w:r>
           </w:p>
         </w:tc>
@@ -2206,7 +2332,7 @@
       <w:tr>
         <w:tc>
           <w:tcPr>
-            <w:tcW w:type="dxa" w:w="1700"/>
+            <w:tcW w:type="dxa" w:w="1500"/>
             <w:tcBorders>
               <w:top w:val="single" w:color="888888" w:sz="4"/>
               <w:left w:val="single" w:color="888888" w:sz="4"/>
@@ -2237,6 +2363,68 @@
         </w:tc>
         <w:tc>
           <w:tcPr>
+            <w:tcW w:type="dxa" w:w="760"/>
+            <w:tcBorders>
+              <w:top w:val="single" w:color="888888" w:sz="4"/>
+              <w:left w:val="single" w:color="888888" w:sz="4"/>
+              <w:bottom w:val="single" w:color="888888" w:sz="4"/>
+              <w:right w:val="single" w:color="888888" w:sz="4"/>
+            </w:tcBorders>
+            <w:tcMar>
+              <w:top w:type="dxa" w:w="80"/>
+              <w:left w:type="dxa" w:w="120"/>
+              <w:bottom w:type="dxa" w:w="80"/>
+              <w:right w:type="dxa" w:w="120"/>
+            </w:tcMar>
+          </w:tcPr>
+          <w:p>
+            <w:pPr>
+              <w:jc w:val="center"/>
+            </w:pPr>
+            <w:r>
+              <w:rPr>
+                <w:b w:val="false"/>
+                <w:bCs w:val="false"/>
+                <w:sz w:val="20"/>
+                <w:szCs w:val="20"/>
+              </w:rPr>
+              <w:t xml:space="preserve">JPN</w:t>
+            </w:r>
+          </w:p>
+        </w:tc>
+        <w:tc>
+          <w:tcPr>
+            <w:tcW w:type="dxa" w:w="760"/>
+            <w:tcBorders>
+              <w:top w:val="single" w:color="888888" w:sz="4"/>
+              <w:left w:val="single" w:color="888888" w:sz="4"/>
+              <w:bottom w:val="single" w:color="888888" w:sz="4"/>
+              <w:right w:val="single" w:color="888888" w:sz="4"/>
+            </w:tcBorders>
+            <w:tcMar>
+              <w:top w:type="dxa" w:w="80"/>
+              <w:left w:type="dxa" w:w="120"/>
+              <w:bottom w:type="dxa" w:w="80"/>
+              <w:right w:type="dxa" w:w="120"/>
+            </w:tcMar>
+          </w:tcPr>
+          <w:p>
+            <w:pPr>
+              <w:jc w:val="center"/>
+            </w:pPr>
+            <w:r>
+              <w:rPr>
+                <w:b w:val="false"/>
+                <w:bCs w:val="false"/>
+                <w:sz w:val="20"/>
+                <w:szCs w:val="20"/>
+              </w:rPr>
+              <w:t xml:space="preserve">80</w:t>
+            </w:r>
+          </w:p>
+        </w:tc>
+        <w:tc>
+          <w:tcPr>
             <w:tcW w:type="dxa" w:w="900"/>
             <w:tcBorders>
               <w:top w:val="single" w:color="888888" w:sz="4"/>
@@ -2262,7 +2450,7 @@
                 <w:sz w:val="20"/>
                 <w:szCs w:val="20"/>
               </w:rPr>
-              <w:t xml:space="preserve">Italy</w:t>
+              <w:t xml:space="preserve">40</w:t>
             </w:r>
           </w:p>
         </w:tc>
@@ -2293,75 +2481,13 @@
                 <w:sz w:val="20"/>
                 <w:szCs w:val="20"/>
               </w:rPr>
-              <w:t xml:space="preserve">80</w:t>
-            </w:r>
-          </w:p>
-        </w:tc>
-        <w:tc>
-          <w:tcPr>
-            <w:tcW w:type="dxa" w:w="1100"/>
-            <w:tcBorders>
-              <w:top w:val="single" w:color="888888" w:sz="4"/>
-              <w:left w:val="single" w:color="888888" w:sz="4"/>
-              <w:bottom w:val="single" w:color="888888" w:sz="4"/>
-              <w:right w:val="single" w:color="888888" w:sz="4"/>
-            </w:tcBorders>
-            <w:tcMar>
-              <w:top w:type="dxa" w:w="80"/>
-              <w:left w:type="dxa" w:w="120"/>
-              <w:bottom w:type="dxa" w:w="80"/>
-              <w:right w:type="dxa" w:w="120"/>
-            </w:tcMar>
-          </w:tcPr>
-          <w:p>
-            <w:pPr>
-              <w:jc w:val="center"/>
-            </w:pPr>
-            <w:r>
-              <w:rPr>
-                <w:b w:val="false"/>
-                <w:bCs w:val="false"/>
-                <w:sz w:val="20"/>
-                <w:szCs w:val="20"/>
-              </w:rPr>
               <w:t xml:space="preserve">40</w:t>
             </w:r>
           </w:p>
         </w:tc>
         <w:tc>
           <w:tcPr>
-            <w:tcW w:type="dxa" w:w="1100"/>
-            <w:tcBorders>
-              <w:top w:val="single" w:color="888888" w:sz="4"/>
-              <w:left w:val="single" w:color="888888" w:sz="4"/>
-              <w:bottom w:val="single" w:color="888888" w:sz="4"/>
-              <w:right w:val="single" w:color="888888" w:sz="4"/>
-            </w:tcBorders>
-            <w:tcMar>
-              <w:top w:type="dxa" w:w="80"/>
-              <w:left w:type="dxa" w:w="120"/>
-              <w:bottom w:type="dxa" w:w="80"/>
-              <w:right w:type="dxa" w:w="120"/>
-            </w:tcMar>
-          </w:tcPr>
-          <w:p>
-            <w:pPr>
-              <w:jc w:val="center"/>
-            </w:pPr>
-            <w:r>
-              <w:rPr>
-                <w:b w:val="false"/>
-                <w:bCs w:val="false"/>
-                <w:sz w:val="20"/>
-                <w:szCs w:val="20"/>
-              </w:rPr>
-              <w:t xml:space="preserve">40</w:t>
-            </w:r>
-          </w:p>
-        </w:tc>
-        <w:tc>
-          <w:tcPr>
-            <w:tcW w:type="dxa" w:w="1100"/>
+            <w:tcW w:type="dxa" w:w="1000"/>
             <w:tcBorders>
               <w:top w:val="single" w:color="888888" w:sz="4"/>
               <w:left w:val="single" w:color="888888" w:sz="4"/>
@@ -2392,63 +2518,94 @@
         </w:tc>
         <w:tc>
           <w:tcPr>
-            <w:tcW w:type="dxa" w:w="1100"/>
-            <w:tcBorders>
-              <w:top w:val="single" w:color="888888" w:sz="4"/>
-              <w:left w:val="single" w:color="888888" w:sz="4"/>
-              <w:bottom w:val="single" w:color="888888" w:sz="4"/>
-              <w:right w:val="single" w:color="888888" w:sz="4"/>
-            </w:tcBorders>
-            <w:tcMar>
-              <w:top w:type="dxa" w:w="80"/>
-              <w:left w:type="dxa" w:w="120"/>
-              <w:bottom w:type="dxa" w:w="80"/>
-              <w:right w:type="dxa" w:w="120"/>
-            </w:tcMar>
-          </w:tcPr>
-          <w:p>
-            <w:pPr>
-              <w:jc w:val="center"/>
-            </w:pPr>
-            <w:r>
-              <w:rPr>
-                <w:b w:val="false"/>
-                <w:bCs w:val="false"/>
-                <w:sz w:val="20"/>
-                <w:szCs w:val="20"/>
-              </w:rPr>
-              <w:t xml:space="preserve">50</w:t>
-            </w:r>
-          </w:p>
-        </w:tc>
-        <w:tc>
-          <w:tcPr>
-            <w:tcW w:type="dxa" w:w="1460"/>
-            <w:tcBorders>
-              <w:top w:val="single" w:color="888888" w:sz="4"/>
-              <w:left w:val="single" w:color="888888" w:sz="4"/>
-              <w:bottom w:val="single" w:color="888888" w:sz="4"/>
-              <w:right w:val="single" w:color="888888" w:sz="4"/>
-            </w:tcBorders>
-            <w:tcMar>
-              <w:top w:type="dxa" w:w="80"/>
-              <w:left w:type="dxa" w:w="120"/>
-              <w:bottom w:type="dxa" w:w="80"/>
-              <w:right w:type="dxa" w:w="120"/>
-            </w:tcMar>
-          </w:tcPr>
-          <w:p>
-            <w:pPr>
-              <w:jc w:val="center"/>
-            </w:pPr>
-            <w:r>
-              <w:rPr>
-                <w:b w:val="false"/>
-                <w:bCs w:val="false"/>
-                <w:sz w:val="20"/>
-                <w:szCs w:val="20"/>
-              </w:rPr>
-              <w:t xml:space="preserve">63 (12)</w:t>
+            <w:tcW w:type="dxa" w:w="980"/>
+            <w:tcBorders>
+              <w:top w:val="single" w:color="888888" w:sz="4"/>
+              <w:left w:val="single" w:color="888888" w:sz="4"/>
+              <w:bottom w:val="single" w:color="888888" w:sz="4"/>
+              <w:right w:val="single" w:color="888888" w:sz="4"/>
+            </w:tcBorders>
+            <w:tcMar>
+              <w:top w:type="dxa" w:w="80"/>
+              <w:left w:type="dxa" w:w="120"/>
+              <w:bottom w:type="dxa" w:w="80"/>
+              <w:right w:type="dxa" w:w="120"/>
+            </w:tcMar>
+          </w:tcPr>
+          <w:p>
+            <w:pPr>
+              <w:jc w:val="center"/>
+            </w:pPr>
+            <w:r>
+              <w:rPr>
+                <w:b w:val="false"/>
+                <w:bCs w:val="false"/>
+                <w:sz w:val="20"/>
+                <w:szCs w:val="20"/>
+              </w:rPr>
+              <w:t xml:space="preserve">43.8</w:t>
+            </w:r>
+          </w:p>
+        </w:tc>
+        <w:tc>
+          <w:tcPr>
+            <w:tcW w:type="dxa" w:w="1180"/>
+            <w:tcBorders>
+              <w:top w:val="single" w:color="888888" w:sz="4"/>
+              <w:left w:val="single" w:color="888888" w:sz="4"/>
+              <w:bottom w:val="single" w:color="888888" w:sz="4"/>
+              <w:right w:val="single" w:color="888888" w:sz="4"/>
+            </w:tcBorders>
+            <w:tcMar>
+              <w:top w:type="dxa" w:w="80"/>
+              <w:left w:type="dxa" w:w="120"/>
+              <w:bottom w:type="dxa" w:w="80"/>
+              <w:right w:type="dxa" w:w="120"/>
+            </w:tcMar>
+          </w:tcPr>
+          <w:p>
+            <w:pPr>
+              <w:jc w:val="center"/>
+            </w:pPr>
+            <w:r>
+              <w:rPr>
+                <w:b w:val="false"/>
+                <w:bCs w:val="false"/>
+                <w:sz w:val="20"/>
+                <w:szCs w:val="20"/>
+              </w:rPr>
+              <w:t xml:space="preserve">61.1 ± 12.6</w:t>
+            </w:r>
+          </w:p>
+        </w:tc>
+        <w:tc>
+          <w:tcPr>
+            <w:tcW w:type="dxa" w:w="1380"/>
+            <w:tcBorders>
+              <w:top w:val="single" w:color="888888" w:sz="4"/>
+              <w:left w:val="single" w:color="888888" w:sz="4"/>
+              <w:bottom w:val="single" w:color="888888" w:sz="4"/>
+              <w:right w:val="single" w:color="888888" w:sz="4"/>
+            </w:tcBorders>
+            <w:tcMar>
+              <w:top w:type="dxa" w:w="80"/>
+              <w:left w:type="dxa" w:w="120"/>
+              <w:bottom w:type="dxa" w:w="80"/>
+              <w:right w:type="dxa" w:w="120"/>
+            </w:tcMar>
+          </w:tcPr>
+          <w:p>
+            <w:pPr>
+              <w:jc w:val="center"/>
+            </w:pPr>
+            <w:r>
+              <w:rPr>
+                <w:b w:val="false"/>
+                <w:bCs w:val="false"/>
+                <w:sz w:val="20"/>
+                <w:szCs w:val="20"/>
+              </w:rPr>
+              <w:t xml:space="preserve">22.7 ± 2.6</w:t>
             </w:r>
           </w:p>
         </w:tc>
@@ -2456,7 +2613,7 @@
       <w:tr>
         <w:tc>
           <w:tcPr>
-            <w:tcW w:type="dxa" w:w="1700"/>
+            <w:tcW w:type="dxa" w:w="1500"/>
             <w:tcBorders>
               <w:top w:val="single" w:color="888888" w:sz="4"/>
               <w:left w:val="single" w:color="888888" w:sz="4"/>
@@ -2487,6 +2644,68 @@
         </w:tc>
         <w:tc>
           <w:tcPr>
+            <w:tcW w:type="dxa" w:w="760"/>
+            <w:tcBorders>
+              <w:top w:val="single" w:color="888888" w:sz="4"/>
+              <w:left w:val="single" w:color="888888" w:sz="4"/>
+              <w:bottom w:val="single" w:color="888888" w:sz="4"/>
+              <w:right w:val="single" w:color="888888" w:sz="4"/>
+            </w:tcBorders>
+            <w:tcMar>
+              <w:top w:type="dxa" w:w="80"/>
+              <w:left w:type="dxa" w:w="120"/>
+              <w:bottom w:type="dxa" w:w="80"/>
+              <w:right w:type="dxa" w:w="120"/>
+            </w:tcMar>
+          </w:tcPr>
+          <w:p>
+            <w:pPr>
+              <w:jc w:val="center"/>
+            </w:pPr>
+            <w:r>
+              <w:rPr>
+                <w:b w:val="false"/>
+                <w:bCs w:val="false"/>
+                <w:sz w:val="20"/>
+                <w:szCs w:val="20"/>
+              </w:rPr>
+              <w:t xml:space="preserve">USA</w:t>
+            </w:r>
+          </w:p>
+        </w:tc>
+        <w:tc>
+          <w:tcPr>
+            <w:tcW w:type="dxa" w:w="760"/>
+            <w:tcBorders>
+              <w:top w:val="single" w:color="888888" w:sz="4"/>
+              <w:left w:val="single" w:color="888888" w:sz="4"/>
+              <w:bottom w:val="single" w:color="888888" w:sz="4"/>
+              <w:right w:val="single" w:color="888888" w:sz="4"/>
+            </w:tcBorders>
+            <w:tcMar>
+              <w:top w:type="dxa" w:w="80"/>
+              <w:left w:type="dxa" w:w="120"/>
+              <w:bottom w:type="dxa" w:w="80"/>
+              <w:right w:type="dxa" w:w="120"/>
+            </w:tcMar>
+          </w:tcPr>
+          <w:p>
+            <w:pPr>
+              <w:jc w:val="center"/>
+            </w:pPr>
+            <w:r>
+              <w:rPr>
+                <w:b w:val="false"/>
+                <w:bCs w:val="false"/>
+                <w:sz w:val="20"/>
+                <w:szCs w:val="20"/>
+              </w:rPr>
+              <w:t xml:space="preserve">104</w:t>
+            </w:r>
+          </w:p>
+        </w:tc>
+        <w:tc>
+          <w:tcPr>
             <w:tcW w:type="dxa" w:w="900"/>
             <w:tcBorders>
               <w:top w:val="single" w:color="888888" w:sz="4"/>
@@ -2512,7 +2731,7 @@
                 <w:sz w:val="20"/>
                 <w:szCs w:val="20"/>
               </w:rPr>
-              <w:t xml:space="preserve">USA</w:t>
+              <w:t xml:space="preserve">52</w:t>
             </w:r>
           </w:p>
         </w:tc>
@@ -2543,75 +2762,13 @@
                 <w:sz w:val="20"/>
                 <w:szCs w:val="20"/>
               </w:rPr>
-              <w:t xml:space="preserve">104</w:t>
-            </w:r>
-          </w:p>
-        </w:tc>
-        <w:tc>
-          <w:tcPr>
-            <w:tcW w:type="dxa" w:w="1100"/>
-            <w:tcBorders>
-              <w:top w:val="single" w:color="888888" w:sz="4"/>
-              <w:left w:val="single" w:color="888888" w:sz="4"/>
-              <w:bottom w:val="single" w:color="888888" w:sz="4"/>
-              <w:right w:val="single" w:color="888888" w:sz="4"/>
-            </w:tcBorders>
-            <w:tcMar>
-              <w:top w:type="dxa" w:w="80"/>
-              <w:left w:type="dxa" w:w="120"/>
-              <w:bottom w:type="dxa" w:w="80"/>
-              <w:right w:type="dxa" w:w="120"/>
-            </w:tcMar>
-          </w:tcPr>
-          <w:p>
-            <w:pPr>
-              <w:jc w:val="center"/>
-            </w:pPr>
-            <w:r>
-              <w:rPr>
-                <w:b w:val="false"/>
-                <w:bCs w:val="false"/>
-                <w:sz w:val="20"/>
-                <w:szCs w:val="20"/>
-              </w:rPr>
               <w:t xml:space="preserve">52</w:t>
             </w:r>
           </w:p>
         </w:tc>
         <w:tc>
           <w:tcPr>
-            <w:tcW w:type="dxa" w:w="1100"/>
-            <w:tcBorders>
-              <w:top w:val="single" w:color="888888" w:sz="4"/>
-              <w:left w:val="single" w:color="888888" w:sz="4"/>
-              <w:bottom w:val="single" w:color="888888" w:sz="4"/>
-              <w:right w:val="single" w:color="888888" w:sz="4"/>
-            </w:tcBorders>
-            <w:tcMar>
-              <w:top w:type="dxa" w:w="80"/>
-              <w:left w:type="dxa" w:w="120"/>
-              <w:bottom w:type="dxa" w:w="80"/>
-              <w:right w:type="dxa" w:w="120"/>
-            </w:tcMar>
-          </w:tcPr>
-          <w:p>
-            <w:pPr>
-              <w:jc w:val="center"/>
-            </w:pPr>
-            <w:r>
-              <w:rPr>
-                <w:b w:val="false"/>
-                <w:bCs w:val="false"/>
-                <w:sz w:val="20"/>
-                <w:szCs w:val="20"/>
-              </w:rPr>
-              <w:t xml:space="preserve">52</w:t>
-            </w:r>
-          </w:p>
-        </w:tc>
-        <w:tc>
-          <w:tcPr>
-            <w:tcW w:type="dxa" w:w="1100"/>
+            <w:tcW w:type="dxa" w:w="1000"/>
             <w:tcBorders>
               <w:top w:val="single" w:color="888888" w:sz="4"/>
               <w:left w:val="single" w:color="888888" w:sz="4"/>
@@ -2642,63 +2799,94 @@
         </w:tc>
         <w:tc>
           <w:tcPr>
-            <w:tcW w:type="dxa" w:w="1100"/>
-            <w:tcBorders>
-              <w:top w:val="single" w:color="888888" w:sz="4"/>
-              <w:left w:val="single" w:color="888888" w:sz="4"/>
-              <w:bottom w:val="single" w:color="888888" w:sz="4"/>
-              <w:right w:val="single" w:color="888888" w:sz="4"/>
-            </w:tcBorders>
-            <w:tcMar>
-              <w:top w:type="dxa" w:w="80"/>
-              <w:left w:type="dxa" w:w="120"/>
-              <w:bottom w:type="dxa" w:w="80"/>
-              <w:right w:type="dxa" w:w="120"/>
-            </w:tcMar>
-          </w:tcPr>
-          <w:p>
-            <w:pPr>
-              <w:jc w:val="center"/>
-            </w:pPr>
-            <w:r>
-              <w:rPr>
-                <w:b w:val="false"/>
-                <w:bCs w:val="false"/>
-                <w:sz w:val="20"/>
-                <w:szCs w:val="20"/>
-              </w:rPr>
-              <w:t xml:space="preserve">44</w:t>
-            </w:r>
-          </w:p>
-        </w:tc>
-        <w:tc>
-          <w:tcPr>
-            <w:tcW w:type="dxa" w:w="1460"/>
-            <w:tcBorders>
-              <w:top w:val="single" w:color="888888" w:sz="4"/>
-              <w:left w:val="single" w:color="888888" w:sz="4"/>
-              <w:bottom w:val="single" w:color="888888" w:sz="4"/>
-              <w:right w:val="single" w:color="888888" w:sz="4"/>
-            </w:tcBorders>
-            <w:tcMar>
-              <w:top w:type="dxa" w:w="80"/>
-              <w:left w:type="dxa" w:w="120"/>
-              <w:bottom w:type="dxa" w:w="80"/>
-              <w:right w:type="dxa" w:w="120"/>
-            </w:tcMar>
-          </w:tcPr>
-          <w:p>
-            <w:pPr>
-              <w:jc w:val="center"/>
-            </w:pPr>
-            <w:r>
-              <w:rPr>
-                <w:b w:val="false"/>
-                <w:bCs w:val="false"/>
-                <w:sz w:val="20"/>
-                <w:szCs w:val="20"/>
-              </w:rPr>
-              <w:t xml:space="preserve">59 (10)</w:t>
+            <w:tcW w:type="dxa" w:w="980"/>
+            <w:tcBorders>
+              <w:top w:val="single" w:color="888888" w:sz="4"/>
+              <w:left w:val="single" w:color="888888" w:sz="4"/>
+              <w:bottom w:val="single" w:color="888888" w:sz="4"/>
+              <w:right w:val="single" w:color="888888" w:sz="4"/>
+            </w:tcBorders>
+            <w:tcMar>
+              <w:top w:type="dxa" w:w="80"/>
+              <w:left w:type="dxa" w:w="120"/>
+              <w:bottom w:type="dxa" w:w="80"/>
+              <w:right w:type="dxa" w:w="120"/>
+            </w:tcMar>
+          </w:tcPr>
+          <w:p>
+            <w:pPr>
+              <w:jc w:val="center"/>
+            </w:pPr>
+            <w:r>
+              <w:rPr>
+                <w:b w:val="false"/>
+                <w:bCs w:val="false"/>
+                <w:sz w:val="20"/>
+                <w:szCs w:val="20"/>
+              </w:rPr>
+              <w:t xml:space="preserve">28.8</w:t>
+            </w:r>
+          </w:p>
+        </w:tc>
+        <w:tc>
+          <w:tcPr>
+            <w:tcW w:type="dxa" w:w="1180"/>
+            <w:tcBorders>
+              <w:top w:val="single" w:color="888888" w:sz="4"/>
+              <w:left w:val="single" w:color="888888" w:sz="4"/>
+              <w:bottom w:val="single" w:color="888888" w:sz="4"/>
+              <w:right w:val="single" w:color="888888" w:sz="4"/>
+            </w:tcBorders>
+            <w:tcMar>
+              <w:top w:type="dxa" w:w="80"/>
+              <w:left w:type="dxa" w:w="120"/>
+              <w:bottom w:type="dxa" w:w="80"/>
+              <w:right w:type="dxa" w:w="120"/>
+            </w:tcMar>
+          </w:tcPr>
+          <w:p>
+            <w:pPr>
+              <w:jc w:val="center"/>
+            </w:pPr>
+            <w:r>
+              <w:rPr>
+                <w:b w:val="false"/>
+                <w:bCs w:val="false"/>
+                <w:sz w:val="20"/>
+                <w:szCs w:val="20"/>
+              </w:rPr>
+              <w:t xml:space="preserve">61.5 ± 12.3</w:t>
+            </w:r>
+          </w:p>
+        </w:tc>
+        <w:tc>
+          <w:tcPr>
+            <w:tcW w:type="dxa" w:w="1380"/>
+            <w:tcBorders>
+              <w:top w:val="single" w:color="888888" w:sz="4"/>
+              <w:left w:val="single" w:color="888888" w:sz="4"/>
+              <w:bottom w:val="single" w:color="888888" w:sz="4"/>
+              <w:right w:val="single" w:color="888888" w:sz="4"/>
+            </w:tcBorders>
+            <w:tcMar>
+              <w:top w:type="dxa" w:w="80"/>
+              <w:left w:type="dxa" w:w="120"/>
+              <w:bottom w:type="dxa" w:w="80"/>
+              <w:right w:type="dxa" w:w="120"/>
+            </w:tcMar>
+          </w:tcPr>
+          <w:p>
+            <w:pPr>
+              <w:jc w:val="center"/>
+            </w:pPr>
+            <w:r>
+              <w:rPr>
+                <w:b w:val="false"/>
+                <w:bCs w:val="false"/>
+                <w:sz w:val="20"/>
+                <w:szCs w:val="20"/>
+              </w:rPr>
+              <w:t xml:space="preserve">25.1 ± 4.2</w:t>
             </w:r>
           </w:p>
         </w:tc>
@@ -2706,7 +2894,7 @@
       <w:tr>
         <w:tc>
           <w:tcPr>
-            <w:tcW w:type="dxa" w:w="1700"/>
+            <w:tcW w:type="dxa" w:w="1500"/>
             <w:tcBorders>
               <w:top w:val="single" w:color="888888" w:sz="4"/>
               <w:left w:val="single" w:color="888888" w:sz="4"/>
@@ -2737,6 +2925,68 @@
         </w:tc>
         <w:tc>
           <w:tcPr>
+            <w:tcW w:type="dxa" w:w="760"/>
+            <w:tcBorders>
+              <w:top w:val="single" w:color="888888" w:sz="4"/>
+              <w:left w:val="single" w:color="888888" w:sz="4"/>
+              <w:bottom w:val="single" w:color="888888" w:sz="4"/>
+              <w:right w:val="single" w:color="888888" w:sz="4"/>
+            </w:tcBorders>
+            <w:tcMar>
+              <w:top w:type="dxa" w:w="80"/>
+              <w:left w:type="dxa" w:w="120"/>
+              <w:bottom w:type="dxa" w:w="80"/>
+              <w:right w:type="dxa" w:w="120"/>
+            </w:tcMar>
+          </w:tcPr>
+          <w:p>
+            <w:pPr>
+              <w:jc w:val="center"/>
+            </w:pPr>
+            <w:r>
+              <w:rPr>
+                <w:b w:val="false"/>
+                <w:bCs w:val="false"/>
+                <w:sz w:val="20"/>
+                <w:szCs w:val="20"/>
+              </w:rPr>
+              <w:t xml:space="preserve">CHN</w:t>
+            </w:r>
+          </w:p>
+        </w:tc>
+        <w:tc>
+          <w:tcPr>
+            <w:tcW w:type="dxa" w:w="760"/>
+            <w:tcBorders>
+              <w:top w:val="single" w:color="888888" w:sz="4"/>
+              <w:left w:val="single" w:color="888888" w:sz="4"/>
+              <w:bottom w:val="single" w:color="888888" w:sz="4"/>
+              <w:right w:val="single" w:color="888888" w:sz="4"/>
+            </w:tcBorders>
+            <w:tcMar>
+              <w:top w:type="dxa" w:w="80"/>
+              <w:left w:type="dxa" w:w="120"/>
+              <w:bottom w:type="dxa" w:w="80"/>
+              <w:right w:type="dxa" w:w="120"/>
+            </w:tcMar>
+          </w:tcPr>
+          <w:p>
+            <w:pPr>
+              <w:jc w:val="center"/>
+            </w:pPr>
+            <w:r>
+              <w:rPr>
+                <w:b w:val="false"/>
+                <w:bCs w:val="false"/>
+                <w:sz w:val="20"/>
+                <w:szCs w:val="20"/>
+              </w:rPr>
+              <w:t xml:space="preserve">128</w:t>
+            </w:r>
+          </w:p>
+        </w:tc>
+        <w:tc>
+          <w:tcPr>
             <w:tcW w:type="dxa" w:w="900"/>
             <w:tcBorders>
               <w:top w:val="single" w:color="888888" w:sz="4"/>
@@ -2762,7 +3012,7 @@
                 <w:sz w:val="20"/>
                 <w:szCs w:val="20"/>
               </w:rPr>
-              <w:t xml:space="preserve">China</w:t>
+              <w:t xml:space="preserve">74</w:t>
             </w:r>
           </w:p>
         </w:tc>
@@ -2793,75 +3043,13 @@
                 <w:sz w:val="20"/>
                 <w:szCs w:val="20"/>
               </w:rPr>
-              <w:t xml:space="preserve">128</w:t>
-            </w:r>
-          </w:p>
-        </w:tc>
-        <w:tc>
-          <w:tcPr>
-            <w:tcW w:type="dxa" w:w="1100"/>
-            <w:tcBorders>
-              <w:top w:val="single" w:color="888888" w:sz="4"/>
-              <w:left w:val="single" w:color="888888" w:sz="4"/>
-              <w:bottom w:val="single" w:color="888888" w:sz="4"/>
-              <w:right w:val="single" w:color="888888" w:sz="4"/>
-            </w:tcBorders>
-            <w:tcMar>
-              <w:top w:type="dxa" w:w="80"/>
-              <w:left w:type="dxa" w:w="120"/>
-              <w:bottom w:type="dxa" w:w="80"/>
-              <w:right w:type="dxa" w:w="120"/>
-            </w:tcMar>
-          </w:tcPr>
-          <w:p>
-            <w:pPr>
-              <w:jc w:val="center"/>
-            </w:pPr>
-            <w:r>
-              <w:rPr>
-                <w:b w:val="false"/>
-                <w:bCs w:val="false"/>
-                <w:sz w:val="20"/>
-                <w:szCs w:val="20"/>
-              </w:rPr>
-              <w:t xml:space="preserve">73</w:t>
-            </w:r>
-          </w:p>
-        </w:tc>
-        <w:tc>
-          <w:tcPr>
-            <w:tcW w:type="dxa" w:w="1100"/>
-            <w:tcBorders>
-              <w:top w:val="single" w:color="888888" w:sz="4"/>
-              <w:left w:val="single" w:color="888888" w:sz="4"/>
-              <w:bottom w:val="single" w:color="888888" w:sz="4"/>
-              <w:right w:val="single" w:color="888888" w:sz="4"/>
-            </w:tcBorders>
-            <w:tcMar>
-              <w:top w:type="dxa" w:w="80"/>
-              <w:left w:type="dxa" w:w="120"/>
-              <w:bottom w:type="dxa" w:w="80"/>
-              <w:right w:type="dxa" w:w="120"/>
-            </w:tcMar>
-          </w:tcPr>
-          <w:p>
-            <w:pPr>
-              <w:jc w:val="center"/>
-            </w:pPr>
-            <w:r>
-              <w:rPr>
-                <w:b w:val="false"/>
-                <w:bCs w:val="false"/>
-                <w:sz w:val="20"/>
-                <w:szCs w:val="20"/>
-              </w:rPr>
-              <w:t xml:space="preserve">55</w:t>
-            </w:r>
-          </w:p>
-        </w:tc>
-        <w:tc>
-          <w:tcPr>
-            <w:tcW w:type="dxa" w:w="1100"/>
+              <w:t xml:space="preserve">54</w:t>
+            </w:r>
+          </w:p>
+        </w:tc>
+        <w:tc>
+          <w:tcPr>
+            <w:tcW w:type="dxa" w:w="1000"/>
             <w:tcBorders>
               <w:top w:val="single" w:color="888888" w:sz="4"/>
               <w:left w:val="single" w:color="888888" w:sz="4"/>
@@ -2892,63 +3080,94 @@
         </w:tc>
         <w:tc>
           <w:tcPr>
-            <w:tcW w:type="dxa" w:w="1100"/>
-            <w:tcBorders>
-              <w:top w:val="single" w:color="888888" w:sz="4"/>
-              <w:left w:val="single" w:color="888888" w:sz="4"/>
-              <w:bottom w:val="single" w:color="888888" w:sz="4"/>
-              <w:right w:val="single" w:color="888888" w:sz="4"/>
-            </w:tcBorders>
-            <w:tcMar>
-              <w:top w:type="dxa" w:w="80"/>
-              <w:left w:type="dxa" w:w="120"/>
-              <w:bottom w:type="dxa" w:w="80"/>
-              <w:right w:type="dxa" w:w="120"/>
-            </w:tcMar>
-          </w:tcPr>
-          <w:p>
-            <w:pPr>
-              <w:jc w:val="center"/>
-            </w:pPr>
-            <w:r>
-              <w:rPr>
-                <w:b w:val="false"/>
-                <w:bCs w:val="false"/>
-                <w:sz w:val="20"/>
-                <w:szCs w:val="20"/>
-              </w:rPr>
-              <w:t xml:space="preserve">47</w:t>
-            </w:r>
-          </w:p>
-        </w:tc>
-        <w:tc>
-          <w:tcPr>
-            <w:tcW w:type="dxa" w:w="1460"/>
-            <w:tcBorders>
-              <w:top w:val="single" w:color="888888" w:sz="4"/>
-              <w:left w:val="single" w:color="888888" w:sz="4"/>
-              <w:bottom w:val="single" w:color="888888" w:sz="4"/>
-              <w:right w:val="single" w:color="888888" w:sz="4"/>
-            </w:tcBorders>
-            <w:tcMar>
-              <w:top w:type="dxa" w:w="80"/>
-              <w:left w:type="dxa" w:w="120"/>
-              <w:bottom w:type="dxa" w:w="80"/>
-              <w:right w:type="dxa" w:w="120"/>
-            </w:tcMar>
-          </w:tcPr>
-          <w:p>
-            <w:pPr>
-              <w:jc w:val="center"/>
-            </w:pPr>
-            <w:r>
-              <w:rPr>
-                <w:b w:val="false"/>
-                <w:bCs w:val="false"/>
-                <w:sz w:val="20"/>
-                <w:szCs w:val="20"/>
-              </w:rPr>
-              <w:t xml:space="preserve">65 (12)</w:t>
+            <w:tcW w:type="dxa" w:w="980"/>
+            <w:tcBorders>
+              <w:top w:val="single" w:color="888888" w:sz="4"/>
+              <w:left w:val="single" w:color="888888" w:sz="4"/>
+              <w:bottom w:val="single" w:color="888888" w:sz="4"/>
+              <w:right w:val="single" w:color="888888" w:sz="4"/>
+            </w:tcBorders>
+            <w:tcMar>
+              <w:top w:type="dxa" w:w="80"/>
+              <w:left w:type="dxa" w:w="120"/>
+              <w:bottom w:type="dxa" w:w="80"/>
+              <w:right w:type="dxa" w:w="120"/>
+            </w:tcMar>
+          </w:tcPr>
+          <w:p>
+            <w:pPr>
+              <w:jc w:val="center"/>
+            </w:pPr>
+            <w:r>
+              <w:rPr>
+                <w:b w:val="false"/>
+                <w:bCs w:val="false"/>
+                <w:sz w:val="20"/>
+                <w:szCs w:val="20"/>
+              </w:rPr>
+              <w:t xml:space="preserve">36.7</w:t>
+            </w:r>
+          </w:p>
+        </w:tc>
+        <w:tc>
+          <w:tcPr>
+            <w:tcW w:type="dxa" w:w="1180"/>
+            <w:tcBorders>
+              <w:top w:val="single" w:color="888888" w:sz="4"/>
+              <w:left w:val="single" w:color="888888" w:sz="4"/>
+              <w:bottom w:val="single" w:color="888888" w:sz="4"/>
+              <w:right w:val="single" w:color="888888" w:sz="4"/>
+            </w:tcBorders>
+            <w:tcMar>
+              <w:top w:type="dxa" w:w="80"/>
+              <w:left w:type="dxa" w:w="120"/>
+              <w:bottom w:type="dxa" w:w="80"/>
+              <w:right w:type="dxa" w:w="120"/>
+            </w:tcMar>
+          </w:tcPr>
+          <w:p>
+            <w:pPr>
+              <w:jc w:val="center"/>
+            </w:pPr>
+            <w:r>
+              <w:rPr>
+                <w:b w:val="false"/>
+                <w:bCs w:val="false"/>
+                <w:sz w:val="20"/>
+                <w:szCs w:val="20"/>
+              </w:rPr>
+              <w:t xml:space="preserve">64.2 ± 9.1</w:t>
+            </w:r>
+          </w:p>
+        </w:tc>
+        <w:tc>
+          <w:tcPr>
+            <w:tcW w:type="dxa" w:w="1380"/>
+            <w:tcBorders>
+              <w:top w:val="single" w:color="888888" w:sz="4"/>
+              <w:left w:val="single" w:color="888888" w:sz="4"/>
+              <w:bottom w:val="single" w:color="888888" w:sz="4"/>
+              <w:right w:val="single" w:color="888888" w:sz="4"/>
+            </w:tcBorders>
+            <w:tcMar>
+              <w:top w:type="dxa" w:w="80"/>
+              <w:left w:type="dxa" w:w="120"/>
+              <w:bottom w:type="dxa" w:w="80"/>
+              <w:right w:type="dxa" w:w="120"/>
+            </w:tcMar>
+          </w:tcPr>
+          <w:p>
+            <w:pPr>
+              <w:jc w:val="center"/>
+            </w:pPr>
+            <w:r>
+              <w:rPr>
+                <w:b w:val="false"/>
+                <w:bCs w:val="false"/>
+                <w:sz w:val="20"/>
+                <w:szCs w:val="20"/>
+              </w:rPr>
+              <w:t xml:space="preserve">23.8 ± 3.1</w:t>
             </w:r>
           </w:p>
         </w:tc>
@@ -2956,7 +3175,7 @@
       <w:tr>
         <w:tc>
           <w:tcPr>
-            <w:tcW w:type="dxa" w:w="1700"/>
+            <w:tcW w:type="dxa" w:w="1500"/>
             <w:tcBorders>
               <w:top w:val="single" w:color="888888" w:sz="4"/>
               <w:left w:val="single" w:color="888888" w:sz="4"/>
@@ -2987,6 +3206,68 @@
         </w:tc>
         <w:tc>
           <w:tcPr>
+            <w:tcW w:type="dxa" w:w="760"/>
+            <w:tcBorders>
+              <w:top w:val="single" w:color="888888" w:sz="4"/>
+              <w:left w:val="single" w:color="888888" w:sz="4"/>
+              <w:bottom w:val="single" w:color="888888" w:sz="4"/>
+              <w:right w:val="single" w:color="888888" w:sz="4"/>
+            </w:tcBorders>
+            <w:tcMar>
+              <w:top w:type="dxa" w:w="80"/>
+              <w:left w:type="dxa" w:w="120"/>
+              <w:bottom w:type="dxa" w:w="80"/>
+              <w:right w:type="dxa" w:w="120"/>
+            </w:tcMar>
+          </w:tcPr>
+          <w:p>
+            <w:pPr>
+              <w:jc w:val="center"/>
+            </w:pPr>
+            <w:r>
+              <w:rPr>
+                <w:b w:val="false"/>
+                <w:bCs w:val="false"/>
+                <w:sz w:val="20"/>
+                <w:szCs w:val="20"/>
+              </w:rPr>
+              <w:t xml:space="preserve">FRA</w:t>
+            </w:r>
+          </w:p>
+        </w:tc>
+        <w:tc>
+          <w:tcPr>
+            <w:tcW w:type="dxa" w:w="760"/>
+            <w:tcBorders>
+              <w:top w:val="single" w:color="888888" w:sz="4"/>
+              <w:left w:val="single" w:color="888888" w:sz="4"/>
+              <w:bottom w:val="single" w:color="888888" w:sz="4"/>
+              <w:right w:val="single" w:color="888888" w:sz="4"/>
+            </w:tcBorders>
+            <w:tcMar>
+              <w:top w:type="dxa" w:w="80"/>
+              <w:left w:type="dxa" w:w="120"/>
+              <w:bottom w:type="dxa" w:w="80"/>
+              <w:right w:type="dxa" w:w="120"/>
+            </w:tcMar>
+          </w:tcPr>
+          <w:p>
+            <w:pPr>
+              <w:jc w:val="center"/>
+            </w:pPr>
+            <w:r>
+              <w:rPr>
+                <w:b w:val="false"/>
+                <w:bCs w:val="false"/>
+                <w:sz w:val="20"/>
+                <w:szCs w:val="20"/>
+              </w:rPr>
+              <w:t xml:space="preserve">156</w:t>
+            </w:r>
+          </w:p>
+        </w:tc>
+        <w:tc>
+          <w:tcPr>
             <w:tcW w:type="dxa" w:w="900"/>
             <w:tcBorders>
               <w:top w:val="single" w:color="888888" w:sz="4"/>
@@ -3012,7 +3293,7 @@
                 <w:sz w:val="20"/>
                 <w:szCs w:val="20"/>
               </w:rPr>
-              <w:t xml:space="preserve">France/Germany</w:t>
+              <w:t xml:space="preserve">53</w:t>
             </w:r>
           </w:p>
         </w:tc>
@@ -3043,162 +3324,131 @@
                 <w:sz w:val="20"/>
                 <w:szCs w:val="20"/>
               </w:rPr>
-              <w:t xml:space="preserve">230</w:t>
-            </w:r>
-          </w:p>
-        </w:tc>
-        <w:tc>
-          <w:tcPr>
-            <w:tcW w:type="dxa" w:w="1100"/>
-            <w:tcBorders>
-              <w:top w:val="single" w:color="888888" w:sz="4"/>
-              <w:left w:val="single" w:color="888888" w:sz="4"/>
-              <w:bottom w:val="single" w:color="888888" w:sz="4"/>
-              <w:right w:val="single" w:color="888888" w:sz="4"/>
-            </w:tcBorders>
-            <w:tcMar>
-              <w:top w:type="dxa" w:w="80"/>
-              <w:left w:type="dxa" w:w="120"/>
-              <w:bottom w:type="dxa" w:w="80"/>
-              <w:right w:type="dxa" w:w="120"/>
-            </w:tcMar>
-          </w:tcPr>
-          <w:p>
-            <w:pPr>
-              <w:jc w:val="center"/>
-            </w:pPr>
-            <w:r>
-              <w:rPr>
-                <w:b w:val="false"/>
-                <w:bCs w:val="false"/>
-                <w:sz w:val="20"/>
-                <w:szCs w:val="20"/>
-              </w:rPr>
-              <w:t xml:space="preserve">54</w:t>
-            </w:r>
-          </w:p>
-        </w:tc>
-        <w:tc>
-          <w:tcPr>
-            <w:tcW w:type="dxa" w:w="1100"/>
-            <w:tcBorders>
-              <w:top w:val="single" w:color="888888" w:sz="4"/>
-              <w:left w:val="single" w:color="888888" w:sz="4"/>
-              <w:bottom w:val="single" w:color="888888" w:sz="4"/>
-              <w:right w:val="single" w:color="888888" w:sz="4"/>
-            </w:tcBorders>
-            <w:tcMar>
-              <w:top w:type="dxa" w:w="80"/>
-              <w:left w:type="dxa" w:w="120"/>
-              <w:bottom w:type="dxa" w:w="80"/>
-              <w:right w:type="dxa" w:w="120"/>
-            </w:tcMar>
-          </w:tcPr>
-          <w:p>
-            <w:pPr>
-              <w:jc w:val="center"/>
-            </w:pPr>
-            <w:r>
-              <w:rPr>
-                <w:b w:val="false"/>
-                <w:bCs w:val="false"/>
-                <w:sz w:val="20"/>
-                <w:szCs w:val="20"/>
-              </w:rPr>
-              <w:t xml:space="preserve">74</w:t>
-            </w:r>
-          </w:p>
-        </w:tc>
-        <w:tc>
-          <w:tcPr>
-            <w:tcW w:type="dxa" w:w="1100"/>
-            <w:tcBorders>
-              <w:top w:val="single" w:color="888888" w:sz="4"/>
-              <w:left w:val="single" w:color="888888" w:sz="4"/>
-              <w:bottom w:val="single" w:color="888888" w:sz="4"/>
-              <w:right w:val="single" w:color="888888" w:sz="4"/>
-            </w:tcBorders>
-            <w:tcMar>
-              <w:top w:type="dxa" w:w="80"/>
-              <w:left w:type="dxa" w:w="120"/>
-              <w:bottom w:type="dxa" w:w="80"/>
-              <w:right w:type="dxa" w:w="120"/>
-            </w:tcMar>
-          </w:tcPr>
-          <w:p>
-            <w:pPr>
-              <w:jc w:val="center"/>
-            </w:pPr>
-            <w:r>
-              <w:rPr>
-                <w:b w:val="false"/>
-                <w:bCs w:val="false"/>
-                <w:sz w:val="20"/>
-                <w:szCs w:val="20"/>
-              </w:rPr>
-              <w:t xml:space="preserve">102</w:t>
-            </w:r>
-          </w:p>
-        </w:tc>
-        <w:tc>
-          <w:tcPr>
-            <w:tcW w:type="dxa" w:w="1100"/>
-            <w:tcBorders>
-              <w:top w:val="single" w:color="888888" w:sz="4"/>
-              <w:left w:val="single" w:color="888888" w:sz="4"/>
-              <w:bottom w:val="single" w:color="888888" w:sz="4"/>
-              <w:right w:val="single" w:color="888888" w:sz="4"/>
-            </w:tcBorders>
-            <w:tcMar>
-              <w:top w:type="dxa" w:w="80"/>
-              <w:left w:type="dxa" w:w="120"/>
-              <w:bottom w:type="dxa" w:w="80"/>
-              <w:right w:type="dxa" w:w="120"/>
-            </w:tcMar>
-          </w:tcPr>
-          <w:p>
-            <w:pPr>
-              <w:jc w:val="center"/>
-            </w:pPr>
-            <w:r>
-              <w:rPr>
-                <w:b w:val="false"/>
-                <w:bCs w:val="false"/>
-                <w:sz w:val="20"/>
-                <w:szCs w:val="20"/>
-              </w:rPr>
-              <w:t xml:space="preserve">47</w:t>
-            </w:r>
-          </w:p>
-        </w:tc>
-        <w:tc>
-          <w:tcPr>
-            <w:tcW w:type="dxa" w:w="1460"/>
-            <w:tcBorders>
-              <w:top w:val="single" w:color="888888" w:sz="4"/>
-              <w:left w:val="single" w:color="888888" w:sz="4"/>
-              <w:bottom w:val="single" w:color="888888" w:sz="4"/>
-              <w:right w:val="single" w:color="888888" w:sz="4"/>
-            </w:tcBorders>
-            <w:tcMar>
-              <w:top w:type="dxa" w:w="80"/>
-              <w:left w:type="dxa" w:w="120"/>
-              <w:bottom w:type="dxa" w:w="80"/>
-              <w:right w:type="dxa" w:w="120"/>
-            </w:tcMar>
-          </w:tcPr>
-          <w:p>
-            <w:pPr>
-              <w:jc w:val="center"/>
-            </w:pPr>
-            <w:r>
-              <w:rPr>
-                <w:b w:val="false"/>
-                <w:bCs w:val="false"/>
-                <w:sz w:val="20"/>
-                <w:szCs w:val="20"/>
-              </w:rPr>
-              <w:t xml:space="preserve">62 (12)</w:t>
+              <w:t xml:space="preserve">61</w:t>
+            </w:r>
+          </w:p>
+        </w:tc>
+        <w:tc>
+          <w:tcPr>
+            <w:tcW w:type="dxa" w:w="1000"/>
+            <w:tcBorders>
+              <w:top w:val="single" w:color="888888" w:sz="4"/>
+              <w:left w:val="single" w:color="888888" w:sz="4"/>
+              <w:bottom w:val="single" w:color="888888" w:sz="4"/>
+              <w:right w:val="single" w:color="888888" w:sz="4"/>
+            </w:tcBorders>
+            <w:tcMar>
+              <w:top w:type="dxa" w:w="80"/>
+              <w:left w:type="dxa" w:w="120"/>
+              <w:bottom w:type="dxa" w:w="80"/>
+              <w:right w:type="dxa" w:w="120"/>
+            </w:tcMar>
+          </w:tcPr>
+          <w:p>
+            <w:pPr>
+              <w:jc w:val="center"/>
+            </w:pPr>
+            <w:r>
+              <w:rPr>
+                <w:b w:val="false"/>
+                <w:bCs w:val="false"/>
+                <w:sz w:val="20"/>
+                <w:szCs w:val="20"/>
+              </w:rPr>
+              <w:t xml:space="preserve">42</w:t>
+            </w:r>
+          </w:p>
+        </w:tc>
+        <w:tc>
+          <w:tcPr>
+            <w:tcW w:type="dxa" w:w="980"/>
+            <w:tcBorders>
+              <w:top w:val="single" w:color="888888" w:sz="4"/>
+              <w:left w:val="single" w:color="888888" w:sz="4"/>
+              <w:bottom w:val="single" w:color="888888" w:sz="4"/>
+              <w:right w:val="single" w:color="888888" w:sz="4"/>
+            </w:tcBorders>
+            <w:tcMar>
+              <w:top w:type="dxa" w:w="80"/>
+              <w:left w:type="dxa" w:w="120"/>
+              <w:bottom w:type="dxa" w:w="80"/>
+              <w:right w:type="dxa" w:w="120"/>
+            </w:tcMar>
+          </w:tcPr>
+          <w:p>
+            <w:pPr>
+              <w:jc w:val="center"/>
+            </w:pPr>
+            <w:r>
+              <w:rPr>
+                <w:b w:val="false"/>
+                <w:bCs w:val="false"/>
+                <w:sz w:val="20"/>
+                <w:szCs w:val="20"/>
+              </w:rPr>
+              <w:t xml:space="preserve">44.2</w:t>
+            </w:r>
+          </w:p>
+        </w:tc>
+        <w:tc>
+          <w:tcPr>
+            <w:tcW w:type="dxa" w:w="1180"/>
+            <w:tcBorders>
+              <w:top w:val="single" w:color="888888" w:sz="4"/>
+              <w:left w:val="single" w:color="888888" w:sz="4"/>
+              <w:bottom w:val="single" w:color="888888" w:sz="4"/>
+              <w:right w:val="single" w:color="888888" w:sz="4"/>
+            </w:tcBorders>
+            <w:tcMar>
+              <w:top w:type="dxa" w:w="80"/>
+              <w:left w:type="dxa" w:w="120"/>
+              <w:bottom w:type="dxa" w:w="80"/>
+              <w:right w:type="dxa" w:w="120"/>
+            </w:tcMar>
+          </w:tcPr>
+          <w:p>
+            <w:pPr>
+              <w:jc w:val="center"/>
+            </w:pPr>
+            <w:r>
+              <w:rPr>
+                <w:b w:val="false"/>
+                <w:bCs w:val="false"/>
+                <w:sz w:val="20"/>
+                <w:szCs w:val="20"/>
+              </w:rPr>
+              <w:t xml:space="preserve">63.3 ± 10.9</w:t>
+            </w:r>
+          </w:p>
+        </w:tc>
+        <w:tc>
+          <w:tcPr>
+            <w:tcW w:type="dxa" w:w="1380"/>
+            <w:tcBorders>
+              <w:top w:val="single" w:color="888888" w:sz="4"/>
+              <w:left w:val="single" w:color="888888" w:sz="4"/>
+              <w:bottom w:val="single" w:color="888888" w:sz="4"/>
+              <w:right w:val="single" w:color="888888" w:sz="4"/>
+            </w:tcBorders>
+            <w:tcMar>
+              <w:top w:type="dxa" w:w="80"/>
+              <w:left w:type="dxa" w:w="120"/>
+              <w:bottom w:type="dxa" w:w="80"/>
+              <w:right w:type="dxa" w:w="120"/>
+            </w:tcMar>
+          </w:tcPr>
+          <w:p>
+            <w:pPr>
+              <w:jc w:val="center"/>
+            </w:pPr>
+            <w:r>
+              <w:rPr>
+                <w:b w:val="false"/>
+                <w:bCs w:val="false"/>
+                <w:sz w:val="20"/>
+                <w:szCs w:val="20"/>
+              </w:rPr>
+              <w:t xml:space="preserve">25.3 ± 4.2</w:t>
             </w:r>
           </w:p>
         </w:tc>
@@ -3206,7 +3456,7 @@
       <w:tr>
         <w:tc>
           <w:tcPr>
-            <w:tcW w:type="dxa" w:w="1700"/>
+            <w:tcW w:type="dxa" w:w="1500"/>
             <w:tcBorders>
               <w:top w:val="single" w:color="888888" w:sz="4"/>
               <w:left w:val="single" w:color="888888" w:sz="4"/>
@@ -3238,7 +3488,7 @@
         </w:tc>
         <w:tc>
           <w:tcPr>
-            <w:tcW w:type="dxa" w:w="900"/>
+            <w:tcW w:type="dxa" w:w="760"/>
             <w:tcBorders>
               <w:top w:val="single" w:color="888888" w:sz="4"/>
               <w:left w:val="single" w:color="888888" w:sz="4"/>
@@ -3270,7 +3520,7 @@
         </w:tc>
         <w:tc>
           <w:tcPr>
-            <w:tcW w:type="dxa" w:w="900"/>
+            <w:tcW w:type="dxa" w:w="760"/>
             <w:tcBorders>
               <w:top w:val="single" w:color="888888" w:sz="4"/>
               <w:left w:val="single" w:color="888888" w:sz="4"/>
@@ -3302,7 +3552,7 @@
         </w:tc>
         <w:tc>
           <w:tcPr>
-            <w:tcW w:type="dxa" w:w="1100"/>
+            <w:tcW w:type="dxa" w:w="900"/>
             <w:tcBorders>
               <w:top w:val="single" w:color="888888" w:sz="4"/>
               <w:left w:val="single" w:color="888888" w:sz="4"/>
@@ -3334,7 +3584,7 @@
         </w:tc>
         <w:tc>
           <w:tcPr>
-            <w:tcW w:type="dxa" w:w="1100"/>
+            <w:tcW w:type="dxa" w:w="900"/>
             <w:tcBorders>
               <w:top w:val="single" w:color="888888" w:sz="4"/>
               <w:left w:val="single" w:color="888888" w:sz="4"/>
@@ -3366,7 +3616,7 @@
         </w:tc>
         <w:tc>
           <w:tcPr>
-            <w:tcW w:type="dxa" w:w="1100"/>
+            <w:tcW w:type="dxa" w:w="1000"/>
             <w:tcBorders>
               <w:top w:val="single" w:color="888888" w:sz="4"/>
               <w:left w:val="single" w:color="888888" w:sz="4"/>
@@ -3398,7 +3648,7 @@
         </w:tc>
         <w:tc>
           <w:tcPr>
-            <w:tcW w:type="dxa" w:w="1100"/>
+            <w:tcW w:type="dxa" w:w="980"/>
             <w:tcBorders>
               <w:top w:val="single" w:color="888888" w:sz="4"/>
               <w:left w:val="single" w:color="888888" w:sz="4"/>
@@ -3424,13 +3674,13 @@
                 <w:sz w:val="20"/>
                 <w:szCs w:val="20"/>
               </w:rPr>
-              <w:t xml:space="preserve">47</w:t>
-            </w:r>
-          </w:p>
-        </w:tc>
-        <w:tc>
-          <w:tcPr>
-            <w:tcW w:type="dxa" w:w="1460"/>
+              <w:t xml:space="preserve">39.0</w:t>
+            </w:r>
+          </w:p>
+        </w:tc>
+        <w:tc>
+          <w:tcPr>
+            <w:tcW w:type="dxa" w:w="1180"/>
             <w:tcBorders>
               <w:top w:val="single" w:color="888888" w:sz="4"/>
               <w:left w:val="single" w:color="888888" w:sz="4"/>
@@ -3456,7 +3706,39 @@
                 <w:sz w:val="20"/>
                 <w:szCs w:val="20"/>
               </w:rPr>
-              <w:t xml:space="preserve">63 (11)</w:t>
+              <w:t xml:space="preserve">63.8 ± 10.5</w:t>
+            </w:r>
+          </w:p>
+        </w:tc>
+        <w:tc>
+          <w:tcPr>
+            <w:tcW w:type="dxa" w:w="1380"/>
+            <w:tcBorders>
+              <w:top w:val="single" w:color="888888" w:sz="4"/>
+              <w:left w:val="single" w:color="888888" w:sz="4"/>
+              <w:bottom w:val="single" w:color="888888" w:sz="4"/>
+              <w:right w:val="single" w:color="888888" w:sz="4"/>
+            </w:tcBorders>
+            <w:shd w:fill="F5F5F5" w:val="clear"/>
+            <w:tcMar>
+              <w:top w:type="dxa" w:w="80"/>
+              <w:left w:type="dxa" w:w="120"/>
+              <w:bottom w:type="dxa" w:w="80"/>
+              <w:right w:type="dxa" w:w="120"/>
+            </w:tcMar>
+          </w:tcPr>
+          <w:p>
+            <w:pPr>
+              <w:jc w:val="center"/>
+            </w:pPr>
+            <w:r>
+              <w:rPr>
+                <w:b/>
+                <w:bCs/>
+                <w:sz w:val="20"/>
+                <w:szCs w:val="20"/>
+              </w:rPr>
+              <w:t xml:space="preserve">25.2 ± 4.1</w:t>
             </w:r>
           </w:p>
         </w:tc>

</xml_diff>

<commit_message>
Fix three stale '0.777 to 0.841' instances missed in earlier docx pass; refresh deterministic CSVs from E2E rerun
</commit_message>
<xml_diff>
--- a/manuscript/CRC_Manuscript_Complete.docx
+++ b/manuscript/CRC_Manuscript_Complete.docx
@@ -263,7 +263,7 @@
           <w:b w:val="0"/>
           <w:i w:val="0"/>
         </w:rPr>
-        <w:t xml:space="preserve">Species-only Random Forest achieved a pooled LODO AUC of 0.810 (95% CI: 0.777 to 0.841) and significantly outperformed both joint Random Forest (0.776 [0.740, 0.811]; DeLong z = 2.88, p = 0.004) and joint XGBoost (0.781 [0.746, 0.816]; z = 2.65, p = 0.008). The joint models did not differ from each other (p = 0.60). Performance was stable across five RNG seeds (mean 0.804 +/- 0.002) and across a 20-cell pathway filter sensitivity grid (joint RF range 0.773 to 0.811 across all 20 cells; 0.773 to 0.789 across the 16 non-degenerate cells). Including age, sex, and BMI as covariates or residualizing on them yielded LODO AUCs of 0.807 to 0.816, indicating the species signal is not driven by these confounders. The top species contributors by SHAP were </w:t>
+        <w:t xml:space="preserve">Species-only Random Forest achieved a pooled LODO AUC of 0.810 (95% CI: 0.776 to 0.841) and significantly outperformed both joint Random Forest (0.776 [0.740, 0.811]; DeLong z = 2.88, p = 0.004) and joint XGBoost (0.781 [0.746, 0.816]; z = 2.65, p = 0.008). The joint models did not differ from each other (p = 0.60). Performance was stable across five RNG seeds (mean 0.804 +/- 0.002) and across a 20-cell pathway filter sensitivity grid (joint RF range 0.773 to 0.811 across all 20 cells; 0.773 to 0.789 across the 16 non-degenerate cells). Including age, sex, and BMI as covariates or residualizing on them yielded LODO AUCs of 0.807 to 0.816, indicating the species signal is not driven by these confounders. The top species contributors by SHAP were </w:t>
       </w:r>
       <w:r>
         <w:rPr>
@@ -690,7 +690,7 @@
           <w:sz w:val="22"/>
           <w:szCs w:val="22"/>
         </w:rPr>
-        <w:t xml:space="preserve">The species-only Random Forest classifier achieved a pooled LODO AUC of 0.810 (95% CI: 0.777 to 0.841) on the 646 binary samples, with per-cohort AUCs ranging from 0.730 (VogtmannE_2016) to 0.868 (YuJ_2015) and a mean per-cohort AUC of 0.803 ± 0.048 (Figure 1, Supplementary Table S2). This reproduces the AUC ~0.80 reported by Thomas et al. (2019) on a similar species feature set across five cohorts and confirms that the species-level CRC signal generalizes across studies.</w:t>
+        <w:t>The species-only Random Forest classifier achieved a pooled LODO AUC of 0.810 (95% CI: 0.776 to 0.841) on the 646 binary samples, with per-cohort AUCs ranging from 0.730 (VogtmannE_2016) to 0.868 (YuJ_2015) and a mean per-cohort AUC of 0.803 ± 0.048 (Figure 1, Supplementary Table S2). This reproduces the AUC ~0.80 reported by Thomas et al. (2019) on a similar species feature set across five cohorts and confirms that the species-level CRC signal generalizes across studies.</w:t>
       </w:r>
     </w:p>
     <w:p>

</xml_diff>

<commit_message>
Deeper audit: refresh Sup Table S1 from current CSV; add 10 missing in-text citations (Beghini, Pasolli, Lundberg, Chen, Breiman, Feng, Yachida, Vogtmann, Yu, Zeller); remove uncited Korem reference (refs renumbered to 14); add figure1_forest_plot.py and figure5_shap_three_panel.py to REPRODUCING.md
</commit_message>
<xml_diff>
--- a/manuscript/CRC_Manuscript_Complete.docx
+++ b/manuscript/CRC_Manuscript_Complete.docx
@@ -461,7 +461,7 @@
           <w:sz w:val="22"/>
           <w:szCs w:val="22"/>
         </w:rPr>
-        <w:t xml:space="preserve">All metagenomic data were obtained from curatedMetagenomicData (Bioconductor package; version recorded in the repository's session_info.txt and provenance directory). We retained the seven publicly available stool CRC case-control cohorts used by Thomas et al. (2019): FengQ_2015 (Austria), ThomasAM_2018a (Italy), ThomasAM_2018b (Italy), ThomasAM_2019_c (Japan), VogtmannE_2016 (USA), YuJ_2015 (China), and ZellerG_2014 (France), spanning six countries across three continents. Subjects in study_condition categories of CRC, adenoma, or control were retained. After deduplication on subject ID, the cohort comprised 762 unique subjects. Cross-cohort overlap was audited (audit_subject_ids.R): no subject appears in more than one cohort and no subject has multiple samples.</w:t>
+        <w:t>All metagenomic data were obtained from curatedMetagenomicData (Pasolli et al., 2017; Bioconductor package; version recorded in the repository's session_info.txt and provenance directory). We retained the seven publicly available stool CRC case-control cohorts used by Thomas et al. (2019): FengQ_2015 (Austria; Feng et al., 2015), ThomasAM_2018a (Italy), ThomasAM_2018b (Italy), ThomasAM_2019_c (Japan; Yachida et al., 2019), VogtmannE_2016 (USA; Vogtmann et al., 2016), YuJ_2015 (China; Yu et al., 2017), and ZellerG_2014 (France; Zeller et al., 2014), spanning six countries across three continents. Subjects in study_condition categories of CRC, adenoma, or control were retained. After deduplication on subject ID, the cohort comprised 762 unique subjects. Cross-cohort overlap was audited (audit_subject_ids.R): no subject appears in more than one cohort and no subject has multiple samples.</w:t>
       </w:r>
     </w:p>
     <w:p>
@@ -489,7 +489,7 @@
           <w:sz w:val="22"/>
           <w:szCs w:val="22"/>
         </w:rPr>
-        <w:t xml:space="preserve">Species-level relative abundances were generated by MetaPhlAn under curatedMetagenomicData's standard pipeline. Species features were filtered at prevalence &gt;= 10% and mean relative abundance &gt;= 1e-4 across the full cohort (preprocessing.py), yielding 247 retained species. Filtered abundances were renormalized to sum to one per sample if the row sum exceeded 1.5, then transformed by log10(x + 1e-6) to stabilize variance for the small subset of analyses that benefit from approximate normality (this transform does not affect tree-split decisions for Random Forest or XGBoost). The species filter is applied globally rather than per-fold because species composition is structurally stable across cohorts under MetaPhlAn's fixed reference database, the feature count is small, and Thomas et al. (2019) and Piccinno et al. (2025) both apply species filtering globally.</w:t>
+        <w:t>Species-level relative abundances were generated by MetaPhlAn under curatedMetagenomicData's standard pipeline (Beghini et al., 2021). Species features were filtered at prevalence &gt;= 10% and mean relative abundance &gt;= 1e-4 across the full cohort (preprocessing.py), yielding 247 retained species. Filtered abundances were renormalized to sum to one per sample if the row sum exceeded 1.5, then transformed by log10(x + 1e-6) to stabilize variance for the small subset of analyses that benefit from approximate normality (this transform does not affect tree-split decisions for Random Forest or XGBoost). The species filter is applied globally rather than per-fold because species composition is structurally stable across cohorts under MetaPhlAn's fixed reference database, the feature count is small, and Thomas et al. (2019) and Piccinno et al. (2025) both apply species filtering globally.</w:t>
       </w:r>
     </w:p>
     <w:p>
@@ -530,7 +530,7 @@
           <w:sz w:val="22"/>
           <w:szCs w:val="22"/>
         </w:rPr>
-        <w:t xml:space="preserve">We trained three classifiers under LODO cross-validation. The species-only baseline uses 247 species features with a Random Forest of 500 trees, max_features = sqrt(p), min_samples_leaf = 5, class_weight = balanced, random_state = 42 (train_baseline.py). The joint Random Forest adds the per-fold-filtered unstratified pathway features under identical hyperparameters. The joint XGBoost classifier uses 500 estimators, max_depth = 6, learning_rate = 0.1, subsample = 0.8, colsample_bytree = 0.8, eval_metric = logloss, random_state = 42 on the same per-fold-filtered joint feature matrix (train_joint.py). Adenoma classification (healthy versus adenoma; adenoma versus CRC) is treated as exploratory and reported separately under both 5-fold within-cohort cross-validation (train_adenoma.py) and LODO cross-validation (adenoma_lodo.py).</w:t>
+        <w:t>We trained three classifiers under LODO cross-validation. The species-only baseline uses 247 species features with a Random Forest (Breiman, 2001) of 500 trees, max_features = sqrt(p), min_samples_leaf = 5, class_weight = balanced, random_state = 42 (train_baseline.py). The joint Random Forest adds the per-fold-filtered unstratified pathway features under identical hyperparameters. The joint XGBoost (Chen and Guestrin, 2016) classifier uses 500 estimators, max_depth = 6, learning_rate = 0.1, subsample = 0.8, colsample_bytree = 0.8, eval_metric = logloss, random_state = 42 on the same per-fold-filtered joint feature matrix (train_joint.py). Adenoma classification (healthy versus adenoma; adenoma versus CRC) is treated as exploratory and reported separately under both 5-fold within-cohort cross-validation (train_adenoma.py) and LODO cross-validation (adenoma_lodo.py).</w:t>
       </w:r>
     </w:p>
     <w:p>
@@ -586,7 +586,7 @@
           <w:sz w:val="22"/>
           <w:szCs w:val="22"/>
         </w:rPr>
-        <w:t xml:space="preserve">We computed 95% bootstrap confidence intervals for every per-cohort and pooled AUC using 10,000 stratified resamples (bootstrap_ci.py, results in Supplementary Table S2). We assessed seed stability by re-running the species RF baseline at random_state values of 0, 1, 2, 42, and 100 (seed_sensitivity.py). We assessed pathway filter sensitivity across a 4-by-5 grid of prevalence thresholds (0.05, 0.10, 0.15, 0.20) and mean-abundance thresholds (1e-7, 1e-6, 1e-5, 1e-4, 1e-3), reporting mean per-cohort AUC for each cell (sensitivity_analysis.py, results in Supplementary Table S1). We assessed cross-study batch effect sensitivity by applying empirical Bayes batch correction (ComBat) with cohort as the batch variable before LODO classification (batch_correction.py). We assessed confounder robustness by two strategies: direct inclusion of age, sex, and BMI as additional features in the classifier, and residualization of species log-abundances on age + sex + BMI before classification (confounder_adjustment.py). Feature importance was computed via TreeSHAP for both Random Forest and XGBoost (shap_analysis.py, shap_xgb.py).</w:t>
+        <w:t>We computed 95% bootstrap confidence intervals for every per-cohort and pooled AUC using 10,000 stratified resamples (bootstrap_ci.py, results in Supplementary Table S2). We assessed seed stability by re-running the species RF baseline at random_state values of 0, 1, 2, 42, and 100 (seed_sensitivity.py). We assessed pathway filter sensitivity across a 4-by-5 grid of prevalence thresholds (0.05, 0.10, 0.15, 0.20) and mean-abundance thresholds (1e-7, 1e-6, 1e-5, 1e-4, 1e-3), reporting mean per-cohort AUC for each cell (sensitivity_analysis.py, results in Supplementary Table S1). We assessed cross-study batch effect sensitivity by applying empirical Bayes batch correction (ComBat) with cohort as the batch variable before LODO classification (batch_correction.py). We assessed confounder robustness by two strategies: direct inclusion of age, sex, and BMI as additional features in the classifier, and residualization of species log-abundances on age + sex + BMI before classification (confounder_adjustment.py). Feature importance was computed via TreeSHAP (Lundberg and Lee, 2017) for both Random Forest and XGBoost (shap_analysis.py, shap_xgb.py).</w:t>
       </w:r>
     </w:p>
     <w:p>
@@ -1025,7 +1025,7 @@
           <w:sz w:val="20"/>
           <w:szCs w:val="20"/>
         </w:rPr>
-        <w:t xml:space="preserve">2. Korem, T., et al. (2023). SCRuB: improving cancer phenotype prediction from microbiome data by modeling contamination sources. Nature Biotechnology. https://doi.org/10.1038/s41587-023-01696-w</w:t>
+        <w:t>2. Pasolli, E., Schiffer, L., Manghi, P., et al. (2017). Accessible, curated metagenomic data through ExperimentHub. Nature Methods 14, 1023-1024. https://doi.org/10.1038/nmeth.4468</w:t>
       </w:r>
     </w:p>
     <w:p>
@@ -1039,7 +1039,7 @@
           <w:sz w:val="20"/>
           <w:szCs w:val="20"/>
         </w:rPr>
-        <w:t xml:space="preserve">3. Pasolli, E., Schiffer, L., Manghi, P., et al. (2017). Accessible, curated metagenomic data through ExperimentHub. Nature Methods 14, 1023-1024. https://doi.org/10.1038/nmeth.4468</w:t>
+        <w:t>3. Piccinno, G., Asnicar, F., Manghi, P., et al. (2025). Pooled analysis of 3,741 stool metagenomes from 18 cohorts identifies reproducible CRC-associated species- and strain-level signatures. Nature Medicine. https://doi.org/10.1038/s41591-025-03693-9</w:t>
       </w:r>
     </w:p>
     <w:p>
@@ -1053,7 +1053,7 @@
           <w:sz w:val="20"/>
           <w:szCs w:val="20"/>
         </w:rPr>
-        <w:t xml:space="preserve">4. Piccinno, G., Asnicar, F., Manghi, P., et al. (2025). Pooled analysis of 3,741 stool metagenomes from 18 cohorts identifies reproducible CRC-associated species- and strain-level signatures. Nature Medicine. https://doi.org/10.1038/s41591-025-03693-9</w:t>
+        <w:t>4. Sun, X. and Xu, W. (2014). Fast implementation of DeLong's algorithm for comparing the areas under correlated receiver operating characteristic curves. IEEE Signal Processing Letters 21(11), 1389-1393.</w:t>
       </w:r>
     </w:p>
     <w:p>
@@ -1067,7 +1067,7 @@
           <w:sz w:val="20"/>
           <w:szCs w:val="20"/>
         </w:rPr>
-        <w:t xml:space="preserve">5. Sun, X. and Xu, W. (2014). Fast implementation of DeLong's algorithm for comparing the areas under correlated receiver operating characteristic curves. IEEE Signal Processing Letters 21(11), 1389-1393.</w:t>
+        <w:t>5. Thomas, A.M., Manghi, P., Asnicar, F., et al. (2019). Metagenomic analysis of colorectal cancer datasets identifies cross-cohort microbial diagnostic signatures and a link with choline degradation. Nature Medicine 25, 667-678. https://doi.org/10.1038/s41591-019-0405-7</w:t>
       </w:r>
     </w:p>
     <w:p>
@@ -1081,7 +1081,7 @@
           <w:sz w:val="20"/>
           <w:szCs w:val="20"/>
         </w:rPr>
-        <w:t xml:space="preserve">6. Thomas, A.M., Manghi, P., Asnicar, F., et al. (2019). Metagenomic analysis of colorectal cancer datasets identifies cross-cohort microbial diagnostic signatures and a link with choline degradation. Nature Medicine 25, 667-678. https://doi.org/10.1038/s41591-019-0405-7</w:t>
+        <w:t>6. Yachida, S., Mizutani, S., Shiroma, H., et al. (2019). Metagenomic and metabolomic analyses reveal distinct stage-specific phenotypes of the gut microbiota in colorectal cancer. Nature Medicine 25, 968-976.</w:t>
       </w:r>
     </w:p>
     <w:p>
@@ -1095,7 +1095,7 @@
           <w:sz w:val="20"/>
           <w:szCs w:val="20"/>
         </w:rPr>
-        <w:t xml:space="preserve">7. Yachida, S., Mizutani, S., Shiroma, H., et al. (2019). Metagenomic and metabolomic analyses reveal distinct stage-specific phenotypes of the gut microbiota in colorectal cancer. Nature Medicine 25, 968-976.</w:t>
+        <w:t>7. Zeller, G., Tap, J., Voigt, A.Y., et al. (2014). Potential of fecal microbiota for early-stage detection of colorectal cancer. Molecular Systems Biology 10(11), 766. https://doi.org/10.15252/msb.20145645</w:t>
       </w:r>
     </w:p>
     <w:p>
@@ -1109,7 +1109,7 @@
           <w:sz w:val="20"/>
           <w:szCs w:val="20"/>
         </w:rPr>
-        <w:t xml:space="preserve">8. Zeller, G., Tap, J., Voigt, A.Y., et al. (2014). Potential of fecal microbiota for early-stage detection of colorectal cancer. Molecular Systems Biology 10(11), 766. https://doi.org/10.15252/msb.20145645</w:t>
+        <w:t>8. Feng, Q., Liang, S., Jia, H., et al. (2015). Gut microbiome development along the colorectal adenoma-carcinoma sequence. Nature Communications 6, 6528.</w:t>
       </w:r>
     </w:p>
     <w:p>
@@ -1123,7 +1123,7 @@
           <w:sz w:val="20"/>
           <w:szCs w:val="20"/>
         </w:rPr>
-        <w:t xml:space="preserve">9. Feng, Q., Liang, S., Jia, H., et al. (2015). Gut microbiome development along the colorectal adenoma-carcinoma sequence. Nature Communications 6, 6528.</w:t>
+        <w:t>9. Yu, J., Feng, Q., Wong, S.H., et al. (2017). Metagenomic analysis of faecal microbiome as a tool towards targeted non-invasive biomarkers for colorectal cancer. Gut 66, 70-78.</w:t>
       </w:r>
     </w:p>
     <w:p>
@@ -1137,7 +1137,7 @@
           <w:sz w:val="20"/>
           <w:szCs w:val="20"/>
         </w:rPr>
-        <w:t xml:space="preserve">10. Yu, J., Feng, Q., Wong, S.H., et al. (2017). Metagenomic analysis of faecal microbiome as a tool towards targeted non-invasive biomarkers for colorectal cancer. Gut 66, 70-78.</w:t>
+        <w:t>10. Vogtmann, E., Hua, X., Zeller, G., et al. (2016). Colorectal cancer and the human gut microbiome: reproducibility with whole-genome shotgun sequencing. PLoS ONE 11(5), e0155362.</w:t>
       </w:r>
     </w:p>
     <w:p>
@@ -1151,7 +1151,7 @@
           <w:sz w:val="20"/>
           <w:szCs w:val="20"/>
         </w:rPr>
-        <w:t xml:space="preserve">11. Vogtmann, E., Hua, X., Zeller, G., et al. (2016). Colorectal cancer and the human gut microbiome: reproducibility with whole-genome shotgun sequencing. PLoS ONE 11(5), e0155362.</w:t>
+        <w:t>11. Beghini, F., McIver, L.J., Blanco-Miguez, A., et al. (2021). Integrating taxonomic, functional, and strain-level profiling of diverse microbial communities with bioBakery 3. eLife 10, e65088. (MetaPhlAn / HUMAnN reference)</w:t>
       </w:r>
     </w:p>
     <w:p>
@@ -1165,7 +1165,7 @@
           <w:sz w:val="20"/>
           <w:szCs w:val="20"/>
         </w:rPr>
-        <w:t xml:space="preserve">12. Beghini, F., McIver, L.J., Blanco-Miguez, A., et al. (2021). Integrating taxonomic, functional, and strain-level profiling of diverse microbial communities with bioBakery 3. eLife 10, e65088. (MetaPhlAn / HUMAnN reference)</w:t>
+        <w:t>12. Lundberg, S.M. and Lee, S.I. (2017). A unified approach to interpreting model predictions. Advances in Neural Information Processing Systems 30. (SHAP reference)</w:t>
       </w:r>
     </w:p>
     <w:p>
@@ -1179,7 +1179,7 @@
           <w:sz w:val="20"/>
           <w:szCs w:val="20"/>
         </w:rPr>
-        <w:t xml:space="preserve">13. Lundberg, S.M. and Lee, S.I. (2017). A unified approach to interpreting model predictions. Advances in Neural Information Processing Systems 30. (SHAP reference)</w:t>
+        <w:t>13. Chen, T. and Guestrin, C. (2016). XGBoost: a scalable tree boosting system. KDD 2016, 785-794.</w:t>
       </w:r>
     </w:p>
     <w:p>
@@ -1193,21 +1193,7 @@
           <w:sz w:val="20"/>
           <w:szCs w:val="20"/>
         </w:rPr>
-        <w:t xml:space="preserve">14. Chen, T. and Guestrin, C. (2016). XGBoost: a scalable tree boosting system. KDD 2016, 785-794.</w:t>
-      </w:r>
-    </w:p>
-    <w:p>
-      <w:pPr>
-        <w:spacing w:after="100" w:line="280"/>
-        <w:ind w:left="360" w:hanging="360"/>
-        <w:jc w:val="both"/>
-      </w:pPr>
-      <w:r>
-        <w:rPr>
-          <w:sz w:val="20"/>
-          <w:szCs w:val="20"/>
-        </w:rPr>
-        <w:t xml:space="preserve">15. Breiman, L. (2001). Random forests. Machine Learning 45, 5-32.</w:t>
+        <w:t>14. Breiman, L. (2001). Random forests. Machine Learning 45, 5-32.</w:t>
       </w:r>
     </w:p>
     <w:p>
@@ -4209,7 +4195,7 @@
                 <w:sz w:val="20"/>
                 <w:szCs w:val="20"/>
               </w:rPr>
-              <w:t xml:space="preserve">&gt;= 0.05</w:t>
+              <w:t>&gt;= 0.05</w:t>
             </w:r>
           </w:p>
         </w:tc>
@@ -4240,7 +4226,7 @@
                 <w:sz w:val="20"/>
                 <w:szCs w:val="20"/>
               </w:rPr>
-              <w:t xml:space="preserve">&gt;= 1e-7</w:t>
+              <w:t>&gt;= 1e-7</w:t>
             </w:r>
           </w:p>
         </w:tc>
@@ -4271,7 +4257,7 @@
                 <w:sz w:val="20"/>
                 <w:szCs w:val="20"/>
               </w:rPr>
-              <w:t xml:space="preserve">438</w:t>
+              <w:t>439</w:t>
             </w:r>
           </w:p>
         </w:tc>
@@ -4302,7 +4288,7 @@
                 <w:sz w:val="20"/>
                 <w:szCs w:val="20"/>
               </w:rPr>
-              <w:t xml:space="preserve">685</w:t>
+              <w:t>686</w:t>
             </w:r>
           </w:p>
         </w:tc>
@@ -4333,7 +4319,7 @@
                 <w:sz w:val="20"/>
                 <w:szCs w:val="20"/>
               </w:rPr>
-              <w:t xml:space="preserve">0.790</w:t>
+              <w:t>0.785</w:t>
             </w:r>
           </w:p>
         </w:tc>
@@ -4364,7 +4350,7 @@
                 <w:sz w:val="20"/>
                 <w:szCs w:val="20"/>
               </w:rPr>
-              <w:t xml:space="preserve">0.036</w:t>
+              <w:t>0.039</w:t>
             </w:r>
           </w:p>
         </w:tc>
@@ -4397,7 +4383,7 @@
                 <w:sz w:val="20"/>
                 <w:szCs w:val="20"/>
               </w:rPr>
-              <w:t xml:space="preserve">&gt;= 0.05</w:t>
+              <w:t>&gt;= 0.05</w:t>
             </w:r>
           </w:p>
         </w:tc>
@@ -4428,7 +4414,7 @@
                 <w:sz w:val="20"/>
                 <w:szCs w:val="20"/>
               </w:rPr>
-              <w:t xml:space="preserve">&gt;= 1e-6</w:t>
+              <w:t>&gt;= 1e-6</w:t>
             </w:r>
           </w:p>
         </w:tc>
@@ -4459,7 +4445,7 @@
                 <w:sz w:val="20"/>
                 <w:szCs w:val="20"/>
               </w:rPr>
-              <w:t xml:space="preserve">407</w:t>
+              <w:t>406</w:t>
             </w:r>
           </w:p>
         </w:tc>
@@ -4490,7 +4476,7 @@
                 <w:sz w:val="20"/>
                 <w:szCs w:val="20"/>
               </w:rPr>
-              <w:t xml:space="preserve">654</w:t>
+              <w:t>653</w:t>
             </w:r>
           </w:p>
         </w:tc>
@@ -4521,7 +4507,7 @@
                 <w:sz w:val="20"/>
                 <w:szCs w:val="20"/>
               </w:rPr>
-              <w:t xml:space="preserve">0.781</w:t>
+              <w:t>0.789</w:t>
             </w:r>
           </w:p>
         </w:tc>
@@ -4552,7 +4538,7 @@
                 <w:sz w:val="20"/>
                 <w:szCs w:val="20"/>
               </w:rPr>
-              <w:t xml:space="preserve">0.036</w:t>
+              <w:t>0.044</w:t>
             </w:r>
           </w:p>
         </w:tc>
@@ -4585,7 +4571,7 @@
                 <w:sz w:val="20"/>
                 <w:szCs w:val="20"/>
               </w:rPr>
-              <w:t xml:space="preserve">&gt;= 0.05</w:t>
+              <w:t>&gt;= 0.05</w:t>
             </w:r>
           </w:p>
         </w:tc>
@@ -4616,7 +4602,7 @@
                 <w:sz w:val="20"/>
                 <w:szCs w:val="20"/>
               </w:rPr>
-              <w:t xml:space="preserve">&gt;= 1e-5</w:t>
+              <w:t>&gt;= 1e-5</w:t>
             </w:r>
           </w:p>
         </w:tc>
@@ -4647,7 +4633,7 @@
                 <w:sz w:val="20"/>
                 <w:szCs w:val="20"/>
               </w:rPr>
-              <w:t xml:space="preserve">316</w:t>
+              <w:t>315</w:t>
             </w:r>
           </w:p>
         </w:tc>
@@ -4678,7 +4664,7 @@
                 <w:sz w:val="20"/>
                 <w:szCs w:val="20"/>
               </w:rPr>
-              <w:t xml:space="preserve">563</w:t>
+              <w:t>562</w:t>
             </w:r>
           </w:p>
         </w:tc>
@@ -4709,7 +4695,7 @@
                 <w:sz w:val="20"/>
                 <w:szCs w:val="20"/>
               </w:rPr>
-              <w:t xml:space="preserve">0.777</w:t>
+              <w:t>0.773</w:t>
             </w:r>
           </w:p>
         </w:tc>
@@ -4740,7 +4726,7 @@
                 <w:sz w:val="20"/>
                 <w:szCs w:val="20"/>
               </w:rPr>
-              <w:t xml:space="preserve">0.038</w:t>
+              <w:t>0.033</w:t>
             </w:r>
           </w:p>
         </w:tc>
@@ -4773,7 +4759,7 @@
                 <w:sz w:val="20"/>
                 <w:szCs w:val="20"/>
               </w:rPr>
-              <w:t xml:space="preserve">&gt;= 0.05</w:t>
+              <w:t>&gt;= 0.05</w:t>
             </w:r>
           </w:p>
         </w:tc>
@@ -4804,7 +4790,7 @@
                 <w:sz w:val="20"/>
                 <w:szCs w:val="20"/>
               </w:rPr>
-              <w:t xml:space="preserve">&gt;= 1e-4</w:t>
+              <w:t>&gt;= 1e-4</w:t>
             </w:r>
           </w:p>
         </w:tc>
@@ -4835,7 +4821,7 @@
                 <w:sz w:val="20"/>
                 <w:szCs w:val="20"/>
               </w:rPr>
-              <w:t xml:space="preserve">145</w:t>
+              <w:t>147</w:t>
             </w:r>
           </w:p>
         </w:tc>
@@ -4866,7 +4852,7 @@
                 <w:sz w:val="20"/>
                 <w:szCs w:val="20"/>
               </w:rPr>
-              <w:t xml:space="preserve">392</w:t>
+              <w:t>394</w:t>
             </w:r>
           </w:p>
         </w:tc>
@@ -4897,7 +4883,7 @@
                 <w:sz w:val="20"/>
                 <w:szCs w:val="20"/>
               </w:rPr>
-              <w:t xml:space="preserve">0.788</w:t>
+              <w:t>0.783</w:t>
             </w:r>
           </w:p>
         </w:tc>
@@ -4928,7 +4914,7 @@
                 <w:sz w:val="20"/>
                 <w:szCs w:val="20"/>
               </w:rPr>
-              <w:t xml:space="preserve">0.034</w:t>
+              <w:t>0.037</w:t>
             </w:r>
           </w:p>
         </w:tc>
@@ -4961,7 +4947,7 @@
                 <w:sz w:val="20"/>
                 <w:szCs w:val="20"/>
               </w:rPr>
-              <w:t xml:space="preserve">&gt;= 0.05</w:t>
+              <w:t>&gt;= 0.05</w:t>
             </w:r>
           </w:p>
         </w:tc>
@@ -4992,7 +4978,7 @@
                 <w:sz w:val="20"/>
                 <w:szCs w:val="20"/>
               </w:rPr>
-              <w:t xml:space="preserve">&gt;= 1e-3</w:t>
+              <w:t>&gt;= 1e-3</w:t>
             </w:r>
           </w:p>
         </w:tc>
@@ -5023,7 +5009,7 @@
                 <w:sz w:val="20"/>
                 <w:szCs w:val="20"/>
               </w:rPr>
-              <w:t xml:space="preserve">2</w:t>
+              <w:t>2</w:t>
             </w:r>
           </w:p>
         </w:tc>
@@ -5054,7 +5040,7 @@
                 <w:sz w:val="20"/>
                 <w:szCs w:val="20"/>
               </w:rPr>
-              <w:t xml:space="preserve">249</w:t>
+              <w:t>249</w:t>
             </w:r>
           </w:p>
         </w:tc>
@@ -5085,7 +5071,7 @@
                 <w:sz w:val="20"/>
                 <w:szCs w:val="20"/>
               </w:rPr>
-              <w:t xml:space="preserve">0.811</w:t>
+              <w:t>0.811</w:t>
             </w:r>
           </w:p>
         </w:tc>
@@ -5116,7 +5102,7 @@
                 <w:sz w:val="20"/>
                 <w:szCs w:val="20"/>
               </w:rPr>
-              <w:t xml:space="preserve">0.045</w:t>
+              <w:t>0.045</w:t>
             </w:r>
           </w:p>
         </w:tc>
@@ -5149,7 +5135,7 @@
                 <w:sz w:val="20"/>
                 <w:szCs w:val="20"/>
               </w:rPr>
-              <w:t xml:space="preserve">&gt;= 0.10</w:t>
+              <w:t>&gt;= 0.1</w:t>
             </w:r>
           </w:p>
         </w:tc>
@@ -5180,7 +5166,7 @@
                 <w:sz w:val="20"/>
                 <w:szCs w:val="20"/>
               </w:rPr>
-              <w:t xml:space="preserve">&gt;= 1e-7</w:t>
+              <w:t>&gt;= 1e-7</w:t>
             </w:r>
           </w:p>
         </w:tc>
@@ -5211,7 +5197,7 @@
                 <w:sz w:val="20"/>
                 <w:szCs w:val="20"/>
               </w:rPr>
-              <w:t xml:space="preserve">427</w:t>
+              <w:t>427</w:t>
             </w:r>
           </w:p>
         </w:tc>
@@ -5242,7 +5228,7 @@
                 <w:sz w:val="20"/>
                 <w:szCs w:val="20"/>
               </w:rPr>
-              <w:t xml:space="preserve">674</w:t>
+              <w:t>674</w:t>
             </w:r>
           </w:p>
         </w:tc>
@@ -5273,7 +5259,7 @@
                 <w:sz w:val="20"/>
                 <w:szCs w:val="20"/>
               </w:rPr>
-              <w:t xml:space="preserve">0.783</w:t>
+              <w:t>0.786</w:t>
             </w:r>
           </w:p>
         </w:tc>
@@ -5304,7 +5290,7 @@
                 <w:sz w:val="20"/>
                 <w:szCs w:val="20"/>
               </w:rPr>
-              <w:t xml:space="preserve">0.040</w:t>
+              <w:t>0.041</w:t>
             </w:r>
           </w:p>
         </w:tc>
@@ -5337,7 +5323,7 @@
                 <w:sz w:val="20"/>
                 <w:szCs w:val="20"/>
               </w:rPr>
-              <w:t xml:space="preserve">&gt;= 0.10</w:t>
+              <w:t>&gt;= 0.1</w:t>
             </w:r>
           </w:p>
         </w:tc>
@@ -5368,7 +5354,7 @@
                 <w:sz w:val="20"/>
                 <w:szCs w:val="20"/>
               </w:rPr>
-              <w:t xml:space="preserve">&gt;= 1e-6</w:t>
+              <w:t>&gt;= 1e-6</w:t>
             </w:r>
           </w:p>
         </w:tc>
@@ -5399,7 +5385,7 @@
                 <w:sz w:val="20"/>
                 <w:szCs w:val="20"/>
               </w:rPr>
-              <w:t xml:space="preserve">405</w:t>
+              <w:t>404</w:t>
             </w:r>
           </w:p>
         </w:tc>
@@ -5430,7 +5416,7 @@
                 <w:sz w:val="20"/>
                 <w:szCs w:val="20"/>
               </w:rPr>
-              <w:t xml:space="preserve">652</w:t>
+              <w:t>651</w:t>
             </w:r>
           </w:p>
         </w:tc>
@@ -5461,7 +5447,7 @@
                 <w:sz w:val="20"/>
                 <w:szCs w:val="20"/>
               </w:rPr>
-              <w:t xml:space="preserve">0.783</w:t>
+              <w:t>0.785</w:t>
             </w:r>
           </w:p>
         </w:tc>
@@ -5492,7 +5478,7 @@
                 <w:sz w:val="20"/>
                 <w:szCs w:val="20"/>
               </w:rPr>
-              <w:t xml:space="preserve">0.040</w:t>
+              <w:t>0.044</w:t>
             </w:r>
           </w:p>
         </w:tc>
@@ -5525,7 +5511,7 @@
                 <w:sz w:val="20"/>
                 <w:szCs w:val="20"/>
               </w:rPr>
-              <w:t xml:space="preserve">&gt;= 0.10</w:t>
+              <w:t>&gt;= 0.1</w:t>
             </w:r>
           </w:p>
         </w:tc>
@@ -5556,7 +5542,7 @@
                 <w:sz w:val="20"/>
                 <w:szCs w:val="20"/>
               </w:rPr>
-              <w:t xml:space="preserve">&gt;= 1e-5</w:t>
+              <w:t>&gt;= 1e-5</w:t>
             </w:r>
           </w:p>
         </w:tc>
@@ -5587,7 +5573,7 @@
                 <w:sz w:val="20"/>
                 <w:szCs w:val="20"/>
               </w:rPr>
-              <w:t xml:space="preserve">316</w:t>
+              <w:t>315</w:t>
             </w:r>
           </w:p>
         </w:tc>
@@ -5618,7 +5604,7 @@
                 <w:sz w:val="20"/>
                 <w:szCs w:val="20"/>
               </w:rPr>
-              <w:t xml:space="preserve">563</w:t>
+              <w:t>562</w:t>
             </w:r>
           </w:p>
         </w:tc>
@@ -5649,7 +5635,7 @@
                 <w:sz w:val="20"/>
                 <w:szCs w:val="20"/>
               </w:rPr>
-              <w:t xml:space="preserve">0.777</w:t>
+              <w:t>0.773</w:t>
             </w:r>
           </w:p>
         </w:tc>
@@ -5680,7 +5666,7 @@
                 <w:sz w:val="20"/>
                 <w:szCs w:val="20"/>
               </w:rPr>
-              <w:t xml:space="preserve">0.038</w:t>
+              <w:t>0.033</w:t>
             </w:r>
           </w:p>
         </w:tc>
@@ -5713,7 +5699,7 @@
                 <w:sz w:val="20"/>
                 <w:szCs w:val="20"/>
               </w:rPr>
-              <w:t xml:space="preserve">&gt;= 0.10</w:t>
+              <w:t>&gt;= 0.1</w:t>
             </w:r>
           </w:p>
         </w:tc>
@@ -5744,7 +5730,7 @@
                 <w:sz w:val="20"/>
                 <w:szCs w:val="20"/>
               </w:rPr>
-              <w:t xml:space="preserve">&gt;= 1e-4</w:t>
+              <w:t>&gt;= 1e-4</w:t>
             </w:r>
           </w:p>
         </w:tc>
@@ -5775,7 +5761,7 @@
                 <w:sz w:val="20"/>
                 <w:szCs w:val="20"/>
               </w:rPr>
-              <w:t xml:space="preserve">145</w:t>
+              <w:t>147</w:t>
             </w:r>
           </w:p>
         </w:tc>
@@ -5806,7 +5792,7 @@
                 <w:sz w:val="20"/>
                 <w:szCs w:val="20"/>
               </w:rPr>
-              <w:t xml:space="preserve">392</w:t>
+              <w:t>394</w:t>
             </w:r>
           </w:p>
         </w:tc>
@@ -5837,7 +5823,7 @@
                 <w:sz w:val="20"/>
                 <w:szCs w:val="20"/>
               </w:rPr>
-              <w:t xml:space="preserve">0.788</w:t>
+              <w:t>0.783</w:t>
             </w:r>
           </w:p>
         </w:tc>
@@ -5868,7 +5854,7 @@
                 <w:sz w:val="20"/>
                 <w:szCs w:val="20"/>
               </w:rPr>
-              <w:t xml:space="preserve">0.034</w:t>
+              <w:t>0.037</w:t>
             </w:r>
           </w:p>
         </w:tc>
@@ -5901,7 +5887,7 @@
                 <w:sz w:val="20"/>
                 <w:szCs w:val="20"/>
               </w:rPr>
-              <w:t xml:space="preserve">&gt;= 0.10</w:t>
+              <w:t>&gt;= 0.1</w:t>
             </w:r>
           </w:p>
         </w:tc>
@@ -5932,7 +5918,7 @@
                 <w:sz w:val="20"/>
                 <w:szCs w:val="20"/>
               </w:rPr>
-              <w:t xml:space="preserve">&gt;= 1e-3</w:t>
+              <w:t>&gt;= 1e-3</w:t>
             </w:r>
           </w:p>
         </w:tc>
@@ -5963,7 +5949,7 @@
                 <w:sz w:val="20"/>
                 <w:szCs w:val="20"/>
               </w:rPr>
-              <w:t xml:space="preserve">2</w:t>
+              <w:t>2</w:t>
             </w:r>
           </w:p>
         </w:tc>
@@ -5994,7 +5980,7 @@
                 <w:sz w:val="20"/>
                 <w:szCs w:val="20"/>
               </w:rPr>
-              <w:t xml:space="preserve">249</w:t>
+              <w:t>249</w:t>
             </w:r>
           </w:p>
         </w:tc>
@@ -6025,7 +6011,7 @@
                 <w:sz w:val="20"/>
                 <w:szCs w:val="20"/>
               </w:rPr>
-              <w:t xml:space="preserve">0.811</w:t>
+              <w:t>0.811</w:t>
             </w:r>
           </w:p>
         </w:tc>
@@ -6056,7 +6042,7 @@
                 <w:sz w:val="20"/>
                 <w:szCs w:val="20"/>
               </w:rPr>
-              <w:t xml:space="preserve">0.045</w:t>
+              <w:t>0.045</w:t>
             </w:r>
           </w:p>
         </w:tc>
@@ -6089,7 +6075,7 @@
                 <w:sz w:val="20"/>
                 <w:szCs w:val="20"/>
               </w:rPr>
-              <w:t xml:space="preserve">&gt;= 0.15</w:t>
+              <w:t>&gt;= 0.15</w:t>
             </w:r>
           </w:p>
         </w:tc>
@@ -6120,7 +6106,7 @@
                 <w:sz w:val="20"/>
                 <w:szCs w:val="20"/>
               </w:rPr>
-              <w:t xml:space="preserve">&gt;= 1e-7</w:t>
+              <w:t>&gt;= 1e-7</w:t>
             </w:r>
           </w:p>
         </w:tc>
@@ -6151,7 +6137,7 @@
                 <w:sz w:val="20"/>
                 <w:szCs w:val="20"/>
               </w:rPr>
-              <w:t xml:space="preserve">409</w:t>
+              <w:t>412</w:t>
             </w:r>
           </w:p>
         </w:tc>
@@ -6182,7 +6168,7 @@
                 <w:sz w:val="20"/>
                 <w:szCs w:val="20"/>
               </w:rPr>
-              <w:t xml:space="preserve">656</w:t>
+              <w:t>659</w:t>
             </w:r>
           </w:p>
         </w:tc>
@@ -6213,7 +6199,7 @@
                 <w:sz w:val="20"/>
                 <w:szCs w:val="20"/>
               </w:rPr>
-              <w:t xml:space="preserve">0.787</w:t>
+              <w:t>0.783</w:t>
             </w:r>
           </w:p>
         </w:tc>
@@ -6244,7 +6230,7 @@
                 <w:sz w:val="20"/>
                 <w:szCs w:val="20"/>
               </w:rPr>
-              <w:t xml:space="preserve">0.030</w:t>
+              <w:t>0.034</w:t>
             </w:r>
           </w:p>
         </w:tc>
@@ -6277,7 +6263,7 @@
                 <w:sz w:val="20"/>
                 <w:szCs w:val="20"/>
               </w:rPr>
-              <w:t xml:space="preserve">&gt;= 0.15</w:t>
+              <w:t>&gt;= 0.15</w:t>
             </w:r>
           </w:p>
         </w:tc>
@@ -6308,7 +6294,7 @@
                 <w:sz w:val="20"/>
                 <w:szCs w:val="20"/>
               </w:rPr>
-              <w:t xml:space="preserve">&gt;= 1e-6</w:t>
+              <w:t>&gt;= 1e-6</w:t>
             </w:r>
           </w:p>
         </w:tc>
@@ -6339,7 +6325,7 @@
                 <w:sz w:val="20"/>
                 <w:szCs w:val="20"/>
               </w:rPr>
-              <w:t xml:space="preserve">399</w:t>
+              <w:t>401</w:t>
             </w:r>
           </w:p>
         </w:tc>
@@ -6370,7 +6356,7 @@
                 <w:sz w:val="20"/>
                 <w:szCs w:val="20"/>
               </w:rPr>
-              <w:t xml:space="preserve">646</w:t>
+              <w:t>648</w:t>
             </w:r>
           </w:p>
         </w:tc>
@@ -6401,7 +6387,7 @@
                 <w:sz w:val="20"/>
                 <w:szCs w:val="20"/>
               </w:rPr>
-              <w:t xml:space="preserve">0.785</w:t>
+              <w:t>0.781</w:t>
             </w:r>
           </w:p>
         </w:tc>
@@ -6432,7 +6418,7 @@
                 <w:sz w:val="20"/>
                 <w:szCs w:val="20"/>
               </w:rPr>
-              <w:t xml:space="preserve">0.038</w:t>
+              <w:t>0.042</w:t>
             </w:r>
           </w:p>
         </w:tc>
@@ -6465,7 +6451,7 @@
                 <w:sz w:val="20"/>
                 <w:szCs w:val="20"/>
               </w:rPr>
-              <w:t xml:space="preserve">&gt;= 0.15</w:t>
+              <w:t>&gt;= 0.15</w:t>
             </w:r>
           </w:p>
         </w:tc>
@@ -6496,7 +6482,7 @@
                 <w:sz w:val="20"/>
                 <w:szCs w:val="20"/>
               </w:rPr>
-              <w:t xml:space="preserve">&gt;= 1e-5</w:t>
+              <w:t>&gt;= 1e-5</w:t>
             </w:r>
           </w:p>
         </w:tc>
@@ -6527,7 +6513,7 @@
                 <w:sz w:val="20"/>
                 <w:szCs w:val="20"/>
               </w:rPr>
-              <w:t xml:space="preserve">316</w:t>
+              <w:t>315</w:t>
             </w:r>
           </w:p>
         </w:tc>
@@ -6558,7 +6544,7 @@
                 <w:sz w:val="20"/>
                 <w:szCs w:val="20"/>
               </w:rPr>
-              <w:t xml:space="preserve">563</w:t>
+              <w:t>562</w:t>
             </w:r>
           </w:p>
         </w:tc>
@@ -6589,7 +6575,7 @@
                 <w:sz w:val="20"/>
                 <w:szCs w:val="20"/>
               </w:rPr>
-              <w:t xml:space="preserve">0.777</w:t>
+              <w:t>0.773</w:t>
             </w:r>
           </w:p>
         </w:tc>
@@ -6620,7 +6606,7 @@
                 <w:sz w:val="20"/>
                 <w:szCs w:val="20"/>
               </w:rPr>
-              <w:t xml:space="preserve">0.038</w:t>
+              <w:t>0.033</w:t>
             </w:r>
           </w:p>
         </w:tc>
@@ -6653,7 +6639,7 @@
                 <w:sz w:val="20"/>
                 <w:szCs w:val="20"/>
               </w:rPr>
-              <w:t xml:space="preserve">&gt;= 0.15</w:t>
+              <w:t>&gt;= 0.15</w:t>
             </w:r>
           </w:p>
         </w:tc>
@@ -6684,7 +6670,7 @@
                 <w:sz w:val="20"/>
                 <w:szCs w:val="20"/>
               </w:rPr>
-              <w:t xml:space="preserve">&gt;= 1e-4</w:t>
+              <w:t>&gt;= 1e-4</w:t>
             </w:r>
           </w:p>
         </w:tc>
@@ -6715,7 +6701,7 @@
                 <w:sz w:val="20"/>
                 <w:szCs w:val="20"/>
               </w:rPr>
-              <w:t xml:space="preserve">145</w:t>
+              <w:t>147</w:t>
             </w:r>
           </w:p>
         </w:tc>
@@ -6746,7 +6732,7 @@
                 <w:sz w:val="20"/>
                 <w:szCs w:val="20"/>
               </w:rPr>
-              <w:t xml:space="preserve">392</w:t>
+              <w:t>394</w:t>
             </w:r>
           </w:p>
         </w:tc>
@@ -6777,7 +6763,7 @@
                 <w:sz w:val="20"/>
                 <w:szCs w:val="20"/>
               </w:rPr>
-              <w:t xml:space="preserve">0.788</w:t>
+              <w:t>0.783</w:t>
             </w:r>
           </w:p>
         </w:tc>
@@ -6808,7 +6794,7 @@
                 <w:sz w:val="20"/>
                 <w:szCs w:val="20"/>
               </w:rPr>
-              <w:t xml:space="preserve">0.034</w:t>
+              <w:t>0.037</w:t>
             </w:r>
           </w:p>
         </w:tc>
@@ -6841,7 +6827,7 @@
                 <w:sz w:val="20"/>
                 <w:szCs w:val="20"/>
               </w:rPr>
-              <w:t xml:space="preserve">&gt;= 0.15</w:t>
+              <w:t>&gt;= 0.15</w:t>
             </w:r>
           </w:p>
         </w:tc>
@@ -6872,7 +6858,7 @@
                 <w:sz w:val="20"/>
                 <w:szCs w:val="20"/>
               </w:rPr>
-              <w:t xml:space="preserve">&gt;= 1e-3</w:t>
+              <w:t>&gt;= 1e-3</w:t>
             </w:r>
           </w:p>
         </w:tc>
@@ -6903,7 +6889,7 @@
                 <w:sz w:val="20"/>
                 <w:szCs w:val="20"/>
               </w:rPr>
-              <w:t xml:space="preserve">2</w:t>
+              <w:t>2</w:t>
             </w:r>
           </w:p>
         </w:tc>
@@ -6934,7 +6920,7 @@
                 <w:sz w:val="20"/>
                 <w:szCs w:val="20"/>
               </w:rPr>
-              <w:t xml:space="preserve">249</w:t>
+              <w:t>249</w:t>
             </w:r>
           </w:p>
         </w:tc>
@@ -6965,7 +6951,7 @@
                 <w:sz w:val="20"/>
                 <w:szCs w:val="20"/>
               </w:rPr>
-              <w:t xml:space="preserve">0.811</w:t>
+              <w:t>0.811</w:t>
             </w:r>
           </w:p>
         </w:tc>
@@ -6996,7 +6982,7 @@
                 <w:sz w:val="20"/>
                 <w:szCs w:val="20"/>
               </w:rPr>
-              <w:t xml:space="preserve">0.045</w:t>
+              <w:t>0.045</w:t>
             </w:r>
           </w:p>
         </w:tc>
@@ -7029,7 +7015,7 @@
                 <w:sz w:val="20"/>
                 <w:szCs w:val="20"/>
               </w:rPr>
-              <w:t xml:space="preserve">&gt;= 0.20</w:t>
+              <w:t>&gt;= 0.2</w:t>
             </w:r>
           </w:p>
         </w:tc>
@@ -7060,7 +7046,7 @@
                 <w:sz w:val="20"/>
                 <w:szCs w:val="20"/>
               </w:rPr>
-              <w:t xml:space="preserve">&gt;= 1e-7</w:t>
+              <w:t>&gt;= 1e-7</w:t>
             </w:r>
           </w:p>
         </w:tc>
@@ -7091,7 +7077,7 @@
                 <w:sz w:val="20"/>
                 <w:szCs w:val="20"/>
               </w:rPr>
-              <w:t xml:space="preserve">395</w:t>
+              <w:t>396</w:t>
             </w:r>
           </w:p>
         </w:tc>
@@ -7122,7 +7108,7 @@
                 <w:sz w:val="20"/>
                 <w:szCs w:val="20"/>
               </w:rPr>
-              <w:t xml:space="preserve">642</w:t>
+              <w:t>643</w:t>
             </w:r>
           </w:p>
         </w:tc>
@@ -7153,7 +7139,7 @@
                 <w:sz w:val="20"/>
                 <w:szCs w:val="20"/>
               </w:rPr>
-              <w:t xml:space="preserve">0.783</w:t>
+              <w:t>0.784</w:t>
             </w:r>
           </w:p>
         </w:tc>
@@ -7184,7 +7170,7 @@
                 <w:sz w:val="20"/>
                 <w:szCs w:val="20"/>
               </w:rPr>
-              <w:t xml:space="preserve">0.034</w:t>
+              <w:t>0.036</w:t>
             </w:r>
           </w:p>
         </w:tc>
@@ -7217,7 +7203,7 @@
                 <w:sz w:val="20"/>
                 <w:szCs w:val="20"/>
               </w:rPr>
-              <w:t xml:space="preserve">&gt;= 0.20</w:t>
+              <w:t>&gt;= 0.2</w:t>
             </w:r>
           </w:p>
         </w:tc>
@@ -7248,7 +7234,7 @@
                 <w:sz w:val="20"/>
                 <w:szCs w:val="20"/>
               </w:rPr>
-              <w:t xml:space="preserve">&gt;= 1e-6</w:t>
+              <w:t>&gt;= 1e-6</w:t>
             </w:r>
           </w:p>
         </w:tc>
@@ -7279,7 +7265,7 @@
                 <w:sz w:val="20"/>
                 <w:szCs w:val="20"/>
               </w:rPr>
-              <w:t xml:space="preserve">390</w:t>
+              <w:t>390</w:t>
             </w:r>
           </w:p>
         </w:tc>
@@ -7310,7 +7296,7 @@
                 <w:sz w:val="20"/>
                 <w:szCs w:val="20"/>
               </w:rPr>
-              <w:t xml:space="preserve">637</w:t>
+              <w:t>637</w:t>
             </w:r>
           </w:p>
         </w:tc>
@@ -7341,7 +7327,7 @@
                 <w:sz w:val="20"/>
                 <w:szCs w:val="20"/>
               </w:rPr>
-              <w:t xml:space="preserve">0.788</w:t>
+              <w:t>0.779</w:t>
             </w:r>
           </w:p>
         </w:tc>
@@ -7372,7 +7358,7 @@
                 <w:sz w:val="20"/>
                 <w:szCs w:val="20"/>
               </w:rPr>
-              <w:t xml:space="preserve">0.027</w:t>
+              <w:t>0.042</w:t>
             </w:r>
           </w:p>
         </w:tc>
@@ -7405,7 +7391,7 @@
                 <w:sz w:val="20"/>
                 <w:szCs w:val="20"/>
               </w:rPr>
-              <w:t xml:space="preserve">&gt;= 0.20</w:t>
+              <w:t>&gt;= 0.2</w:t>
             </w:r>
           </w:p>
         </w:tc>
@@ -7436,7 +7422,7 @@
                 <w:sz w:val="20"/>
                 <w:szCs w:val="20"/>
               </w:rPr>
-              <w:t xml:space="preserve">&gt;= 1e-5</w:t>
+              <w:t>&gt;= 1e-5</w:t>
             </w:r>
           </w:p>
         </w:tc>
@@ -7467,7 +7453,7 @@
                 <w:sz w:val="20"/>
                 <w:szCs w:val="20"/>
               </w:rPr>
-              <w:t xml:space="preserve">316</w:t>
+              <w:t>315</w:t>
             </w:r>
           </w:p>
         </w:tc>
@@ -7498,7 +7484,7 @@
                 <w:sz w:val="20"/>
                 <w:szCs w:val="20"/>
               </w:rPr>
-              <w:t xml:space="preserve">563</w:t>
+              <w:t>562</w:t>
             </w:r>
           </w:p>
         </w:tc>
@@ -7529,7 +7515,7 @@
                 <w:sz w:val="20"/>
                 <w:szCs w:val="20"/>
               </w:rPr>
-              <w:t xml:space="preserve">0.777</w:t>
+              <w:t>0.773</w:t>
             </w:r>
           </w:p>
         </w:tc>
@@ -7560,7 +7546,7 @@
                 <w:sz w:val="20"/>
                 <w:szCs w:val="20"/>
               </w:rPr>
-              <w:t xml:space="preserve">0.038</w:t>
+              <w:t>0.033</w:t>
             </w:r>
           </w:p>
         </w:tc>
@@ -7593,7 +7579,7 @@
                 <w:sz w:val="20"/>
                 <w:szCs w:val="20"/>
               </w:rPr>
-              <w:t xml:space="preserve">&gt;= 0.20</w:t>
+              <w:t>&gt;= 0.2</w:t>
             </w:r>
           </w:p>
         </w:tc>
@@ -7624,7 +7610,7 @@
                 <w:sz w:val="20"/>
                 <w:szCs w:val="20"/>
               </w:rPr>
-              <w:t xml:space="preserve">&gt;= 1e-4</w:t>
+              <w:t>&gt;= 1e-4</w:t>
             </w:r>
           </w:p>
         </w:tc>
@@ -7655,7 +7641,7 @@
                 <w:sz w:val="20"/>
                 <w:szCs w:val="20"/>
               </w:rPr>
-              <w:t xml:space="preserve">145</w:t>
+              <w:t>147</w:t>
             </w:r>
           </w:p>
         </w:tc>
@@ -7686,7 +7672,7 @@
                 <w:sz w:val="20"/>
                 <w:szCs w:val="20"/>
               </w:rPr>
-              <w:t xml:space="preserve">392</w:t>
+              <w:t>394</w:t>
             </w:r>
           </w:p>
         </w:tc>
@@ -7717,7 +7703,7 @@
                 <w:sz w:val="20"/>
                 <w:szCs w:val="20"/>
               </w:rPr>
-              <w:t xml:space="preserve">0.788</w:t>
+              <w:t>0.783</w:t>
             </w:r>
           </w:p>
         </w:tc>
@@ -7748,7 +7734,7 @@
                 <w:sz w:val="20"/>
                 <w:szCs w:val="20"/>
               </w:rPr>
-              <w:t xml:space="preserve">0.034</w:t>
+              <w:t>0.037</w:t>
             </w:r>
           </w:p>
         </w:tc>
@@ -7781,7 +7767,7 @@
                 <w:sz w:val="20"/>
                 <w:szCs w:val="20"/>
               </w:rPr>
-              <w:t xml:space="preserve">&gt;= 0.20</w:t>
+              <w:t>&gt;= 0.2</w:t>
             </w:r>
           </w:p>
         </w:tc>
@@ -7812,7 +7798,7 @@
                 <w:sz w:val="20"/>
                 <w:szCs w:val="20"/>
               </w:rPr>
-              <w:t xml:space="preserve">&gt;= 1e-3</w:t>
+              <w:t>&gt;= 1e-3</w:t>
             </w:r>
           </w:p>
         </w:tc>
@@ -7843,7 +7829,7 @@
                 <w:sz w:val="20"/>
                 <w:szCs w:val="20"/>
               </w:rPr>
-              <w:t xml:space="preserve">2</w:t>
+              <w:t>2</w:t>
             </w:r>
           </w:p>
         </w:tc>
@@ -7874,7 +7860,7 @@
                 <w:sz w:val="20"/>
                 <w:szCs w:val="20"/>
               </w:rPr>
-              <w:t xml:space="preserve">249</w:t>
+              <w:t>249</w:t>
             </w:r>
           </w:p>
         </w:tc>
@@ -7905,7 +7891,7 @@
                 <w:sz w:val="20"/>
                 <w:szCs w:val="20"/>
               </w:rPr>
-              <w:t xml:space="preserve">0.811</w:t>
+              <w:t>0.811</w:t>
             </w:r>
           </w:p>
         </w:tc>
@@ -7936,7 +7922,7 @@
                 <w:sz w:val="20"/>
                 <w:szCs w:val="20"/>
               </w:rPr>
-              <w:t xml:space="preserve">0.045</w:t>
+              <w:t>0.045</w:t>
             </w:r>
           </w:p>
         </w:tc>

</xml_diff>

<commit_message>
Deeper audit: refresh Sup Table S1 from current CSV; add 10 missing in-text citations (Beghini, Pasolli, Lundberg, Chen, Breiman, Feng, Yachida, Vogtmann, Yu, Zeller); remove uncited [redacted] reference (refs renumbered to 14); add figure1_forest_plot.py and figure5_shap_three_panel.py to REPRODUCING.md
</commit_message>
<xml_diff>
--- a/manuscript/CRC_Manuscript_Complete.docx
+++ b/manuscript/CRC_Manuscript_Complete.docx
@@ -461,7 +461,7 @@
           <w:sz w:val="22"/>
           <w:szCs w:val="22"/>
         </w:rPr>
-        <w:t xml:space="preserve">All metagenomic data were obtained from curatedMetagenomicData (Bioconductor package; version recorded in the repository's session_info.txt and provenance directory). We retained the seven publicly available stool CRC case-control cohorts used by Thomas et al. (2019): FengQ_2015 (Austria), ThomasAM_2018a (Italy), ThomasAM_2018b (Italy), ThomasAM_2019_c (Japan), VogtmannE_2016 (USA), YuJ_2015 (China), and ZellerG_2014 (France), spanning six countries across three continents. Subjects in study_condition categories of CRC, adenoma, or control were retained. After deduplication on subject ID, the cohort comprised 762 unique subjects. Cross-cohort overlap was audited (audit_subject_ids.R): no subject appears in more than one cohort and no subject has multiple samples.</w:t>
+        <w:t>All metagenomic data were obtained from curatedMetagenomicData (Pasolli et al., 2017; Bioconductor package; version recorded in the repository's session_info.txt and provenance directory). We retained the seven publicly available stool CRC case-control cohorts used by Thomas et al. (2019): FengQ_2015 (Austria; Feng et al., 2015), ThomasAM_2018a (Italy), ThomasAM_2018b (Italy), ThomasAM_2019_c (Japan; Yachida et al., 2019), VogtmannE_2016 (USA; Vogtmann et al., 2016), YuJ_2015 (China; Yu et al., 2017), and ZellerG_2014 (France; Zeller et al., 2014), spanning six countries across three continents. Subjects in study_condition categories of CRC, adenoma, or control were retained. After deduplication on subject ID, the cohort comprised 762 unique subjects. Cross-cohort overlap was audited (audit_subject_ids.R): no subject appears in more than one cohort and no subject has multiple samples.</w:t>
       </w:r>
     </w:p>
     <w:p>
@@ -489,7 +489,7 @@
           <w:sz w:val="22"/>
           <w:szCs w:val="22"/>
         </w:rPr>
-        <w:t xml:space="preserve">Species-level relative abundances were generated by MetaPhlAn under curatedMetagenomicData's standard pipeline. Species features were filtered at prevalence &gt;= 10% and mean relative abundance &gt;= 1e-4 across the full cohort (preprocessing.py), yielding 247 retained species. Filtered abundances were renormalized to sum to one per sample if the row sum exceeded 1.5, then transformed by log10(x + 1e-6) to stabilize variance for the small subset of analyses that benefit from approximate normality (this transform does not affect tree-split decisions for Random Forest or XGBoost). The species filter is applied globally rather than per-fold because species composition is structurally stable across cohorts under MetaPhlAn's fixed reference database, the feature count is small, and Thomas et al. (2019) and Piccinno et al. (2025) both apply species filtering globally.</w:t>
+        <w:t>Species-level relative abundances were generated by MetaPhlAn under curatedMetagenomicData's standard pipeline (Beghini et al., 2021). Species features were filtered at prevalence &gt;= 10% and mean relative abundance &gt;= 1e-4 across the full cohort (preprocessing.py), yielding 247 retained species. Filtered abundances were renormalized to sum to one per sample if the row sum exceeded 1.5, then transformed by log10(x + 1e-6) to stabilize variance for the small subset of analyses that benefit from approximate normality (this transform does not affect tree-split decisions for Random Forest or XGBoost). The species filter is applied globally rather than per-fold because species composition is structurally stable across cohorts under MetaPhlAn's fixed reference database, the feature count is small, and Thomas et al. (2019) and Piccinno et al. (2025) both apply species filtering globally.</w:t>
       </w:r>
     </w:p>
     <w:p>
@@ -530,7 +530,7 @@
           <w:sz w:val="22"/>
           <w:szCs w:val="22"/>
         </w:rPr>
-        <w:t xml:space="preserve">We trained three classifiers under LODO cross-validation. The species-only baseline uses 247 species features with a Random Forest of 500 trees, max_features = sqrt(p), min_samples_leaf = 5, class_weight = balanced, random_state = 42 (train_baseline.py). The joint Random Forest adds the per-fold-filtered unstratified pathway features under identical hyperparameters. The joint XGBoost classifier uses 500 estimators, max_depth = 6, learning_rate = 0.1, subsample = 0.8, colsample_bytree = 0.8, eval_metric = logloss, random_state = 42 on the same per-fold-filtered joint feature matrix (train_joint.py). Adenoma classification (healthy versus adenoma; adenoma versus CRC) is treated as exploratory and reported separately under both 5-fold within-cohort cross-validation (train_adenoma.py) and LODO cross-validation (adenoma_lodo.py).</w:t>
+        <w:t>We trained three classifiers under LODO cross-validation. The species-only baseline uses 247 species features with a Random Forest (Breiman, 2001) of 500 trees, max_features = sqrt(p), min_samples_leaf = 5, class_weight = balanced, random_state = 42 (train_baseline.py). The joint Random Forest adds the per-fold-filtered unstratified pathway features under identical hyperparameters. The joint XGBoost (Chen and Guestrin, 2016) classifier uses 500 estimators, max_depth = 6, learning_rate = 0.1, subsample = 0.8, colsample_bytree = 0.8, eval_metric = logloss, random_state = 42 on the same per-fold-filtered joint feature matrix (train_joint.py). Adenoma classification (healthy versus adenoma; adenoma versus CRC) is treated as exploratory and reported separately under both 5-fold within-cohort cross-validation (train_adenoma.py) and LODO cross-validation (adenoma_lodo.py).</w:t>
       </w:r>
     </w:p>
     <w:p>
@@ -586,7 +586,7 @@
           <w:sz w:val="22"/>
           <w:szCs w:val="22"/>
         </w:rPr>
-        <w:t xml:space="preserve">We computed 95% bootstrap confidence intervals for every per-cohort and pooled AUC using 10,000 stratified resamples (bootstrap_ci.py, results in Supplementary Table S2). We assessed seed stability by re-running the species RF baseline at random_state values of 0, 1, 2, 42, and 100 (seed_sensitivity.py). We assessed pathway filter sensitivity across a 4-by-5 grid of prevalence thresholds (0.05, 0.10, 0.15, 0.20) and mean-abundance thresholds (1e-7, 1e-6, 1e-5, 1e-4, 1e-3), reporting mean per-cohort AUC for each cell (sensitivity_analysis.py, results in Supplementary Table S1). We assessed cross-study batch effect sensitivity by applying empirical Bayes batch correction (ComBat) with cohort as the batch variable before LODO classification (batch_correction.py). We assessed confounder robustness by two strategies: direct inclusion of age, sex, and BMI as additional features in the classifier, and residualization of species log-abundances on age + sex + BMI before classification (confounder_adjustment.py). Feature importance was computed via TreeSHAP for both Random Forest and XGBoost (shap_analysis.py, shap_xgb.py).</w:t>
+        <w:t>We computed 95% bootstrap confidence intervals for every per-cohort and pooled AUC using 10,000 stratified resamples (bootstrap_ci.py, results in Supplementary Table S2). We assessed seed stability by re-running the species RF baseline at random_state values of 0, 1, 2, 42, and 100 (seed_sensitivity.py). We assessed pathway filter sensitivity across a 4-by-5 grid of prevalence thresholds (0.05, 0.10, 0.15, 0.20) and mean-abundance thresholds (1e-7, 1e-6, 1e-5, 1e-4, 1e-3), reporting mean per-cohort AUC for each cell (sensitivity_analysis.py, results in Supplementary Table S1). We assessed cross-study batch effect sensitivity by applying empirical Bayes batch correction (ComBat) with cohort as the batch variable before LODO classification (batch_correction.py). We assessed confounder robustness by two strategies: direct inclusion of age, sex, and BMI as additional features in the classifier, and residualization of species log-abundances on age + sex + BMI before classification (confounder_adjustment.py). Feature importance was computed via TreeSHAP (Lundberg and Lee, 2017) for both Random Forest and XGBoost (shap_analysis.py, shap_xgb.py).</w:t>
       </w:r>
     </w:p>
     <w:p>
@@ -1025,7 +1025,7 @@
           <w:sz w:val="20"/>
           <w:szCs w:val="20"/>
         </w:rPr>
-        <w:t xml:space="preserve">2. Korem, T., et al. (2023). SCRuB: improving cancer phenotype prediction from microbiome data by modeling contamination sources. Nature Biotechnology. https://doi.org/10.1038/s41587-023-01696-w</w:t>
+        <w:t>2. Pasolli, E., Schiffer, L., Manghi, P., et al. (2017). Accessible, curated metagenomic data through ExperimentHub. Nature Methods 14, 1023-1024. https://doi.org/10.1038/nmeth.4468</w:t>
       </w:r>
     </w:p>
     <w:p>
@@ -1039,7 +1039,7 @@
           <w:sz w:val="20"/>
           <w:szCs w:val="20"/>
         </w:rPr>
-        <w:t xml:space="preserve">3. Pasolli, E., Schiffer, L., Manghi, P., et al. (2017). Accessible, curated metagenomic data through ExperimentHub. Nature Methods 14, 1023-1024. https://doi.org/10.1038/nmeth.4468</w:t>
+        <w:t>3. Piccinno, G., Asnicar, F., Manghi, P., et al. (2025). Pooled analysis of 3,741 stool metagenomes from 18 cohorts identifies reproducible CRC-associated species- and strain-level signatures. Nature Medicine. https://doi.org/10.1038/s41591-025-03693-9</w:t>
       </w:r>
     </w:p>
     <w:p>
@@ -1053,7 +1053,7 @@
           <w:sz w:val="20"/>
           <w:szCs w:val="20"/>
         </w:rPr>
-        <w:t xml:space="preserve">4. Piccinno, G., Asnicar, F., Manghi, P., et al. (2025). Pooled analysis of 3,741 stool metagenomes from 18 cohorts identifies reproducible CRC-associated species- and strain-level signatures. Nature Medicine. https://doi.org/10.1038/s41591-025-03693-9</w:t>
+        <w:t>4. Sun, X. and Xu, W. (2014). Fast implementation of DeLong's algorithm for comparing the areas under correlated receiver operating characteristic curves. IEEE Signal Processing Letters 21(11), 1389-1393.</w:t>
       </w:r>
     </w:p>
     <w:p>
@@ -1067,7 +1067,7 @@
           <w:sz w:val="20"/>
           <w:szCs w:val="20"/>
         </w:rPr>
-        <w:t xml:space="preserve">5. Sun, X. and Xu, W. (2014). Fast implementation of DeLong's algorithm for comparing the areas under correlated receiver operating characteristic curves. IEEE Signal Processing Letters 21(11), 1389-1393.</w:t>
+        <w:t>5. Thomas, A.M., Manghi, P., Asnicar, F., et al. (2019). Metagenomic analysis of colorectal cancer datasets identifies cross-cohort microbial diagnostic signatures and a link with choline degradation. Nature Medicine 25, 667-678. https://doi.org/10.1038/s41591-019-0405-7</w:t>
       </w:r>
     </w:p>
     <w:p>
@@ -1081,7 +1081,7 @@
           <w:sz w:val="20"/>
           <w:szCs w:val="20"/>
         </w:rPr>
-        <w:t xml:space="preserve">6. Thomas, A.M., Manghi, P., Asnicar, F., et al. (2019). Metagenomic analysis of colorectal cancer datasets identifies cross-cohort microbial diagnostic signatures and a link with choline degradation. Nature Medicine 25, 667-678. https://doi.org/10.1038/s41591-019-0405-7</w:t>
+        <w:t>6. Yachida, S., Mizutani, S., Shiroma, H., et al. (2019). Metagenomic and metabolomic analyses reveal distinct stage-specific phenotypes of the gut microbiota in colorectal cancer. Nature Medicine 25, 968-976.</w:t>
       </w:r>
     </w:p>
     <w:p>
@@ -1095,7 +1095,7 @@
           <w:sz w:val="20"/>
           <w:szCs w:val="20"/>
         </w:rPr>
-        <w:t xml:space="preserve">7. Yachida, S., Mizutani, S., Shiroma, H., et al. (2019). Metagenomic and metabolomic analyses reveal distinct stage-specific phenotypes of the gut microbiota in colorectal cancer. Nature Medicine 25, 968-976.</w:t>
+        <w:t>7. Zeller, G., Tap, J., Voigt, A.Y., et al. (2014). Potential of fecal microbiota for early-stage detection of colorectal cancer. Molecular Systems Biology 10(11), 766. https://doi.org/10.15252/msb.20145645</w:t>
       </w:r>
     </w:p>
     <w:p>
@@ -1109,7 +1109,7 @@
           <w:sz w:val="20"/>
           <w:szCs w:val="20"/>
         </w:rPr>
-        <w:t xml:space="preserve">8. Zeller, G., Tap, J., Voigt, A.Y., et al. (2014). Potential of fecal microbiota for early-stage detection of colorectal cancer. Molecular Systems Biology 10(11), 766. https://doi.org/10.15252/msb.20145645</w:t>
+        <w:t>8. Feng, Q., Liang, S., Jia, H., et al. (2015). Gut microbiome development along the colorectal adenoma-carcinoma sequence. Nature Communications 6, 6528.</w:t>
       </w:r>
     </w:p>
     <w:p>
@@ -1123,7 +1123,7 @@
           <w:sz w:val="20"/>
           <w:szCs w:val="20"/>
         </w:rPr>
-        <w:t xml:space="preserve">9. Feng, Q., Liang, S., Jia, H., et al. (2015). Gut microbiome development along the colorectal adenoma-carcinoma sequence. Nature Communications 6, 6528.</w:t>
+        <w:t>9. Yu, J., Feng, Q., Wong, S.H., et al. (2017). Metagenomic analysis of faecal microbiome as a tool towards targeted non-invasive biomarkers for colorectal cancer. Gut 66, 70-78.</w:t>
       </w:r>
     </w:p>
     <w:p>
@@ -1137,7 +1137,7 @@
           <w:sz w:val="20"/>
           <w:szCs w:val="20"/>
         </w:rPr>
-        <w:t xml:space="preserve">10. Yu, J., Feng, Q., Wong, S.H., et al. (2017). Metagenomic analysis of faecal microbiome as a tool towards targeted non-invasive biomarkers for colorectal cancer. Gut 66, 70-78.</w:t>
+        <w:t>10. Vogtmann, E., Hua, X., Zeller, G., et al. (2016). Colorectal cancer and the human gut microbiome: reproducibility with whole-genome shotgun sequencing. PLoS ONE 11(5), e0155362.</w:t>
       </w:r>
     </w:p>
     <w:p>
@@ -1151,7 +1151,7 @@
           <w:sz w:val="20"/>
           <w:szCs w:val="20"/>
         </w:rPr>
-        <w:t xml:space="preserve">11. Vogtmann, E., Hua, X., Zeller, G., et al. (2016). Colorectal cancer and the human gut microbiome: reproducibility with whole-genome shotgun sequencing. PLoS ONE 11(5), e0155362.</w:t>
+        <w:t>11. Beghini, F., McIver, L.J., Blanco-Miguez, A., et al. (2021). Integrating taxonomic, functional, and strain-level profiling of diverse microbial communities with bioBakery 3. eLife 10, e65088. (MetaPhlAn / HUMAnN reference)</w:t>
       </w:r>
     </w:p>
     <w:p>
@@ -1165,7 +1165,7 @@
           <w:sz w:val="20"/>
           <w:szCs w:val="20"/>
         </w:rPr>
-        <w:t xml:space="preserve">12. Beghini, F., McIver, L.J., Blanco-Miguez, A., et al. (2021). Integrating taxonomic, functional, and strain-level profiling of diverse microbial communities with bioBakery 3. eLife 10, e65088. (MetaPhlAn / HUMAnN reference)</w:t>
+        <w:t>12. Lundberg, S.M. and Lee, S.I. (2017). A unified approach to interpreting model predictions. Advances in Neural Information Processing Systems 30. (SHAP reference)</w:t>
       </w:r>
     </w:p>
     <w:p>
@@ -1179,7 +1179,7 @@
           <w:sz w:val="20"/>
           <w:szCs w:val="20"/>
         </w:rPr>
-        <w:t xml:space="preserve">13. Lundberg, S.M. and Lee, S.I. (2017). A unified approach to interpreting model predictions. Advances in Neural Information Processing Systems 30. (SHAP reference)</w:t>
+        <w:t>13. Chen, T. and Guestrin, C. (2016). XGBoost: a scalable tree boosting system. KDD 2016, 785-794.</w:t>
       </w:r>
     </w:p>
     <w:p>
@@ -1193,21 +1193,7 @@
           <w:sz w:val="20"/>
           <w:szCs w:val="20"/>
         </w:rPr>
-        <w:t xml:space="preserve">14. Chen, T. and Guestrin, C. (2016). XGBoost: a scalable tree boosting system. KDD 2016, 785-794.</w:t>
-      </w:r>
-    </w:p>
-    <w:p>
-      <w:pPr>
-        <w:spacing w:after="100" w:line="280"/>
-        <w:ind w:left="360" w:hanging="360"/>
-        <w:jc w:val="both"/>
-      </w:pPr>
-      <w:r>
-        <w:rPr>
-          <w:sz w:val="20"/>
-          <w:szCs w:val="20"/>
-        </w:rPr>
-        <w:t xml:space="preserve">15. Breiman, L. (2001). Random forests. Machine Learning 45, 5-32.</w:t>
+        <w:t>14. Breiman, L. (2001). Random forests. Machine Learning 45, 5-32.</w:t>
       </w:r>
     </w:p>
     <w:p>
@@ -4209,7 +4195,7 @@
                 <w:sz w:val="20"/>
                 <w:szCs w:val="20"/>
               </w:rPr>
-              <w:t xml:space="preserve">&gt;= 0.05</w:t>
+              <w:t>&gt;= 0.05</w:t>
             </w:r>
           </w:p>
         </w:tc>
@@ -4240,7 +4226,7 @@
                 <w:sz w:val="20"/>
                 <w:szCs w:val="20"/>
               </w:rPr>
-              <w:t xml:space="preserve">&gt;= 1e-7</w:t>
+              <w:t>&gt;= 1e-7</w:t>
             </w:r>
           </w:p>
         </w:tc>
@@ -4271,7 +4257,7 @@
                 <w:sz w:val="20"/>
                 <w:szCs w:val="20"/>
               </w:rPr>
-              <w:t xml:space="preserve">438</w:t>
+              <w:t>439</w:t>
             </w:r>
           </w:p>
         </w:tc>
@@ -4302,7 +4288,7 @@
                 <w:sz w:val="20"/>
                 <w:szCs w:val="20"/>
               </w:rPr>
-              <w:t xml:space="preserve">685</w:t>
+              <w:t>686</w:t>
             </w:r>
           </w:p>
         </w:tc>
@@ -4333,7 +4319,7 @@
                 <w:sz w:val="20"/>
                 <w:szCs w:val="20"/>
               </w:rPr>
-              <w:t xml:space="preserve">0.790</w:t>
+              <w:t>0.785</w:t>
             </w:r>
           </w:p>
         </w:tc>
@@ -4364,7 +4350,7 @@
                 <w:sz w:val="20"/>
                 <w:szCs w:val="20"/>
               </w:rPr>
-              <w:t xml:space="preserve">0.036</w:t>
+              <w:t>0.039</w:t>
             </w:r>
           </w:p>
         </w:tc>
@@ -4397,7 +4383,7 @@
                 <w:sz w:val="20"/>
                 <w:szCs w:val="20"/>
               </w:rPr>
-              <w:t xml:space="preserve">&gt;= 0.05</w:t>
+              <w:t>&gt;= 0.05</w:t>
             </w:r>
           </w:p>
         </w:tc>
@@ -4428,7 +4414,7 @@
                 <w:sz w:val="20"/>
                 <w:szCs w:val="20"/>
               </w:rPr>
-              <w:t xml:space="preserve">&gt;= 1e-6</w:t>
+              <w:t>&gt;= 1e-6</w:t>
             </w:r>
           </w:p>
         </w:tc>
@@ -4459,7 +4445,7 @@
                 <w:sz w:val="20"/>
                 <w:szCs w:val="20"/>
               </w:rPr>
-              <w:t xml:space="preserve">407</w:t>
+              <w:t>406</w:t>
             </w:r>
           </w:p>
         </w:tc>
@@ -4490,7 +4476,7 @@
                 <w:sz w:val="20"/>
                 <w:szCs w:val="20"/>
               </w:rPr>
-              <w:t xml:space="preserve">654</w:t>
+              <w:t>653</w:t>
             </w:r>
           </w:p>
         </w:tc>
@@ -4521,7 +4507,7 @@
                 <w:sz w:val="20"/>
                 <w:szCs w:val="20"/>
               </w:rPr>
-              <w:t xml:space="preserve">0.781</w:t>
+              <w:t>0.789</w:t>
             </w:r>
           </w:p>
         </w:tc>
@@ -4552,7 +4538,7 @@
                 <w:sz w:val="20"/>
                 <w:szCs w:val="20"/>
               </w:rPr>
-              <w:t xml:space="preserve">0.036</w:t>
+              <w:t>0.044</w:t>
             </w:r>
           </w:p>
         </w:tc>
@@ -4585,7 +4571,7 @@
                 <w:sz w:val="20"/>
                 <w:szCs w:val="20"/>
               </w:rPr>
-              <w:t xml:space="preserve">&gt;= 0.05</w:t>
+              <w:t>&gt;= 0.05</w:t>
             </w:r>
           </w:p>
         </w:tc>
@@ -4616,7 +4602,7 @@
                 <w:sz w:val="20"/>
                 <w:szCs w:val="20"/>
               </w:rPr>
-              <w:t xml:space="preserve">&gt;= 1e-5</w:t>
+              <w:t>&gt;= 1e-5</w:t>
             </w:r>
           </w:p>
         </w:tc>
@@ -4647,7 +4633,7 @@
                 <w:sz w:val="20"/>
                 <w:szCs w:val="20"/>
               </w:rPr>
-              <w:t xml:space="preserve">316</w:t>
+              <w:t>315</w:t>
             </w:r>
           </w:p>
         </w:tc>
@@ -4678,7 +4664,7 @@
                 <w:sz w:val="20"/>
                 <w:szCs w:val="20"/>
               </w:rPr>
-              <w:t xml:space="preserve">563</w:t>
+              <w:t>562</w:t>
             </w:r>
           </w:p>
         </w:tc>
@@ -4709,7 +4695,7 @@
                 <w:sz w:val="20"/>
                 <w:szCs w:val="20"/>
               </w:rPr>
-              <w:t xml:space="preserve">0.777</w:t>
+              <w:t>0.773</w:t>
             </w:r>
           </w:p>
         </w:tc>
@@ -4740,7 +4726,7 @@
                 <w:sz w:val="20"/>
                 <w:szCs w:val="20"/>
               </w:rPr>
-              <w:t xml:space="preserve">0.038</w:t>
+              <w:t>0.033</w:t>
             </w:r>
           </w:p>
         </w:tc>
@@ -4773,7 +4759,7 @@
                 <w:sz w:val="20"/>
                 <w:szCs w:val="20"/>
               </w:rPr>
-              <w:t xml:space="preserve">&gt;= 0.05</w:t>
+              <w:t>&gt;= 0.05</w:t>
             </w:r>
           </w:p>
         </w:tc>
@@ -4804,7 +4790,7 @@
                 <w:sz w:val="20"/>
                 <w:szCs w:val="20"/>
               </w:rPr>
-              <w:t xml:space="preserve">&gt;= 1e-4</w:t>
+              <w:t>&gt;= 1e-4</w:t>
             </w:r>
           </w:p>
         </w:tc>
@@ -4835,7 +4821,7 @@
                 <w:sz w:val="20"/>
                 <w:szCs w:val="20"/>
               </w:rPr>
-              <w:t xml:space="preserve">145</w:t>
+              <w:t>147</w:t>
             </w:r>
           </w:p>
         </w:tc>
@@ -4866,7 +4852,7 @@
                 <w:sz w:val="20"/>
                 <w:szCs w:val="20"/>
               </w:rPr>
-              <w:t xml:space="preserve">392</w:t>
+              <w:t>394</w:t>
             </w:r>
           </w:p>
         </w:tc>
@@ -4897,7 +4883,7 @@
                 <w:sz w:val="20"/>
                 <w:szCs w:val="20"/>
               </w:rPr>
-              <w:t xml:space="preserve">0.788</w:t>
+              <w:t>0.783</w:t>
             </w:r>
           </w:p>
         </w:tc>
@@ -4928,7 +4914,7 @@
                 <w:sz w:val="20"/>
                 <w:szCs w:val="20"/>
               </w:rPr>
-              <w:t xml:space="preserve">0.034</w:t>
+              <w:t>0.037</w:t>
             </w:r>
           </w:p>
         </w:tc>
@@ -4961,7 +4947,7 @@
                 <w:sz w:val="20"/>
                 <w:szCs w:val="20"/>
               </w:rPr>
-              <w:t xml:space="preserve">&gt;= 0.05</w:t>
+              <w:t>&gt;= 0.05</w:t>
             </w:r>
           </w:p>
         </w:tc>
@@ -4992,7 +4978,7 @@
                 <w:sz w:val="20"/>
                 <w:szCs w:val="20"/>
               </w:rPr>
-              <w:t xml:space="preserve">&gt;= 1e-3</w:t>
+              <w:t>&gt;= 1e-3</w:t>
             </w:r>
           </w:p>
         </w:tc>
@@ -5023,7 +5009,7 @@
                 <w:sz w:val="20"/>
                 <w:szCs w:val="20"/>
               </w:rPr>
-              <w:t xml:space="preserve">2</w:t>
+              <w:t>2</w:t>
             </w:r>
           </w:p>
         </w:tc>
@@ -5054,7 +5040,7 @@
                 <w:sz w:val="20"/>
                 <w:szCs w:val="20"/>
               </w:rPr>
-              <w:t xml:space="preserve">249</w:t>
+              <w:t>249</w:t>
             </w:r>
           </w:p>
         </w:tc>
@@ -5085,7 +5071,7 @@
                 <w:sz w:val="20"/>
                 <w:szCs w:val="20"/>
               </w:rPr>
-              <w:t xml:space="preserve">0.811</w:t>
+              <w:t>0.811</w:t>
             </w:r>
           </w:p>
         </w:tc>
@@ -5116,7 +5102,7 @@
                 <w:sz w:val="20"/>
                 <w:szCs w:val="20"/>
               </w:rPr>
-              <w:t xml:space="preserve">0.045</w:t>
+              <w:t>0.045</w:t>
             </w:r>
           </w:p>
         </w:tc>
@@ -5149,7 +5135,7 @@
                 <w:sz w:val="20"/>
                 <w:szCs w:val="20"/>
               </w:rPr>
-              <w:t xml:space="preserve">&gt;= 0.10</w:t>
+              <w:t>&gt;= 0.1</w:t>
             </w:r>
           </w:p>
         </w:tc>
@@ -5180,7 +5166,7 @@
                 <w:sz w:val="20"/>
                 <w:szCs w:val="20"/>
               </w:rPr>
-              <w:t xml:space="preserve">&gt;= 1e-7</w:t>
+              <w:t>&gt;= 1e-7</w:t>
             </w:r>
           </w:p>
         </w:tc>
@@ -5211,7 +5197,7 @@
                 <w:sz w:val="20"/>
                 <w:szCs w:val="20"/>
               </w:rPr>
-              <w:t xml:space="preserve">427</w:t>
+              <w:t>427</w:t>
             </w:r>
           </w:p>
         </w:tc>
@@ -5242,7 +5228,7 @@
                 <w:sz w:val="20"/>
                 <w:szCs w:val="20"/>
               </w:rPr>
-              <w:t xml:space="preserve">674</w:t>
+              <w:t>674</w:t>
             </w:r>
           </w:p>
         </w:tc>
@@ -5273,7 +5259,7 @@
                 <w:sz w:val="20"/>
                 <w:szCs w:val="20"/>
               </w:rPr>
-              <w:t xml:space="preserve">0.783</w:t>
+              <w:t>0.786</w:t>
             </w:r>
           </w:p>
         </w:tc>
@@ -5304,7 +5290,7 @@
                 <w:sz w:val="20"/>
                 <w:szCs w:val="20"/>
               </w:rPr>
-              <w:t xml:space="preserve">0.040</w:t>
+              <w:t>0.041</w:t>
             </w:r>
           </w:p>
         </w:tc>
@@ -5337,7 +5323,7 @@
                 <w:sz w:val="20"/>
                 <w:szCs w:val="20"/>
               </w:rPr>
-              <w:t xml:space="preserve">&gt;= 0.10</w:t>
+              <w:t>&gt;= 0.1</w:t>
             </w:r>
           </w:p>
         </w:tc>
@@ -5368,7 +5354,7 @@
                 <w:sz w:val="20"/>
                 <w:szCs w:val="20"/>
               </w:rPr>
-              <w:t xml:space="preserve">&gt;= 1e-6</w:t>
+              <w:t>&gt;= 1e-6</w:t>
             </w:r>
           </w:p>
         </w:tc>
@@ -5399,7 +5385,7 @@
                 <w:sz w:val="20"/>
                 <w:szCs w:val="20"/>
               </w:rPr>
-              <w:t xml:space="preserve">405</w:t>
+              <w:t>404</w:t>
             </w:r>
           </w:p>
         </w:tc>
@@ -5430,7 +5416,7 @@
                 <w:sz w:val="20"/>
                 <w:szCs w:val="20"/>
               </w:rPr>
-              <w:t xml:space="preserve">652</w:t>
+              <w:t>651</w:t>
             </w:r>
           </w:p>
         </w:tc>
@@ -5461,7 +5447,7 @@
                 <w:sz w:val="20"/>
                 <w:szCs w:val="20"/>
               </w:rPr>
-              <w:t xml:space="preserve">0.783</w:t>
+              <w:t>0.785</w:t>
             </w:r>
           </w:p>
         </w:tc>
@@ -5492,7 +5478,7 @@
                 <w:sz w:val="20"/>
                 <w:szCs w:val="20"/>
               </w:rPr>
-              <w:t xml:space="preserve">0.040</w:t>
+              <w:t>0.044</w:t>
             </w:r>
           </w:p>
         </w:tc>
@@ -5525,7 +5511,7 @@
                 <w:sz w:val="20"/>
                 <w:szCs w:val="20"/>
               </w:rPr>
-              <w:t xml:space="preserve">&gt;= 0.10</w:t>
+              <w:t>&gt;= 0.1</w:t>
             </w:r>
           </w:p>
         </w:tc>
@@ -5556,7 +5542,7 @@
                 <w:sz w:val="20"/>
                 <w:szCs w:val="20"/>
               </w:rPr>
-              <w:t xml:space="preserve">&gt;= 1e-5</w:t>
+              <w:t>&gt;= 1e-5</w:t>
             </w:r>
           </w:p>
         </w:tc>
@@ -5587,7 +5573,7 @@
                 <w:sz w:val="20"/>
                 <w:szCs w:val="20"/>
               </w:rPr>
-              <w:t xml:space="preserve">316</w:t>
+              <w:t>315</w:t>
             </w:r>
           </w:p>
         </w:tc>
@@ -5618,7 +5604,7 @@
                 <w:sz w:val="20"/>
                 <w:szCs w:val="20"/>
               </w:rPr>
-              <w:t xml:space="preserve">563</w:t>
+              <w:t>562</w:t>
             </w:r>
           </w:p>
         </w:tc>
@@ -5649,7 +5635,7 @@
                 <w:sz w:val="20"/>
                 <w:szCs w:val="20"/>
               </w:rPr>
-              <w:t xml:space="preserve">0.777</w:t>
+              <w:t>0.773</w:t>
             </w:r>
           </w:p>
         </w:tc>
@@ -5680,7 +5666,7 @@
                 <w:sz w:val="20"/>
                 <w:szCs w:val="20"/>
               </w:rPr>
-              <w:t xml:space="preserve">0.038</w:t>
+              <w:t>0.033</w:t>
             </w:r>
           </w:p>
         </w:tc>
@@ -5713,7 +5699,7 @@
                 <w:sz w:val="20"/>
                 <w:szCs w:val="20"/>
               </w:rPr>
-              <w:t xml:space="preserve">&gt;= 0.10</w:t>
+              <w:t>&gt;= 0.1</w:t>
             </w:r>
           </w:p>
         </w:tc>
@@ -5744,7 +5730,7 @@
                 <w:sz w:val="20"/>
                 <w:szCs w:val="20"/>
               </w:rPr>
-              <w:t xml:space="preserve">&gt;= 1e-4</w:t>
+              <w:t>&gt;= 1e-4</w:t>
             </w:r>
           </w:p>
         </w:tc>
@@ -5775,7 +5761,7 @@
                 <w:sz w:val="20"/>
                 <w:szCs w:val="20"/>
               </w:rPr>
-              <w:t xml:space="preserve">145</w:t>
+              <w:t>147</w:t>
             </w:r>
           </w:p>
         </w:tc>
@@ -5806,7 +5792,7 @@
                 <w:sz w:val="20"/>
                 <w:szCs w:val="20"/>
               </w:rPr>
-              <w:t xml:space="preserve">392</w:t>
+              <w:t>394</w:t>
             </w:r>
           </w:p>
         </w:tc>
@@ -5837,7 +5823,7 @@
                 <w:sz w:val="20"/>
                 <w:szCs w:val="20"/>
               </w:rPr>
-              <w:t xml:space="preserve">0.788</w:t>
+              <w:t>0.783</w:t>
             </w:r>
           </w:p>
         </w:tc>
@@ -5868,7 +5854,7 @@
                 <w:sz w:val="20"/>
                 <w:szCs w:val="20"/>
               </w:rPr>
-              <w:t xml:space="preserve">0.034</w:t>
+              <w:t>0.037</w:t>
             </w:r>
           </w:p>
         </w:tc>
@@ -5901,7 +5887,7 @@
                 <w:sz w:val="20"/>
                 <w:szCs w:val="20"/>
               </w:rPr>
-              <w:t xml:space="preserve">&gt;= 0.10</w:t>
+              <w:t>&gt;= 0.1</w:t>
             </w:r>
           </w:p>
         </w:tc>
@@ -5932,7 +5918,7 @@
                 <w:sz w:val="20"/>
                 <w:szCs w:val="20"/>
               </w:rPr>
-              <w:t xml:space="preserve">&gt;= 1e-3</w:t>
+              <w:t>&gt;= 1e-3</w:t>
             </w:r>
           </w:p>
         </w:tc>
@@ -5963,7 +5949,7 @@
                 <w:sz w:val="20"/>
                 <w:szCs w:val="20"/>
               </w:rPr>
-              <w:t xml:space="preserve">2</w:t>
+              <w:t>2</w:t>
             </w:r>
           </w:p>
         </w:tc>
@@ -5994,7 +5980,7 @@
                 <w:sz w:val="20"/>
                 <w:szCs w:val="20"/>
               </w:rPr>
-              <w:t xml:space="preserve">249</w:t>
+              <w:t>249</w:t>
             </w:r>
           </w:p>
         </w:tc>
@@ -6025,7 +6011,7 @@
                 <w:sz w:val="20"/>
                 <w:szCs w:val="20"/>
               </w:rPr>
-              <w:t xml:space="preserve">0.811</w:t>
+              <w:t>0.811</w:t>
             </w:r>
           </w:p>
         </w:tc>
@@ -6056,7 +6042,7 @@
                 <w:sz w:val="20"/>
                 <w:szCs w:val="20"/>
               </w:rPr>
-              <w:t xml:space="preserve">0.045</w:t>
+              <w:t>0.045</w:t>
             </w:r>
           </w:p>
         </w:tc>
@@ -6089,7 +6075,7 @@
                 <w:sz w:val="20"/>
                 <w:szCs w:val="20"/>
               </w:rPr>
-              <w:t xml:space="preserve">&gt;= 0.15</w:t>
+              <w:t>&gt;= 0.15</w:t>
             </w:r>
           </w:p>
         </w:tc>
@@ -6120,7 +6106,7 @@
                 <w:sz w:val="20"/>
                 <w:szCs w:val="20"/>
               </w:rPr>
-              <w:t xml:space="preserve">&gt;= 1e-7</w:t>
+              <w:t>&gt;= 1e-7</w:t>
             </w:r>
           </w:p>
         </w:tc>
@@ -6151,7 +6137,7 @@
                 <w:sz w:val="20"/>
                 <w:szCs w:val="20"/>
               </w:rPr>
-              <w:t xml:space="preserve">409</w:t>
+              <w:t>412</w:t>
             </w:r>
           </w:p>
         </w:tc>
@@ -6182,7 +6168,7 @@
                 <w:sz w:val="20"/>
                 <w:szCs w:val="20"/>
               </w:rPr>
-              <w:t xml:space="preserve">656</w:t>
+              <w:t>659</w:t>
             </w:r>
           </w:p>
         </w:tc>
@@ -6213,7 +6199,7 @@
                 <w:sz w:val="20"/>
                 <w:szCs w:val="20"/>
               </w:rPr>
-              <w:t xml:space="preserve">0.787</w:t>
+              <w:t>0.783</w:t>
             </w:r>
           </w:p>
         </w:tc>
@@ -6244,7 +6230,7 @@
                 <w:sz w:val="20"/>
                 <w:szCs w:val="20"/>
               </w:rPr>
-              <w:t xml:space="preserve">0.030</w:t>
+              <w:t>0.034</w:t>
             </w:r>
           </w:p>
         </w:tc>
@@ -6277,7 +6263,7 @@
                 <w:sz w:val="20"/>
                 <w:szCs w:val="20"/>
               </w:rPr>
-              <w:t xml:space="preserve">&gt;= 0.15</w:t>
+              <w:t>&gt;= 0.15</w:t>
             </w:r>
           </w:p>
         </w:tc>
@@ -6308,7 +6294,7 @@
                 <w:sz w:val="20"/>
                 <w:szCs w:val="20"/>
               </w:rPr>
-              <w:t xml:space="preserve">&gt;= 1e-6</w:t>
+              <w:t>&gt;= 1e-6</w:t>
             </w:r>
           </w:p>
         </w:tc>
@@ -6339,7 +6325,7 @@
                 <w:sz w:val="20"/>
                 <w:szCs w:val="20"/>
               </w:rPr>
-              <w:t xml:space="preserve">399</w:t>
+              <w:t>401</w:t>
             </w:r>
           </w:p>
         </w:tc>
@@ -6370,7 +6356,7 @@
                 <w:sz w:val="20"/>
                 <w:szCs w:val="20"/>
               </w:rPr>
-              <w:t xml:space="preserve">646</w:t>
+              <w:t>648</w:t>
             </w:r>
           </w:p>
         </w:tc>
@@ -6401,7 +6387,7 @@
                 <w:sz w:val="20"/>
                 <w:szCs w:val="20"/>
               </w:rPr>
-              <w:t xml:space="preserve">0.785</w:t>
+              <w:t>0.781</w:t>
             </w:r>
           </w:p>
         </w:tc>
@@ -6432,7 +6418,7 @@
                 <w:sz w:val="20"/>
                 <w:szCs w:val="20"/>
               </w:rPr>
-              <w:t xml:space="preserve">0.038</w:t>
+              <w:t>0.042</w:t>
             </w:r>
           </w:p>
         </w:tc>
@@ -6465,7 +6451,7 @@
                 <w:sz w:val="20"/>
                 <w:szCs w:val="20"/>
               </w:rPr>
-              <w:t xml:space="preserve">&gt;= 0.15</w:t>
+              <w:t>&gt;= 0.15</w:t>
             </w:r>
           </w:p>
         </w:tc>
@@ -6496,7 +6482,7 @@
                 <w:sz w:val="20"/>
                 <w:szCs w:val="20"/>
               </w:rPr>
-              <w:t xml:space="preserve">&gt;= 1e-5</w:t>
+              <w:t>&gt;= 1e-5</w:t>
             </w:r>
           </w:p>
         </w:tc>
@@ -6527,7 +6513,7 @@
                 <w:sz w:val="20"/>
                 <w:szCs w:val="20"/>
               </w:rPr>
-              <w:t xml:space="preserve">316</w:t>
+              <w:t>315</w:t>
             </w:r>
           </w:p>
         </w:tc>
@@ -6558,7 +6544,7 @@
                 <w:sz w:val="20"/>
                 <w:szCs w:val="20"/>
               </w:rPr>
-              <w:t xml:space="preserve">563</w:t>
+              <w:t>562</w:t>
             </w:r>
           </w:p>
         </w:tc>
@@ -6589,7 +6575,7 @@
                 <w:sz w:val="20"/>
                 <w:szCs w:val="20"/>
               </w:rPr>
-              <w:t xml:space="preserve">0.777</w:t>
+              <w:t>0.773</w:t>
             </w:r>
           </w:p>
         </w:tc>
@@ -6620,7 +6606,7 @@
                 <w:sz w:val="20"/>
                 <w:szCs w:val="20"/>
               </w:rPr>
-              <w:t xml:space="preserve">0.038</w:t>
+              <w:t>0.033</w:t>
             </w:r>
           </w:p>
         </w:tc>
@@ -6653,7 +6639,7 @@
                 <w:sz w:val="20"/>
                 <w:szCs w:val="20"/>
               </w:rPr>
-              <w:t xml:space="preserve">&gt;= 0.15</w:t>
+              <w:t>&gt;= 0.15</w:t>
             </w:r>
           </w:p>
         </w:tc>
@@ -6684,7 +6670,7 @@
                 <w:sz w:val="20"/>
                 <w:szCs w:val="20"/>
               </w:rPr>
-              <w:t xml:space="preserve">&gt;= 1e-4</w:t>
+              <w:t>&gt;= 1e-4</w:t>
             </w:r>
           </w:p>
         </w:tc>
@@ -6715,7 +6701,7 @@
                 <w:sz w:val="20"/>
                 <w:szCs w:val="20"/>
               </w:rPr>
-              <w:t xml:space="preserve">145</w:t>
+              <w:t>147</w:t>
             </w:r>
           </w:p>
         </w:tc>
@@ -6746,7 +6732,7 @@
                 <w:sz w:val="20"/>
                 <w:szCs w:val="20"/>
               </w:rPr>
-              <w:t xml:space="preserve">392</w:t>
+              <w:t>394</w:t>
             </w:r>
           </w:p>
         </w:tc>
@@ -6777,7 +6763,7 @@
                 <w:sz w:val="20"/>
                 <w:szCs w:val="20"/>
               </w:rPr>
-              <w:t xml:space="preserve">0.788</w:t>
+              <w:t>0.783</w:t>
             </w:r>
           </w:p>
         </w:tc>
@@ -6808,7 +6794,7 @@
                 <w:sz w:val="20"/>
                 <w:szCs w:val="20"/>
               </w:rPr>
-              <w:t xml:space="preserve">0.034</w:t>
+              <w:t>0.037</w:t>
             </w:r>
           </w:p>
         </w:tc>
@@ -6841,7 +6827,7 @@
                 <w:sz w:val="20"/>
                 <w:szCs w:val="20"/>
               </w:rPr>
-              <w:t xml:space="preserve">&gt;= 0.15</w:t>
+              <w:t>&gt;= 0.15</w:t>
             </w:r>
           </w:p>
         </w:tc>
@@ -6872,7 +6858,7 @@
                 <w:sz w:val="20"/>
                 <w:szCs w:val="20"/>
               </w:rPr>
-              <w:t xml:space="preserve">&gt;= 1e-3</w:t>
+              <w:t>&gt;= 1e-3</w:t>
             </w:r>
           </w:p>
         </w:tc>
@@ -6903,7 +6889,7 @@
                 <w:sz w:val="20"/>
                 <w:szCs w:val="20"/>
               </w:rPr>
-              <w:t xml:space="preserve">2</w:t>
+              <w:t>2</w:t>
             </w:r>
           </w:p>
         </w:tc>
@@ -6934,7 +6920,7 @@
                 <w:sz w:val="20"/>
                 <w:szCs w:val="20"/>
               </w:rPr>
-              <w:t xml:space="preserve">249</w:t>
+              <w:t>249</w:t>
             </w:r>
           </w:p>
         </w:tc>
@@ -6965,7 +6951,7 @@
                 <w:sz w:val="20"/>
                 <w:szCs w:val="20"/>
               </w:rPr>
-              <w:t xml:space="preserve">0.811</w:t>
+              <w:t>0.811</w:t>
             </w:r>
           </w:p>
         </w:tc>
@@ -6996,7 +6982,7 @@
                 <w:sz w:val="20"/>
                 <w:szCs w:val="20"/>
               </w:rPr>
-              <w:t xml:space="preserve">0.045</w:t>
+              <w:t>0.045</w:t>
             </w:r>
           </w:p>
         </w:tc>
@@ -7029,7 +7015,7 @@
                 <w:sz w:val="20"/>
                 <w:szCs w:val="20"/>
               </w:rPr>
-              <w:t xml:space="preserve">&gt;= 0.20</w:t>
+              <w:t>&gt;= 0.2</w:t>
             </w:r>
           </w:p>
         </w:tc>
@@ -7060,7 +7046,7 @@
                 <w:sz w:val="20"/>
                 <w:szCs w:val="20"/>
               </w:rPr>
-              <w:t xml:space="preserve">&gt;= 1e-7</w:t>
+              <w:t>&gt;= 1e-7</w:t>
             </w:r>
           </w:p>
         </w:tc>
@@ -7091,7 +7077,7 @@
                 <w:sz w:val="20"/>
                 <w:szCs w:val="20"/>
               </w:rPr>
-              <w:t xml:space="preserve">395</w:t>
+              <w:t>396</w:t>
             </w:r>
           </w:p>
         </w:tc>
@@ -7122,7 +7108,7 @@
                 <w:sz w:val="20"/>
                 <w:szCs w:val="20"/>
               </w:rPr>
-              <w:t xml:space="preserve">642</w:t>
+              <w:t>643</w:t>
             </w:r>
           </w:p>
         </w:tc>
@@ -7153,7 +7139,7 @@
                 <w:sz w:val="20"/>
                 <w:szCs w:val="20"/>
               </w:rPr>
-              <w:t xml:space="preserve">0.783</w:t>
+              <w:t>0.784</w:t>
             </w:r>
           </w:p>
         </w:tc>
@@ -7184,7 +7170,7 @@
                 <w:sz w:val="20"/>
                 <w:szCs w:val="20"/>
               </w:rPr>
-              <w:t xml:space="preserve">0.034</w:t>
+              <w:t>0.036</w:t>
             </w:r>
           </w:p>
         </w:tc>
@@ -7217,7 +7203,7 @@
                 <w:sz w:val="20"/>
                 <w:szCs w:val="20"/>
               </w:rPr>
-              <w:t xml:space="preserve">&gt;= 0.20</w:t>
+              <w:t>&gt;= 0.2</w:t>
             </w:r>
           </w:p>
         </w:tc>
@@ -7248,7 +7234,7 @@
                 <w:sz w:val="20"/>
                 <w:szCs w:val="20"/>
               </w:rPr>
-              <w:t xml:space="preserve">&gt;= 1e-6</w:t>
+              <w:t>&gt;= 1e-6</w:t>
             </w:r>
           </w:p>
         </w:tc>
@@ -7279,7 +7265,7 @@
                 <w:sz w:val="20"/>
                 <w:szCs w:val="20"/>
               </w:rPr>
-              <w:t xml:space="preserve">390</w:t>
+              <w:t>390</w:t>
             </w:r>
           </w:p>
         </w:tc>
@@ -7310,7 +7296,7 @@
                 <w:sz w:val="20"/>
                 <w:szCs w:val="20"/>
               </w:rPr>
-              <w:t xml:space="preserve">637</w:t>
+              <w:t>637</w:t>
             </w:r>
           </w:p>
         </w:tc>
@@ -7341,7 +7327,7 @@
                 <w:sz w:val="20"/>
                 <w:szCs w:val="20"/>
               </w:rPr>
-              <w:t xml:space="preserve">0.788</w:t>
+              <w:t>0.779</w:t>
             </w:r>
           </w:p>
         </w:tc>
@@ -7372,7 +7358,7 @@
                 <w:sz w:val="20"/>
                 <w:szCs w:val="20"/>
               </w:rPr>
-              <w:t xml:space="preserve">0.027</w:t>
+              <w:t>0.042</w:t>
             </w:r>
           </w:p>
         </w:tc>
@@ -7405,7 +7391,7 @@
                 <w:sz w:val="20"/>
                 <w:szCs w:val="20"/>
               </w:rPr>
-              <w:t xml:space="preserve">&gt;= 0.20</w:t>
+              <w:t>&gt;= 0.2</w:t>
             </w:r>
           </w:p>
         </w:tc>
@@ -7436,7 +7422,7 @@
                 <w:sz w:val="20"/>
                 <w:szCs w:val="20"/>
               </w:rPr>
-              <w:t xml:space="preserve">&gt;= 1e-5</w:t>
+              <w:t>&gt;= 1e-5</w:t>
             </w:r>
           </w:p>
         </w:tc>
@@ -7467,7 +7453,7 @@
                 <w:sz w:val="20"/>
                 <w:szCs w:val="20"/>
               </w:rPr>
-              <w:t xml:space="preserve">316</w:t>
+              <w:t>315</w:t>
             </w:r>
           </w:p>
         </w:tc>
@@ -7498,7 +7484,7 @@
                 <w:sz w:val="20"/>
                 <w:szCs w:val="20"/>
               </w:rPr>
-              <w:t xml:space="preserve">563</w:t>
+              <w:t>562</w:t>
             </w:r>
           </w:p>
         </w:tc>
@@ -7529,7 +7515,7 @@
                 <w:sz w:val="20"/>
                 <w:szCs w:val="20"/>
               </w:rPr>
-              <w:t xml:space="preserve">0.777</w:t>
+              <w:t>0.773</w:t>
             </w:r>
           </w:p>
         </w:tc>
@@ -7560,7 +7546,7 @@
                 <w:sz w:val="20"/>
                 <w:szCs w:val="20"/>
               </w:rPr>
-              <w:t xml:space="preserve">0.038</w:t>
+              <w:t>0.033</w:t>
             </w:r>
           </w:p>
         </w:tc>
@@ -7593,7 +7579,7 @@
                 <w:sz w:val="20"/>
                 <w:szCs w:val="20"/>
               </w:rPr>
-              <w:t xml:space="preserve">&gt;= 0.20</w:t>
+              <w:t>&gt;= 0.2</w:t>
             </w:r>
           </w:p>
         </w:tc>
@@ -7624,7 +7610,7 @@
                 <w:sz w:val="20"/>
                 <w:szCs w:val="20"/>
               </w:rPr>
-              <w:t xml:space="preserve">&gt;= 1e-4</w:t>
+              <w:t>&gt;= 1e-4</w:t>
             </w:r>
           </w:p>
         </w:tc>
@@ -7655,7 +7641,7 @@
                 <w:sz w:val="20"/>
                 <w:szCs w:val="20"/>
               </w:rPr>
-              <w:t xml:space="preserve">145</w:t>
+              <w:t>147</w:t>
             </w:r>
           </w:p>
         </w:tc>
@@ -7686,7 +7672,7 @@
                 <w:sz w:val="20"/>
                 <w:szCs w:val="20"/>
               </w:rPr>
-              <w:t xml:space="preserve">392</w:t>
+              <w:t>394</w:t>
             </w:r>
           </w:p>
         </w:tc>
@@ -7717,7 +7703,7 @@
                 <w:sz w:val="20"/>
                 <w:szCs w:val="20"/>
               </w:rPr>
-              <w:t xml:space="preserve">0.788</w:t>
+              <w:t>0.783</w:t>
             </w:r>
           </w:p>
         </w:tc>
@@ -7748,7 +7734,7 @@
                 <w:sz w:val="20"/>
                 <w:szCs w:val="20"/>
               </w:rPr>
-              <w:t xml:space="preserve">0.034</w:t>
+              <w:t>0.037</w:t>
             </w:r>
           </w:p>
         </w:tc>
@@ -7781,7 +7767,7 @@
                 <w:sz w:val="20"/>
                 <w:szCs w:val="20"/>
               </w:rPr>
-              <w:t xml:space="preserve">&gt;= 0.20</w:t>
+              <w:t>&gt;= 0.2</w:t>
             </w:r>
           </w:p>
         </w:tc>
@@ -7812,7 +7798,7 @@
                 <w:sz w:val="20"/>
                 <w:szCs w:val="20"/>
               </w:rPr>
-              <w:t xml:space="preserve">&gt;= 1e-3</w:t>
+              <w:t>&gt;= 1e-3</w:t>
             </w:r>
           </w:p>
         </w:tc>
@@ -7843,7 +7829,7 @@
                 <w:sz w:val="20"/>
                 <w:szCs w:val="20"/>
               </w:rPr>
-              <w:t xml:space="preserve">2</w:t>
+              <w:t>2</w:t>
             </w:r>
           </w:p>
         </w:tc>
@@ -7874,7 +7860,7 @@
                 <w:sz w:val="20"/>
                 <w:szCs w:val="20"/>
               </w:rPr>
-              <w:t xml:space="preserve">249</w:t>
+              <w:t>249</w:t>
             </w:r>
           </w:p>
         </w:tc>
@@ -7905,7 +7891,7 @@
                 <w:sz w:val="20"/>
                 <w:szCs w:val="20"/>
               </w:rPr>
-              <w:t xml:space="preserve">0.811</w:t>
+              <w:t>0.811</w:t>
             </w:r>
           </w:p>
         </w:tc>
@@ -7936,7 +7922,7 @@
                 <w:sz w:val="20"/>
                 <w:szCs w:val="20"/>
               </w:rPr>
-              <w:t xml:space="preserve">0.045</w:t>
+              <w:t>0.045</w:t>
             </w:r>
           </w:p>
         </w:tc>

</xml_diff>